<commit_message>
docs: cleanup + reflect real deployment
清理冗余:
- 删 demo.md / AGENTS.md (内容已整合进 CLAUDE.md 与 delivery-docs)
- 删 22 张测试截图 / .playwright-mcp/ / screenshots/(已加入 .gitignore)

CLAUDE.md 重写:
- 项目当前是已上线 SaaS,不再是 demo 阶段
- 新增「永不入 Git 清单」(.env / web/certs / R2 凭证 / *.sql.gz 等)
- 实际部署经验教训记录(7 个踩坑 + 修复)

delivery-docs 4 份 .docx 更新:
- 01 架构: 演进路线全部 ✅ + 实际部署关键参数表 + Uptime Kuma 容器
- 02 API: Storage 路由标记已上线(原 "阶段② 待启用") + 补 confirm/signed-get-url
- 03 部署: SSH 端口 36724 而非 2222 + Cloudflare Origin Cert 替代 Let's Encrypt
        + 密码生成用 openssl rand -hex 避免 URL 解析失败
- 04 运维: crontab → systemd timer + Uptime Kuma 监控章节扩写

Co-Authored-By: Claude Opus 4.7 <noreply@anthropic.com>
</commit_message>
<xml_diff>
--- a/delivery-docs/01_系统架构与网络拓扑设计说明书.docx
+++ b/delivery-docs/01_系统架构与网络拓扑设计说明书.docx
@@ -1957,7 +1957,7 @@
               <w:rPr>
                 <w:rStyle w:val="VerbatimChar"/>
               </w:rPr>
-              <w:t xml:space="preserve">mesa-web:latest</w:t>
+              <w:t xml:space="preserve">ghcr.io/insovo/mesa-web:latest</w:t>
             </w:r>
           </w:p>
         </w:tc>
@@ -1973,14 +1973,193 @@
                 <w:b/>
                 <w:bCs/>
               </w:rPr>
-              <w:t xml:space="preserve">仅暴露</w:t>
+              <w:t xml:space="preserve">暴露</w:t>
             </w:r>
             <w:r>
               <w:rPr>
                 <w:b/>
                 <w:bCs/>
               </w:rPr>
-              <w:t xml:space="preserve"> 80 </w:t>
+              <w:t xml:space="preserve"> 80/443</w:t>
+            </w:r>
+            <w:r>
+              <w:t xml:space="preserve">(80 </w:t>
+            </w:r>
+            <w:r>
+              <w:rPr>
+                <w:rFonts w:hint="eastAsia"/>
+              </w:rPr>
+              <w:t xml:space="preserve">跳</w:t>
+            </w:r>
+            <w:r>
+              <w:t xml:space="preserve"> 443, 443 </w:t>
+            </w:r>
+            <w:r>
+              <w:rPr>
+                <w:rFonts w:hint="eastAsia"/>
+              </w:rPr>
+              <w:t xml:space="preserve">终止</w:t>
+            </w:r>
+            <w:r>
+              <w:t xml:space="preserve"> TLS)</w:t>
+            </w:r>
+          </w:p>
+        </w:tc>
+        <w:tc>
+          <w:tcPr/>
+          <w:p>
+            <w:pPr>
+              <w:pStyle w:val="Compact"/>
+            </w:pPr>
+            <w:r>
+              <w:t xml:space="preserve">TLS </w:t>
+            </w:r>
+            <w:r>
+              <w:rPr>
+                <w:rFonts w:hint="eastAsia"/>
+              </w:rPr>
+              <w:t xml:space="preserve">证书</w:t>
+            </w:r>
+            <w:r>
+              <w:t xml:space="preserve"> bind mount</w:t>
+            </w:r>
+            <w:r>
+              <w:t xml:space="preserve"> </w:t>
+            </w:r>
+            <w:r>
+              <w:rPr>
+                <w:rStyle w:val="VerbatimChar"/>
+              </w:rPr>
+              <w:t xml:space="preserve">web/certs/</w:t>
+            </w:r>
+          </w:p>
+        </w:tc>
+      </w:tr>
+      <w:tr>
+        <w:tc>
+          <w:tcPr/>
+          <w:p>
+            <w:pPr>
+              <w:pStyle w:val="Compact"/>
+            </w:pPr>
+            <w:r>
+              <w:rPr>
+                <w:rStyle w:val="VerbatimChar"/>
+              </w:rPr>
+              <w:t xml:space="preserve">backend</w:t>
+            </w:r>
+          </w:p>
+        </w:tc>
+        <w:tc>
+          <w:tcPr/>
+          <w:p>
+            <w:pPr>
+              <w:pStyle w:val="Compact"/>
+            </w:pPr>
+            <w:r>
+              <w:rPr>
+                <w:rStyle w:val="VerbatimChar"/>
+              </w:rPr>
+              <w:t xml:space="preserve">ghcr.io/insovo/mesa-server:latest</w:t>
+            </w:r>
+          </w:p>
+        </w:tc>
+        <w:tc>
+          <w:tcPr/>
+          <w:p>
+            <w:pPr>
+              <w:pStyle w:val="Compact"/>
+            </w:pPr>
+            <w:r>
+              <w:rPr>
+                <w:rFonts w:hint="eastAsia"/>
+              </w:rPr>
+              <w:t xml:space="preserve">仅</w:t>
+            </w:r>
+            <w:r>
+              <w:t xml:space="preserve"> </w:t>
+            </w:r>
+            <w:r>
+              <w:rPr>
+                <w:rStyle w:val="VerbatimChar"/>
+              </w:rPr>
+              <w:t xml:space="preserve">expose: 3001</w:t>
+            </w:r>
+            <w:r>
+              <w:rPr>
+                <w:rFonts w:hint="eastAsia"/>
+              </w:rPr>
+              <w:t xml:space="preserve">(不映射宿主)</w:t>
+            </w:r>
+          </w:p>
+        </w:tc>
+        <w:tc>
+          <w:tcPr/>
+          <w:p>
+            <w:pPr>
+              <w:pStyle w:val="Compact"/>
+            </w:pPr>
+            <w:r>
+              <w:rPr>
+                <w:rFonts w:hint="eastAsia"/>
+              </w:rPr>
+              <w:t xml:space="preserve">无(无状态)</w:t>
+            </w:r>
+          </w:p>
+        </w:tc>
+      </w:tr>
+      <w:tr>
+        <w:tc>
+          <w:tcPr/>
+          <w:p>
+            <w:pPr>
+              <w:pStyle w:val="Compact"/>
+            </w:pPr>
+            <w:r>
+              <w:rPr>
+                <w:rStyle w:val="VerbatimChar"/>
+              </w:rPr>
+              <w:t xml:space="preserve">postgres</w:t>
+            </w:r>
+          </w:p>
+        </w:tc>
+        <w:tc>
+          <w:tcPr/>
+          <w:p>
+            <w:pPr>
+              <w:pStyle w:val="Compact"/>
+            </w:pPr>
+            <w:r>
+              <w:rPr>
+                <w:rStyle w:val="VerbatimChar"/>
+              </w:rPr>
+              <w:t xml:space="preserve">postgres:16-alpine</w:t>
+            </w:r>
+          </w:p>
+        </w:tc>
+        <w:tc>
+          <w:tcPr/>
+          <w:p>
+            <w:pPr>
+              <w:pStyle w:val="Compact"/>
+            </w:pPr>
+            <w:r>
+              <w:rPr>
+                <w:rFonts w:hint="eastAsia"/>
+              </w:rPr>
+              <w:t xml:space="preserve">仅</w:t>
+            </w:r>
+            <w:r>
+              <w:t xml:space="preserve"> </w:t>
+            </w:r>
+            <w:r>
+              <w:rPr>
+                <w:rStyle w:val="VerbatimChar"/>
+              </w:rPr>
+              <w:t xml:space="preserve">expose: 5432</w:t>
+            </w:r>
+            <w:r>
+              <w:t xml:space="preserve">(</w:t>
             </w:r>
             <w:r>
               <w:rPr>
@@ -1988,21 +2167,24 @@
                 <w:b/>
                 <w:bCs/>
               </w:rPr>
-              <w:t xml:space="preserve">到宿主机</w:t>
-            </w:r>
-          </w:p>
-        </w:tc>
-        <w:tc>
-          <w:tcPr/>
-          <w:p>
-            <w:pPr>
-              <w:pStyle w:val="Compact"/>
-            </w:pPr>
-            <w:r>
-              <w:rPr>
-                <w:rFonts w:hint="eastAsia"/>
-              </w:rPr>
-              <w:t xml:space="preserve">无(静态资源在镜像里)</w:t>
+              <w:t xml:space="preserve">严禁映射宿主</w:t>
+            </w:r>
+            <w:r>
+              <w:t xml:space="preserve">)</w:t>
+            </w:r>
+          </w:p>
+        </w:tc>
+        <w:tc>
+          <w:tcPr/>
+          <w:p>
+            <w:pPr>
+              <w:pStyle w:val="Compact"/>
+            </w:pPr>
+            <w:r>
+              <w:rPr>
+                <w:rStyle w:val="VerbatimChar"/>
+              </w:rPr>
+              <w:t xml:space="preserve">mesa_pg_prod_data</w:t>
             </w:r>
           </w:p>
         </w:tc>
@@ -2018,7 +2200,7 @@
               <w:rPr>
                 <w:rStyle w:val="VerbatimChar"/>
               </w:rPr>
-              <w:t xml:space="preserve">backend</w:t>
+              <w:t xml:space="preserve">redis</w:t>
             </w:r>
           </w:p>
         </w:tc>
@@ -2032,7 +2214,7 @@
               <w:rPr>
                 <w:rStyle w:val="VerbatimChar"/>
               </w:rPr>
-              <w:t xml:space="preserve">mesa-server:latest</w:t>
+              <w:t xml:space="preserve">redis:7-alpine</w:t>
             </w:r>
           </w:p>
         </w:tc>
@@ -2055,27 +2237,35 @@
               <w:rPr>
                 <w:rStyle w:val="VerbatimChar"/>
               </w:rPr>
-              <w:t xml:space="preserve">expose: 3001</w:t>
-            </w:r>
-            <w:r>
-              <w:rPr>
-                <w:rFonts w:hint="eastAsia"/>
-              </w:rPr>
-              <w:t xml:space="preserve">(不映射宿主)</w:t>
-            </w:r>
-          </w:p>
-        </w:tc>
-        <w:tc>
-          <w:tcPr/>
-          <w:p>
-            <w:pPr>
-              <w:pStyle w:val="Compact"/>
-            </w:pPr>
-            <w:r>
-              <w:rPr>
-                <w:rFonts w:hint="eastAsia"/>
-              </w:rPr>
-              <w:t xml:space="preserve">无(无状态)</w:t>
+              <w:t xml:space="preserve">expose: 6379</w:t>
+            </w:r>
+            <w:r>
+              <w:t xml:space="preserve">(</w:t>
+            </w:r>
+            <w:r>
+              <w:rPr>
+                <w:rFonts w:hint="eastAsia"/>
+                <w:b/>
+                <w:bCs/>
+              </w:rPr>
+              <w:t xml:space="preserve">严禁映射宿主</w:t>
+            </w:r>
+            <w:r>
+              <w:t xml:space="preserve">)</w:t>
+            </w:r>
+          </w:p>
+        </w:tc>
+        <w:tc>
+          <w:tcPr/>
+          <w:p>
+            <w:pPr>
+              <w:pStyle w:val="Compact"/>
+            </w:pPr>
+            <w:r>
+              <w:rPr>
+                <w:rStyle w:val="VerbatimChar"/>
+              </w:rPr>
+              <w:t xml:space="preserve">mesa_redis_prod_data</w:t>
             </w:r>
           </w:p>
         </w:tc>
@@ -2091,7 +2281,7 @@
               <w:rPr>
                 <w:rStyle w:val="VerbatimChar"/>
               </w:rPr>
-              <w:t xml:space="preserve">postgres</w:t>
+              <w:t xml:space="preserve">uptime-kuma</w:t>
             </w:r>
           </w:p>
         </w:tc>
@@ -2105,7 +2295,7 @@
               <w:rPr>
                 <w:rStyle w:val="VerbatimChar"/>
               </w:rPr>
-              <w:t xml:space="preserve">postgres:16-alpine</w:t>
+              <w:t xml:space="preserve">louislam/uptime-kuma:1</w:t>
             </w:r>
           </w:p>
         </w:tc>
@@ -2128,40 +2318,37 @@
               <w:rPr>
                 <w:rStyle w:val="VerbatimChar"/>
               </w:rPr>
-              <w:t xml:space="preserve">expose: 5432</w:t>
-            </w:r>
-            <w:r>
-              <w:t xml:space="preserve">(</w:t>
-            </w:r>
-            <w:r>
-              <w:rPr>
-                <w:rFonts w:hint="eastAsia"/>
-                <w:b/>
-                <w:bCs/>
-              </w:rPr>
-              <w:t xml:space="preserve">严禁映射宿主</w:t>
-            </w:r>
-            <w:r>
-              <w:t xml:space="preserve">)</w:t>
-            </w:r>
-          </w:p>
-        </w:tc>
-        <w:tc>
-          <w:tcPr/>
-          <w:p>
-            <w:pPr>
-              <w:pStyle w:val="Compact"/>
-            </w:pPr>
+              <w:t xml:space="preserve">expose: 3001</w:t>
+            </w:r>
+            <w:r>
+              <w:rPr>
+                <w:rFonts w:hint="eastAsia"/>
+              </w:rPr>
+              <w:t xml:space="preserve">(通过</w:t>
+            </w:r>
+            <w:r>
+              <w:t xml:space="preserve"> nginx</w:t>
+            </w:r>
+            <w:r>
+              <w:t xml:space="preserve"> </w:t>
+            </w:r>
             <w:r>
               <w:rPr>
                 <w:rStyle w:val="VerbatimChar"/>
               </w:rPr>
-              <w:t xml:space="preserve">mesa_pg_prod_data</w:t>
-            </w:r>
-          </w:p>
-        </w:tc>
-      </w:tr>
-      <w:tr>
+              <w:t xml:space="preserve">monitor.insovo.top</w:t>
+            </w:r>
+            <w:r>
+              <w:t xml:space="preserve"> </w:t>
+            </w:r>
+            <w:r>
+              <w:rPr>
+                <w:rFonts w:hint="eastAsia"/>
+              </w:rPr>
+              <w:t xml:space="preserve">反代)</w:t>
+            </w:r>
+          </w:p>
+        </w:tc>
         <w:tc>
           <w:tcPr/>
           <w:p>
@@ -2172,72 +2359,7 @@
               <w:rPr>
                 <w:rStyle w:val="VerbatimChar"/>
               </w:rPr>
-              <w:t xml:space="preserve">redis</w:t>
-            </w:r>
-          </w:p>
-        </w:tc>
-        <w:tc>
-          <w:tcPr/>
-          <w:p>
-            <w:pPr>
-              <w:pStyle w:val="Compact"/>
-            </w:pPr>
-            <w:r>
-              <w:rPr>
-                <w:rStyle w:val="VerbatimChar"/>
-              </w:rPr>
-              <w:t xml:space="preserve">redis:7-alpine</w:t>
-            </w:r>
-          </w:p>
-        </w:tc>
-        <w:tc>
-          <w:tcPr/>
-          <w:p>
-            <w:pPr>
-              <w:pStyle w:val="Compact"/>
-            </w:pPr>
-            <w:r>
-              <w:rPr>
-                <w:rFonts w:hint="eastAsia"/>
-              </w:rPr>
-              <w:t xml:space="preserve">仅</w:t>
-            </w:r>
-            <w:r>
-              <w:t xml:space="preserve"> </w:t>
-            </w:r>
-            <w:r>
-              <w:rPr>
-                <w:rStyle w:val="VerbatimChar"/>
-              </w:rPr>
-              <w:t xml:space="preserve">expose: 6379</w:t>
-            </w:r>
-            <w:r>
-              <w:t xml:space="preserve">(</w:t>
-            </w:r>
-            <w:r>
-              <w:rPr>
-                <w:rFonts w:hint="eastAsia"/>
-                <w:b/>
-                <w:bCs/>
-              </w:rPr>
-              <w:t xml:space="preserve">严禁映射宿主</w:t>
-            </w:r>
-            <w:r>
-              <w:t xml:space="preserve">)</w:t>
-            </w:r>
-          </w:p>
-        </w:tc>
-        <w:tc>
-          <w:tcPr/>
-          <w:p>
-            <w:pPr>
-              <w:pStyle w:val="Compact"/>
-            </w:pPr>
-            <w:r>
-              <w:rPr>
-                <w:rStyle w:val="VerbatimChar"/>
-              </w:rPr>
-              <w:t xml:space="preserve">mesa_redis_prod_data</w:t>
+              <w:t xml:space="preserve">mesa_uptime_data</w:t>
             </w:r>
           </w:p>
         </w:tc>
@@ -3988,7 +4110,7 @@
       </w:r>
     </w:p>
     <w:bookmarkEnd w:id="20"/>
-    <w:bookmarkStart w:id="21" w:name="演进路线"/>
+    <w:bookmarkStart w:id="21" w:name="演进路线实际落地状态"/>
     <w:p>
       <w:pPr>
         <w:pStyle w:val="Heading1"/>
@@ -4000,7 +4122,7 @@
         <w:rPr>
           <w:rFonts w:hint="eastAsia"/>
         </w:rPr>
-        <w:t xml:space="preserve">演进路线</w:t>
+        <w:t xml:space="preserve">演进路线(实际落地状态)</w:t>
       </w:r>
     </w:p>
     <w:tbl>
@@ -4093,18 +4215,33 @@
               <w:rPr>
                 <w:rFonts w:hint="eastAsia"/>
               </w:rPr>
-              <w:t xml:space="preserve">已完成</w:t>
-            </w:r>
-          </w:p>
-        </w:tc>
-        <w:tc>
-          <w:tcPr/>
-          <w:p>
-            <w:pPr>
-              <w:pStyle w:val="Compact"/>
-            </w:pPr>
-            <w:r>
-              <w:t xml:space="preserve">server + web + dev compose</w:t>
+              <w:t xml:space="preserve">已上线</w:t>
+            </w:r>
+          </w:p>
+        </w:tc>
+        <w:tc>
+          <w:tcPr/>
+          <w:p>
+            <w:pPr>
+              <w:pStyle w:val="Compact"/>
+            </w:pPr>
+            <w:r>
+              <w:t xml:space="preserve">server + web + dev </w:t>
+            </w:r>
+            <w:r>
+              <w:rPr>
+                <w:rFonts w:hint="eastAsia"/>
+              </w:rPr>
+              <w:t xml:space="preserve">compose,本地</w:t>
+            </w:r>
+            <w:r>
+              <w:t xml:space="preserve"> vite + node </w:t>
+            </w:r>
+            <w:r>
+              <w:rPr>
+                <w:rFonts w:hint="eastAsia"/>
+              </w:rPr>
+              <w:t xml:space="preserve">联调</w:t>
             </w:r>
           </w:p>
         </w:tc>
@@ -4134,13 +4271,13 @@
               <w:pStyle w:val="Compact"/>
             </w:pPr>
             <w:r>
-              <w:t xml:space="preserve">🔜 </w:t>
-            </w:r>
-            <w:r>
-              <w:rPr>
-                <w:rFonts w:hint="eastAsia"/>
-              </w:rPr>
-              <w:t xml:space="preserve">代码就绪,等凭证</w:t>
+              <w:t xml:space="preserve">✅ </w:t>
+            </w:r>
+            <w:r>
+              <w:rPr>
+                <w:rFonts w:hint="eastAsia"/>
+              </w:rPr>
+              <w:t xml:space="preserve">已上线</w:t>
             </w:r>
           </w:p>
         </w:tc>
@@ -4154,16 +4291,31 @@
               <w:rPr>
                 <w:rStyle w:val="VerbatimChar"/>
               </w:rPr>
-              <w:t xml:space="preserve">/api/storage/presigned-url</w:t>
+              <w:t xml:space="preserve">mesa-resumes</w:t>
+            </w:r>
+            <w:r>
+              <w:rPr>
+                <w:rFonts w:hint="eastAsia"/>
+              </w:rPr>
+              <w:t xml:space="preserve">(业务)</w:t>
+            </w:r>
+            <w:r>
+              <w:t xml:space="preserve"> +</w:t>
             </w:r>
             <w:r>
               <w:t xml:space="preserve"> </w:t>
             </w:r>
             <w:r>
               <w:rPr>
-                <w:rFonts w:hint="eastAsia"/>
-              </w:rPr>
-              <w:t xml:space="preserve">接口预留</w:t>
+                <w:rStyle w:val="VerbatimChar"/>
+              </w:rPr>
+              <w:t xml:space="preserve">mesa-backups</w:t>
+            </w:r>
+            <w:r>
+              <w:rPr>
+                <w:rFonts w:hint="eastAsia"/>
+              </w:rPr>
+              <w:t xml:space="preserve">(备份)双桶,凭证最小权限隔离</w:t>
             </w:r>
           </w:p>
         </w:tc>
@@ -4193,21 +4345,45 @@
               <w:rPr>
                 <w:rFonts w:hint="eastAsia"/>
               </w:rPr>
-              <w:t xml:space="preserve">已完成</w:t>
-            </w:r>
-          </w:p>
-        </w:tc>
-        <w:tc>
-          <w:tcPr/>
-          <w:p>
-            <w:pPr>
-              <w:pStyle w:val="Compact"/>
-            </w:pPr>
-            <w:r>
-              <w:rPr>
-                <w:rFonts w:hint="eastAsia"/>
-              </w:rPr>
-              <w:t xml:space="preserve">本文件覆盖范围</w:t>
+              <w:t xml:space="preserve">已上线</w:t>
+            </w:r>
+          </w:p>
+        </w:tc>
+        <w:tc>
+          <w:tcPr/>
+          <w:p>
+            <w:pPr>
+              <w:pStyle w:val="Compact"/>
+            </w:pPr>
+            <w:r>
+              <w:t xml:space="preserve">5 </w:t>
+            </w:r>
+            <w:r>
+              <w:rPr>
+                <w:rFonts w:hint="eastAsia"/>
+              </w:rPr>
+              <w:t xml:space="preserve">容器(含</w:t>
+            </w:r>
+            <w:r>
+              <w:t xml:space="preserve"> Uptime Kuma </w:t>
+            </w:r>
+            <w:r>
+              <w:rPr>
+                <w:rFonts w:hint="eastAsia"/>
+              </w:rPr>
+              <w:t xml:space="preserve">监控),Cloudflare</w:t>
+            </w:r>
+            <w:r>
+              <w:t xml:space="preserve"> Origin Cert </w:t>
+            </w:r>
+            <w:r>
+              <w:rPr>
+                <w:rFonts w:hint="eastAsia"/>
+              </w:rPr>
+              <w:t xml:space="preserve">端到端</w:t>
+            </w:r>
+            <w:r>
+              <w:t xml:space="preserve"> HTTPS</w:t>
             </w:r>
           </w:p>
         </w:tc>
@@ -4237,30 +4413,39 @@
               <w:pStyle w:val="Compact"/>
             </w:pPr>
             <w:r>
-              <w:t xml:space="preserve">📋 runbook </w:t>
-            </w:r>
-            <w:r>
-              <w:rPr>
-                <w:rFonts w:hint="eastAsia"/>
-              </w:rPr>
-              <w:t xml:space="preserve">就绪</w:t>
-            </w:r>
-          </w:p>
-        </w:tc>
-        <w:tc>
-          <w:tcPr/>
-          <w:p>
-            <w:pPr>
-              <w:pStyle w:val="Compact"/>
-            </w:pPr>
-            <w:r>
-              <w:rPr>
-                <w:rFonts w:hint="eastAsia"/>
-              </w:rPr>
-              <w:t xml:space="preserve">见交付文档</w:t>
-            </w:r>
-            <w:r>
-              <w:t xml:space="preserve"> 03</w:t>
+              <w:t xml:space="preserve">✅ </w:t>
+            </w:r>
+            <w:r>
+              <w:rPr>
+                <w:rFonts w:hint="eastAsia"/>
+              </w:rPr>
+              <w:t xml:space="preserve">已上线</w:t>
+            </w:r>
+          </w:p>
+        </w:tc>
+        <w:tc>
+          <w:tcPr/>
+          <w:p>
+            <w:pPr>
+              <w:pStyle w:val="Compact"/>
+            </w:pPr>
+            <w:r>
+              <w:t xml:space="preserve">UFW 36724/80/443、SSH </w:t>
+            </w:r>
+            <w:r>
+              <w:rPr>
+                <w:rFonts w:hint="eastAsia"/>
+              </w:rPr>
+              <w:t xml:space="preserve">禁</w:t>
+            </w:r>
+            <w:r>
+              <w:t xml:space="preserve"> root + </w:t>
+            </w:r>
+            <w:r>
+              <w:rPr>
+                <w:rFonts w:hint="eastAsia"/>
+              </w:rPr>
+              <w:t xml:space="preserve">禁密码、fail2ban、unattended-upgrades</w:t>
             </w:r>
           </w:p>
         </w:tc>
@@ -4290,30 +4475,51 @@
               <w:pStyle w:val="Compact"/>
             </w:pPr>
             <w:r>
-              <w:t xml:space="preserve">✅ workflow + </w:t>
-            </w:r>
-            <w:r>
-              <w:rPr>
-                <w:rFonts w:hint="eastAsia"/>
-              </w:rPr>
-              <w:t xml:space="preserve">脚本就绪</w:t>
-            </w:r>
-          </w:p>
-        </w:tc>
-        <w:tc>
-          <w:tcPr/>
-          <w:p>
-            <w:pPr>
-              <w:pStyle w:val="Compact"/>
-            </w:pPr>
-            <w:r>
-              <w:rPr>
-                <w:rFonts w:hint="eastAsia"/>
-              </w:rPr>
-              <w:t xml:space="preserve">见</w:t>
-            </w:r>
-            <w:r>
-              <w:t xml:space="preserve"> .github/workflows/ + ops/</w:t>
+              <w:t xml:space="preserve">✅ </w:t>
+            </w:r>
+            <w:r>
+              <w:rPr>
+                <w:rFonts w:hint="eastAsia"/>
+              </w:rPr>
+              <w:t xml:space="preserve">已上线</w:t>
+            </w:r>
+          </w:p>
+        </w:tc>
+        <w:tc>
+          <w:tcPr/>
+          <w:p>
+            <w:pPr>
+              <w:pStyle w:val="Compact"/>
+            </w:pPr>
+            <w:r>
+              <w:t xml:space="preserve">GitHub Actions + GHCR + SSH </w:t>
+            </w:r>
+            <w:r>
+              <w:rPr>
+                <w:rFonts w:hint="eastAsia"/>
+              </w:rPr>
+              <w:t xml:space="preserve">部署;systemd</w:t>
+            </w:r>
+            <w:r>
+              <w:t xml:space="preserve"> timer </w:t>
+            </w:r>
+            <w:r>
+              <w:rPr>
+                <w:rFonts w:hint="eastAsia"/>
+              </w:rPr>
+              <w:t xml:space="preserve">每日</w:t>
+            </w:r>
+            <w:r>
+              <w:t xml:space="preserve"> 03:00 UTC </w:t>
+            </w:r>
+            <w:r>
+              <w:rPr>
+                <w:rFonts w:hint="eastAsia"/>
+              </w:rPr>
+              <w:t xml:space="preserve">自动备份</w:t>
+            </w:r>
+            <w:r>
+              <w:t xml:space="preserve"> R2</w:t>
             </w:r>
           </w:p>
         </w:tc>
@@ -4349,30 +4555,515 @@
               <w:rPr>
                 <w:rFonts w:hint="eastAsia"/>
               </w:rPr>
-              <w:t xml:space="preserve">即本套</w:t>
-            </w:r>
-            <w:r>
-              <w:t xml:space="preserve"> .docx 4 </w:t>
-            </w:r>
-            <w:r>
-              <w:rPr>
-                <w:rFonts w:hint="eastAsia"/>
-              </w:rPr>
-              <w:t xml:space="preserve">件套</w:t>
-            </w:r>
-          </w:p>
-        </w:tc>
-        <w:tc>
-          <w:tcPr/>
-          <w:p>
-            <w:pPr>
-              <w:pStyle w:val="Compact"/>
-            </w:pPr>
+              <w:t xml:space="preserve">已交付</w:t>
+            </w:r>
+          </w:p>
+        </w:tc>
+        <w:tc>
+          <w:tcPr/>
+          <w:p>
+            <w:pPr>
+              <w:pStyle w:val="Compact"/>
+            </w:pPr>
+            <w:r>
+              <w:rPr>
+                <w:rFonts w:hint="eastAsia"/>
+              </w:rPr>
+              <w:t xml:space="preserve">本套</w:t>
+            </w:r>
+            <w:r>
+              <w:t xml:space="preserve"> 4 </w:t>
+            </w:r>
+            <w:r>
+              <w:rPr>
+                <w:rFonts w:hint="eastAsia"/>
+              </w:rPr>
+              <w:t xml:space="preserve">份</w:t>
+            </w:r>
+            <w:r>
+              <w:t xml:space="preserve"> .docx + ops/runbook + README + CLAUDE.md</w:t>
+            </w:r>
           </w:p>
         </w:tc>
       </w:tr>
     </w:tbl>
     <w:bookmarkEnd w:id="21"/>
+    <w:bookmarkStart w:id="22" w:name="实际部署关键参数已生效"/>
+    <w:p>
+      <w:pPr>
+        <w:pStyle w:val="Heading1"/>
+      </w:pPr>
+      <w:r>
+        <w:t xml:space="preserve">11. </w:t>
+      </w:r>
+      <w:r>
+        <w:rPr>
+          <w:rFonts w:hint="eastAsia"/>
+        </w:rPr>
+        <w:t xml:space="preserve">实际部署关键参数(已生效)</w:t>
+      </w:r>
+    </w:p>
+    <w:tbl>
+      <w:tblPr>
+        <w:tblStyle w:val="Table"/>
+        <w:tblW w:type="pct" w:w="5000"/>
+        <w:tblLayout w:type="fixed"/>
+        <w:tblLook w:firstRow="1" w:lastRow="0" w:firstColumn="0" w:lastColumn="0" w:noHBand="0" w:noVBand="0" w:val="0020"/>
+      </w:tblPr>
+      <w:tblGrid>
+        <w:gridCol w:w="4752"/>
+        <w:gridCol w:w="3168"/>
+      </w:tblGrid>
+      <w:tr>
+        <w:trPr>
+          <w:tblHeader w:val="on"/>
+        </w:trPr>
+        <w:tc>
+          <w:tcPr/>
+          <w:p>
+            <w:pPr>
+              <w:pStyle w:val="Compact"/>
+            </w:pPr>
+            <w:r>
+              <w:rPr>
+                <w:rFonts w:hint="eastAsia"/>
+              </w:rPr>
+              <w:t xml:space="preserve">参数</w:t>
+            </w:r>
+          </w:p>
+        </w:tc>
+        <w:tc>
+          <w:tcPr/>
+          <w:p>
+            <w:pPr>
+              <w:pStyle w:val="Compact"/>
+            </w:pPr>
+            <w:r>
+              <w:rPr>
+                <w:rFonts w:hint="eastAsia"/>
+              </w:rPr>
+              <w:t xml:space="preserve">值</w:t>
+            </w:r>
+          </w:p>
+        </w:tc>
+      </w:tr>
+      <w:tr>
+        <w:tc>
+          <w:tcPr/>
+          <w:p>
+            <w:pPr>
+              <w:pStyle w:val="Compact"/>
+            </w:pPr>
+            <w:r>
+              <w:rPr>
+                <w:rFonts w:hint="eastAsia"/>
+              </w:rPr>
+              <w:t xml:space="preserve">主域名</w:t>
+            </w:r>
+          </w:p>
+        </w:tc>
+        <w:tc>
+          <w:tcPr/>
+          <w:p>
+            <w:pPr>
+              <w:pStyle w:val="Compact"/>
+            </w:pPr>
+            <w:r>
+              <w:t xml:space="preserve">https://insovo.top</w:t>
+            </w:r>
+          </w:p>
+        </w:tc>
+      </w:tr>
+      <w:tr>
+        <w:tc>
+          <w:tcPr/>
+          <w:p>
+            <w:pPr>
+              <w:pStyle w:val="Compact"/>
+            </w:pPr>
+            <w:r>
+              <w:rPr>
+                <w:rFonts w:hint="eastAsia"/>
+              </w:rPr>
+              <w:t xml:space="preserve">监控面板</w:t>
+            </w:r>
+          </w:p>
+        </w:tc>
+        <w:tc>
+          <w:tcPr/>
+          <w:p>
+            <w:pPr>
+              <w:pStyle w:val="Compact"/>
+            </w:pPr>
+            <w:r>
+              <w:t xml:space="preserve">https://monitor.insovo.top</w:t>
+            </w:r>
+          </w:p>
+        </w:tc>
+      </w:tr>
+      <w:tr>
+        <w:tc>
+          <w:tcPr/>
+          <w:p>
+            <w:pPr>
+              <w:pStyle w:val="Compact"/>
+            </w:pPr>
+            <w:r>
+              <w:t xml:space="preserve">VPS</w:t>
+            </w:r>
+          </w:p>
+        </w:tc>
+        <w:tc>
+          <w:tcPr/>
+          <w:p>
+            <w:pPr>
+              <w:pStyle w:val="Compact"/>
+            </w:pPr>
+            <w:r>
+              <w:t xml:space="preserve">114.134.188.7 · Ubuntu 22.04 LTS · 4C8G</w:t>
+            </w:r>
+          </w:p>
+        </w:tc>
+      </w:tr>
+      <w:tr>
+        <w:tc>
+          <w:tcPr/>
+          <w:p>
+            <w:pPr>
+              <w:pStyle w:val="Compact"/>
+            </w:pPr>
+            <w:r>
+              <w:t xml:space="preserve">SSH </w:t>
+            </w:r>
+            <w:r>
+              <w:rPr>
+                <w:rFonts w:hint="eastAsia"/>
+              </w:rPr>
+              <w:t xml:space="preserve">端口</w:t>
+            </w:r>
+          </w:p>
+        </w:tc>
+        <w:tc>
+          <w:tcPr/>
+          <w:p>
+            <w:pPr>
+              <w:pStyle w:val="Compact"/>
+            </w:pPr>
+            <w:r>
+              <w:rPr>
+                <w:b/>
+                <w:bCs/>
+              </w:rPr>
+              <w:t xml:space="preserve">36724</w:t>
+            </w:r>
+            <w:r>
+              <w:t xml:space="preserve">(VPS </w:t>
+            </w:r>
+            <w:r>
+              <w:rPr>
+                <w:rFonts w:hint="eastAsia"/>
+              </w:rPr>
+              <w:t xml:space="preserve">厂商出厂默认,非</w:t>
+            </w:r>
+            <w:r>
+              <w:t xml:space="preserve"> 22)</w:t>
+            </w:r>
+          </w:p>
+        </w:tc>
+      </w:tr>
+      <w:tr>
+        <w:tc>
+          <w:tcPr/>
+          <w:p>
+            <w:pPr>
+              <w:pStyle w:val="Compact"/>
+            </w:pPr>
+            <w:r>
+              <w:rPr>
+                <w:rFonts w:hint="eastAsia"/>
+              </w:rPr>
+              <w:t xml:space="preserve">部署用户</w:t>
+            </w:r>
+          </w:p>
+        </w:tc>
+        <w:tc>
+          <w:tcPr/>
+          <w:p>
+            <w:pPr>
+              <w:pStyle w:val="Compact"/>
+            </w:pPr>
+            <w:r>
+              <w:rPr>
+                <w:rStyle w:val="VerbatimChar"/>
+              </w:rPr>
+              <w:t xml:space="preserve">deploy</w:t>
+            </w:r>
+            <w:r>
+              <w:t xml:space="preserve">(</w:t>
+            </w:r>
+            <w:r>
+              <w:rPr>
+                <w:rStyle w:val="VerbatimChar"/>
+              </w:rPr>
+              <w:t xml:space="preserve">/etc/sudoers.d/90-deploy</w:t>
+            </w:r>
+            <w:r>
+              <w:t xml:space="preserve"> </w:t>
+            </w:r>
+            <w:r>
+              <w:rPr>
+                <w:rFonts w:hint="eastAsia"/>
+              </w:rPr>
+              <w:t xml:space="preserve">免密</w:t>
+            </w:r>
+            <w:r>
+              <w:t xml:space="preserve"> sudo)</w:t>
+            </w:r>
+          </w:p>
+        </w:tc>
+      </w:tr>
+      <w:tr>
+        <w:tc>
+          <w:tcPr/>
+          <w:p>
+            <w:pPr>
+              <w:pStyle w:val="Compact"/>
+            </w:pPr>
+            <w:r>
+              <w:rPr>
+                <w:rFonts w:hint="eastAsia"/>
+              </w:rPr>
+              <w:t xml:space="preserve">容器编排</w:t>
+            </w:r>
+          </w:p>
+        </w:tc>
+        <w:tc>
+          <w:tcPr/>
+          <w:p>
+            <w:pPr>
+              <w:pStyle w:val="Compact"/>
+            </w:pPr>
+            <w:r>
+              <w:t xml:space="preserve">docker compose v2(5 </w:t>
+            </w:r>
+            <w:r>
+              <w:rPr>
+                <w:rFonts w:hint="eastAsia"/>
+              </w:rPr>
+              <w:t xml:space="preserve">服务)</w:t>
+            </w:r>
+            <w:r>
+              <w:t xml:space="preserve"> · </w:t>
+            </w:r>
+            <w:r>
+              <w:rPr>
+                <w:rFonts w:hint="eastAsia"/>
+              </w:rPr>
+              <w:t xml:space="preserve">卷</w:t>
+            </w:r>
+            <w:r>
+              <w:t xml:space="preserve"> </w:t>
+            </w:r>
+            <w:r>
+              <w:rPr>
+                <w:rStyle w:val="VerbatimChar"/>
+              </w:rPr>
+              <w:t xml:space="preserve">mesa_pg_prod_data</w:t>
+            </w:r>
+            <w:r>
+              <w:t xml:space="preserve"> </w:t>
+            </w:r>
+            <w:r>
+              <w:t xml:space="preserve">+</w:t>
+            </w:r>
+            <w:r>
+              <w:t xml:space="preserve"> </w:t>
+            </w:r>
+            <w:r>
+              <w:rPr>
+                <w:rStyle w:val="VerbatimChar"/>
+              </w:rPr>
+              <w:t xml:space="preserve">mesa_redis_prod_data</w:t>
+            </w:r>
+            <w:r>
+              <w:t xml:space="preserve"> </w:t>
+            </w:r>
+            <w:r>
+              <w:t xml:space="preserve">+</w:t>
+            </w:r>
+            <w:r>
+              <w:t xml:space="preserve"> </w:t>
+            </w:r>
+            <w:r>
+              <w:rPr>
+                <w:rStyle w:val="VerbatimChar"/>
+              </w:rPr>
+              <w:t xml:space="preserve">mesa_uptime_data</w:t>
+            </w:r>
+          </w:p>
+        </w:tc>
+      </w:tr>
+      <w:tr>
+        <w:tc>
+          <w:tcPr/>
+          <w:p>
+            <w:pPr>
+              <w:pStyle w:val="Compact"/>
+            </w:pPr>
+            <w:r>
+              <w:t xml:space="preserve">Cloudflare TLS</w:t>
+            </w:r>
+          </w:p>
+        </w:tc>
+        <w:tc>
+          <w:tcPr/>
+          <w:p>
+            <w:pPr>
+              <w:pStyle w:val="Compact"/>
+            </w:pPr>
+            <w:r>
+              <w:t xml:space="preserve">Origin Certificate(ECC, *.insovo.top, 15 </w:t>
+            </w:r>
+            <w:r>
+              <w:rPr>
+                <w:rFonts w:hint="eastAsia"/>
+              </w:rPr>
+              <w:t xml:space="preserve">年,</w:t>
+            </w:r>
+            <w:r>
+              <w:t xml:space="preserve"> </w:t>
+            </w:r>
+            <w:r>
+              <w:rPr>
+                <w:rFonts w:hint="eastAsia"/>
+              </w:rPr>
+              <w:t xml:space="preserve">到期</w:t>
+            </w:r>
+            <w:r>
+              <w:t xml:space="preserve"> 2041-05-18)</w:t>
+            </w:r>
+          </w:p>
+        </w:tc>
+      </w:tr>
+      <w:tr>
+        <w:tc>
+          <w:tcPr/>
+          <w:p>
+            <w:pPr>
+              <w:pStyle w:val="Compact"/>
+            </w:pPr>
+            <w:r>
+              <w:rPr>
+                <w:rFonts w:hint="eastAsia"/>
+              </w:rPr>
+              <w:t xml:space="preserve">备份触发</w:t>
+            </w:r>
+          </w:p>
+        </w:tc>
+        <w:tc>
+          <w:tcPr/>
+          <w:p>
+            <w:pPr>
+              <w:pStyle w:val="Compact"/>
+            </w:pPr>
+            <w:r>
+              <w:t xml:space="preserve">systemd</w:t>
+            </w:r>
+            <w:r>
+              <w:t xml:space="preserve"> </w:t>
+            </w:r>
+            <w:r>
+              <w:rPr>
+                <w:rStyle w:val="VerbatimChar"/>
+              </w:rPr>
+              <w:t xml:space="preserve">mesa-backup.timer</w:t>
+            </w:r>
+            <w:r>
+              <w:t xml:space="preserve"> </w:t>
+            </w:r>
+            <w:r>
+              <w:t xml:space="preserve">·</w:t>
+            </w:r>
+            <w:r>
+              <w:t xml:space="preserve"> </w:t>
+            </w:r>
+            <w:r>
+              <w:rPr>
+                <w:rStyle w:val="VerbatimChar"/>
+              </w:rPr>
+              <w:t xml:space="preserve">OnCalendar=*-*-* 03:00:00</w:t>
+            </w:r>
+            <w:r>
+              <w:t xml:space="preserve"> </w:t>
+            </w:r>
+            <w:r>
+              <w:t xml:space="preserve">UTC</w:t>
+            </w:r>
+          </w:p>
+        </w:tc>
+      </w:tr>
+      <w:tr>
+        <w:tc>
+          <w:tcPr/>
+          <w:p>
+            <w:pPr>
+              <w:pStyle w:val="Compact"/>
+            </w:pPr>
+            <w:r>
+              <w:rPr>
+                <w:rFonts w:hint="eastAsia"/>
+              </w:rPr>
+              <w:t xml:space="preserve">备份保留</w:t>
+            </w:r>
+          </w:p>
+        </w:tc>
+        <w:tc>
+          <w:tcPr/>
+          <w:p>
+            <w:pPr>
+              <w:pStyle w:val="Compact"/>
+            </w:pPr>
+            <w:r>
+              <w:rPr>
+                <w:rFonts w:hint="eastAsia"/>
+              </w:rPr>
+              <w:t xml:space="preserve">本地</w:t>
+            </w:r>
+            <w:r>
+              <w:t xml:space="preserve"> 7 </w:t>
+            </w:r>
+            <w:r>
+              <w:rPr>
+                <w:rFonts w:hint="eastAsia"/>
+              </w:rPr>
+              <w:t xml:space="preserve">天</w:t>
+            </w:r>
+            <w:r>
+              <w:t xml:space="preserve"> · R2 </w:t>
+            </w:r>
+            <w:r>
+              <w:rPr>
+                <w:rFonts w:hint="eastAsia"/>
+              </w:rPr>
+              <w:t xml:space="preserve">远端(可加</w:t>
+            </w:r>
+            <w:r>
+              <w:t xml:space="preserve"> lifecycle </w:t>
+            </w:r>
+            <w:r>
+              <w:rPr>
+                <w:rFonts w:hint="eastAsia"/>
+              </w:rPr>
+              <w:t xml:space="preserve">转</w:t>
+            </w:r>
+            <w:r>
+              <w:t xml:space="preserve"> IA)</w:t>
+            </w:r>
+          </w:p>
+        </w:tc>
+      </w:tr>
+    </w:tbl>
+    <w:bookmarkEnd w:id="22"/>
     <w:sectPr>
       <w:footnotePr>
         <w:numRestart w:val="eachSect"/>

</xml_diff>

<commit_message>
docs: sync delivery docs for performance eval and production baseline
Add as-built performance module guide, refresh architecture/API/ops/feishu
status, regenerate Word deliverables, and align README/CLAUDE/AGENTS.
</commit_message>
<xml_diff>
--- a/delivery-docs/01_系统架构与网络拓扑设计说明书.docx
+++ b/delivery-docs/01_系统架构与网络拓扑设计说明书.docx
@@ -7,7 +7,7 @@
         <w:pStyle w:val="Title"/>
       </w:pPr>
       <w:r>
-        <w:t xml:space="preserve">MESA Recruit · </w:t>
+        <w:t xml:space="preserve">Overseas R&amp;D · </w:t>
       </w:r>
       <w:r>
         <w:rPr>
@@ -21,7 +21,7 @@
         <w:pStyle w:val="Author"/>
       </w:pPr>
       <w:r>
-        <w:t xml:space="preserve">MESA Recruit </w:t>
+        <w:t xml:space="preserve">Overseas R&amp;D </w:t>
       </w:r>
       <w:r>
         <w:rPr>
@@ -35,7 +35,7 @@
         <w:pStyle w:val="Date"/>
       </w:pPr>
       <w:r>
-        <w:t xml:space="preserve">2026-05-22</w:t>
+        <w:t xml:space="preserve">2026-07-17</w:t>
       </w:r>
     </w:p>
     <w:bookmarkStart w:id="9" w:name="文档信息"/>
@@ -148,7 +148,7 @@
               <w:pStyle w:val="Compact"/>
             </w:pPr>
             <w:r>
-              <w:t xml:space="preserve">v1.0</w:t>
+              <w:t xml:space="preserve">v1.1</w:t>
             </w:r>
           </w:p>
         </w:tc>
@@ -175,7 +175,7 @@
               <w:pStyle w:val="Compact"/>
             </w:pPr>
             <w:r>
-              <w:t xml:space="preserve">MESA Recruit </w:t>
+              <w:t xml:space="preserve">Overseas R&amp;D </w:t>
             </w:r>
             <w:r>
               <w:rPr>
@@ -334,7 +334,7 @@
         <w:pStyle w:val="FirstParagraph"/>
       </w:pPr>
       <w:r>
-        <w:t xml:space="preserve">MESA Recruit </w:t>
+        <w:t xml:space="preserve">Overseas R&amp;D </w:t>
       </w:r>
       <w:r>
         <w:rPr>
@@ -786,7 +786,7 @@
               <w:pStyle w:val="Compact"/>
             </w:pPr>
             <w:r>
-              <w:t xml:space="preserve">React 18 + Vite 5 + Tailwind 3 + react-router 6</w:t>
+              <w:t xml:space="preserve">React 18 + Vite 6 + Tailwind 3 + react-router 6</w:t>
             </w:r>
           </w:p>
         </w:tc>
@@ -830,7 +830,19 @@
               <w:pStyle w:val="Compact"/>
             </w:pPr>
             <w:r>
-              <w:t xml:space="preserve">Node.js 20 + Fastify 4 + Prisma 5</w:t>
+              <w:t xml:space="preserve">Node.js 20 + Fastify 5 +</w:t>
+            </w:r>
+            <w:r>
+              <w:t xml:space="preserve"> </w:t>
+            </w:r>
+            <w:r>
+              <w:t xml:space="preserve">@fastify/jwt</w:t>
+            </w:r>
+            <w:r>
+              <w:t xml:space="preserve"> </w:t>
+            </w:r>
+            <w:r>
+              <w:t xml:space="preserve">10 (fast-jwt 6.x) + Prisma 5</w:t>
             </w:r>
           </w:p>
         </w:tc>
@@ -1035,13 +1047,13 @@
               <w:pStyle w:val="Compact"/>
             </w:pPr>
             <w:r>
-              <w:t xml:space="preserve">4 </w:t>
-            </w:r>
-            <w:r>
-              <w:rPr>
-                <w:rFonts w:hint="eastAsia"/>
-              </w:rPr>
-              <w:t xml:space="preserve">容器单机编排</w:t>
+              <w:t xml:space="preserve">6 </w:t>
+            </w:r>
+            <w:r>
+              <w:rPr>
+                <w:rFonts w:hint="eastAsia"/>
+              </w:rPr>
+              <w:t xml:space="preserve">服务单机编排(frontend/backend/postgres/redis/uptime-kuma/lark-ingest)</w:t>
             </w:r>
           </w:p>
         </w:tc>
@@ -2338,6 +2350,99 @@
           </w:p>
         </w:tc>
       </w:tr>
+      <w:tr>
+        <w:tc>
+          <w:tcPr/>
+          <w:p>
+            <w:pPr>
+              <w:pStyle w:val="Compact"/>
+            </w:pPr>
+            <w:r>
+              <w:rPr>
+                <w:rStyle w:val="VerbatimChar"/>
+              </w:rPr>
+              <w:t xml:space="preserve">lark-ingest</w:t>
+            </w:r>
+          </w:p>
+        </w:tc>
+        <w:tc>
+          <w:tcPr/>
+          <w:p>
+            <w:pPr>
+              <w:pStyle w:val="Compact"/>
+            </w:pPr>
+            <w:r>
+              <w:rPr>
+                <w:rFonts w:hint="eastAsia"/>
+              </w:rPr>
+              <w:t xml:space="preserve">自建(</w:t>
+            </w:r>
+            <w:r>
+              <w:rPr>
+                <w:rStyle w:val="VerbatimChar"/>
+              </w:rPr>
+              <w:t xml:space="preserve">tools/lark-ingest</w:t>
+            </w:r>
+            <w:r>
+              <w:t xml:space="preserve">)</w:t>
+            </w:r>
+          </w:p>
+        </w:tc>
+        <w:tc>
+          <w:tcPr/>
+          <w:p>
+            <w:pPr>
+              <w:pStyle w:val="Compact"/>
+            </w:pPr>
+            <w:r>
+              <w:rPr>
+                <w:rFonts w:hint="eastAsia"/>
+                <w:b/>
+                <w:bCs/>
+              </w:rPr>
+              <w:t xml:space="preserve">无端口</w:t>
+            </w:r>
+            <w:r>
+              <w:rPr>
+                <w:rFonts w:hint="eastAsia"/>
+              </w:rPr>
+              <w:t xml:space="preserve">(出站长连接飞书)·</w:t>
+            </w:r>
+            <w:r>
+              <w:t xml:space="preserve"> </w:t>
+            </w:r>
+            <w:r>
+              <w:rPr>
+                <w:rFonts w:hint="eastAsia"/>
+              </w:rPr>
+              <w:t xml:space="preserve">内网调</w:t>
+            </w:r>
+            <w:r>
+              <w:t xml:space="preserve"> </w:t>
+            </w:r>
+            <w:r>
+              <w:rPr>
+                <w:rStyle w:val="VerbatimChar"/>
+              </w:rPr>
+              <w:t xml:space="preserve">backend:3001</w:t>
+            </w:r>
+          </w:p>
+        </w:tc>
+        <w:tc>
+          <w:tcPr/>
+          <w:p>
+            <w:pPr>
+              <w:pStyle w:val="Compact"/>
+            </w:pPr>
+            <w:r>
+              <w:rPr>
+                <w:rStyle w:val="VerbatimChar"/>
+              </w:rPr>
+              <w:t xml:space="preserve">mesa_lark_ingest_data</w:t>
+            </w:r>
+          </w:p>
+        </w:tc>
+      </w:tr>
     </w:tbl>
     <w:bookmarkEnd w:id="13"/>
     <w:bookmarkStart w:id="14" w:name="流量走向"/>
@@ -2744,7 +2849,7 @@
     </w:p>
     <w:bookmarkEnd w:id="14"/>
     <w:bookmarkEnd w:id="15"/>
-    <w:bookmarkStart w:id="16" w:name="数据模型"/>
+    <w:bookmarkStart w:id="17" w:name="数据模型"/>
     <w:p>
       <w:pPr>
         <w:pStyle w:val="Heading1"/>
@@ -2767,7 +2872,16 @@
         <w:rPr>
           <w:rFonts w:hint="eastAsia"/>
         </w:rPr>
-        <w:t xml:space="preserve">当前共</w:t>
+        <w:t xml:space="preserve">当前</w:t>
+      </w:r>
+      <w:r>
+        <w:t xml:space="preserve"> Prisma </w:t>
+      </w:r>
+      <w:r>
+        <w:rPr>
+          <w:rFonts w:hint="eastAsia"/>
+        </w:rPr>
+        <w:t xml:space="preserve">共</w:t>
       </w:r>
       <w:r>
         <w:t xml:space="preserve"> </w:t>
@@ -2777,21 +2891,34 @@
           <w:b/>
           <w:bCs/>
         </w:rPr>
-        <w:t xml:space="preserve">11 </w:t>
-      </w:r>
-      <w:r>
-        <w:rPr>
-          <w:rFonts w:hint="eastAsia"/>
-          <w:b/>
-          <w:bCs/>
-        </w:rPr>
-        <w:t xml:space="preserve">张表</w:t>
-      </w:r>
-      <w:r>
-        <w:rPr>
-          <w:rFonts w:hint="eastAsia"/>
-        </w:rPr>
-        <w:t xml:space="preserve">,关系如下:</w:t>
+        <w:t xml:space="preserve">20</w:t>
+      </w:r>
+      <w:r>
+        <w:t xml:space="preserve"> </w:t>
+      </w:r>
+      <w:r>
+        <w:rPr>
+          <w:rFonts w:hint="eastAsia"/>
+        </w:rPr>
+        <w:t xml:space="preserve">个</w:t>
+      </w:r>
+      <w:r>
+        <w:t xml:space="preserve"> </w:t>
+      </w:r>
+      <w:r>
+        <w:rPr>
+          <w:rFonts w:hint="eastAsia"/>
+        </w:rPr>
+        <w:t xml:space="preserve">model(业务核心表</w:t>
+      </w:r>
+      <w:r>
+        <w:t xml:space="preserve"> + </w:t>
+      </w:r>
+      <w:r>
+        <w:rPr>
+          <w:rFonts w:hint="eastAsia"/>
+        </w:rPr>
+        <w:t xml:space="preserve">权限/审计/验证码等辅助表)。关系简图:</w:t>
       </w:r>
     </w:p>
     <w:p>
@@ -2802,7 +2929,7 @@
         <w:rPr>
           <w:rStyle w:val="VerbatimChar"/>
         </w:rPr>
-        <w:t xml:space="preserve">User ─owns──&gt; Candidate ─has─&gt; CandidateNote / Review / ShareLink / Employee</w:t>
+        <w:t xml:space="preserve">User ─owns──&gt; Candidate ─has─&gt; CandidateNote / Review / ShareLink / Employee / InterviewEvaluation</w:t>
       </w:r>
       <w:r>
         <w:br/>
@@ -2811,7 +2938,7 @@
         <w:rPr>
           <w:rStyle w:val="VerbatimChar"/>
         </w:rPr>
-        <w:t xml:space="preserve">                    │           ↑</w:t>
+        <w:t xml:space="preserve"> │                │                                                      ↑</w:t>
       </w:r>
       <w:r>
         <w:br/>
@@ -2820,7 +2947,20 @@
         <w:rPr>
           <w:rStyle w:val="VerbatimChar"/>
         </w:rPr>
-        <w:t xml:space="preserve">                    └──&gt; Interview                     Job</w:t>
+        <w:t xml:space="preserve"> │                └──&gt; Interview ─ Job ←── </w:t>
+      </w:r>
+      <w:r>
+        <w:rPr>
+          <w:rStyle w:val="VerbatimChar"/>
+          <w:rFonts w:hint="eastAsia"/>
+        </w:rPr>
+        <w:t xml:space="preserve">Department(自关联树)</w:t>
+      </w:r>
+      <w:r>
+        <w:rPr>
+          <w:rStyle w:val="VerbatimChar"/>
+        </w:rPr>
+        <w:t xml:space="preserve">           │</w:t>
       </w:r>
       <w:r>
         <w:br/>
@@ -2829,7 +2969,7 @@
         <w:rPr>
           <w:rStyle w:val="VerbatimChar"/>
         </w:rPr>
-        <w:t xml:space="preserve">                                                       ↑</w:t>
+        <w:t xml:space="preserve"> │                         │                                             │</w:t>
       </w:r>
       <w:r>
         <w:br/>
@@ -2838,7 +2978,7 @@
         <w:rPr>
           <w:rStyle w:val="VerbatimChar"/>
         </w:rPr>
-        <w:t xml:space="preserve">                                       Department      │</w:t>
+        <w:t xml:space="preserve"> │                Review ─votes─&gt; ReviewVote                              │</w:t>
       </w:r>
       <w:r>
         <w:br/>
@@ -2847,7 +2987,7 @@
         <w:rPr>
           <w:rStyle w:val="VerbatimChar"/>
         </w:rPr>
-        <w:t xml:space="preserve">                                                       │</w:t>
+        <w:t xml:space="preserve"> │                                                                   PerformanceEvaluation</w:t>
       </w:r>
       <w:r>
         <w:br/>
@@ -2856,7 +2996,7 @@
         <w:rPr>
           <w:rStyle w:val="VerbatimChar"/>
         </w:rPr>
-        <w:t xml:space="preserve">                                Review ─votes─&gt; ReviewVote ─by─&gt; User</w:t>
+        <w:t xml:space="preserve"> │                                                                        ↑</w:t>
       </w:r>
       <w:r>
         <w:br/>
@@ -2865,7 +3005,14 @@
         <w:rPr>
           <w:rStyle w:val="VerbatimChar"/>
         </w:rPr>
-        <w:t xml:space="preserve">                                Review ─replies─&gt; Review (self, 1 level)</w:t>
+        <w:t xml:space="preserve"> └── hrSignature* </w:t>
+      </w:r>
+      <w:r>
+        <w:rPr>
+          <w:rStyle w:val="VerbatimChar"/>
+          <w:rFonts w:hint="eastAsia"/>
+        </w:rPr>
+        <w:t xml:space="preserve">───────────────────────────────(可选嵌入导出)──────────┘</w:t>
       </w:r>
       <w:r>
         <w:br/>
@@ -2877,20 +3024,7 @@
         <w:rPr>
           <w:rStyle w:val="VerbatimChar"/>
         </w:rPr>
-        <w:t xml:space="preserve">SystemSetting (KV, admin only · AES-256-GCM </w:t>
-      </w:r>
-      <w:r>
-        <w:rPr>
-          <w:rStyle w:val="VerbatimChar"/>
-          <w:rFonts w:hint="eastAsia"/>
-        </w:rPr>
-        <w:t xml:space="preserve">加密敏感</w:t>
-      </w:r>
-      <w:r>
-        <w:rPr>
-          <w:rStyle w:val="VerbatimChar"/>
-        </w:rPr>
-        <w:t xml:space="preserve"> value)</w:t>
+        <w:t xml:space="preserve">UploadShareLink · SystemSetting · AuditLog · UserAccessPolicy · …</w:t>
       </w:r>
     </w:p>
     <w:tbl>
@@ -2962,16 +3096,40 @@
               <w:rPr>
                 <w:rFonts w:hint="eastAsia"/>
               </w:rPr>
-              <w:t xml:space="preserve">系统账号(ADMIN/RECRUITER/VIEWER</w:t>
+              <w:t xml:space="preserve">系统账号</w:t>
+            </w:r>
+            <w:r>
+              <w:t xml:space="preserve"> + </w:t>
+            </w:r>
+            <w:r>
+              <w:rPr>
+                <w:rFonts w:hint="eastAsia"/>
+              </w:rPr>
+              <w:t xml:space="preserve">可选</w:t>
             </w:r>
             <w:r>
               <w:t xml:space="preserve"> </w:t>
             </w:r>
             <w:r>
               <w:rPr>
-                <w:rFonts w:hint="eastAsia"/>
-              </w:rPr>
-              <w:t xml:space="preserve">三角色)</w:t>
+                <w:rStyle w:val="VerbatimChar"/>
+              </w:rPr>
+              <w:t xml:space="preserve">hrSignatureKey</w:t>
+            </w:r>
+            <w:r>
+              <w:rPr>
+                <w:rFonts w:hint="eastAsia"/>
+              </w:rPr>
+              <w:t xml:space="preserve">(绩效</w:t>
+            </w:r>
+            <w:r>
+              <w:t xml:space="preserve"> HR </w:t>
+            </w:r>
+            <w:r>
+              <w:rPr>
+                <w:rFonts w:hint="eastAsia"/>
+              </w:rPr>
+              <w:t xml:space="preserve">电子章)</w:t>
             </w:r>
           </w:p>
         </w:tc>
@@ -3001,28 +3159,16 @@
               <w:rPr>
                 <w:rFonts w:hint="eastAsia"/>
               </w:rPr>
-              <w:t xml:space="preserve">候选人,带</w:t>
-            </w:r>
-            <w:r>
-              <w:t xml:space="preserve"> LLM </w:t>
-            </w:r>
-            <w:r>
-              <w:rPr>
-                <w:rFonts w:hint="eastAsia"/>
-              </w:rPr>
-              <w:t xml:space="preserve">解析结果(aiSummary/skills/tags/risks/highlights)+</w:t>
-            </w:r>
-            <w:r>
-              <w:t xml:space="preserve"> jobId </w:t>
-            </w:r>
-            <w:r>
-              <w:rPr>
-                <w:rFonts w:hint="eastAsia"/>
-              </w:rPr>
-              <w:t xml:space="preserve">关联</w:t>
-            </w:r>
-            <w:r>
-              <w:t xml:space="preserve"> JD</w:t>
+              <w:t xml:space="preserve">候选人(简历事实</w:t>
+            </w:r>
+            <w:r>
+              <w:t xml:space="preserve"> + JD </w:t>
+            </w:r>
+            <w:r>
+              <w:rPr>
+                <w:rFonts w:hint="eastAsia"/>
+              </w:rPr>
+              <w:t xml:space="preserve">评估字段)</w:t>
             </w:r>
           </w:p>
         </w:tc>
@@ -3040,43 +3186,43 @@
               </w:rPr>
               <w:t xml:space="preserve">Job</w:t>
             </w:r>
-          </w:p>
-        </w:tc>
-        <w:tc>
-          <w:tcPr/>
-          <w:p>
-            <w:pPr>
-              <w:pStyle w:val="Compact"/>
-            </w:pPr>
-            <w:r>
-              <w:rPr>
-                <w:rFonts w:hint="eastAsia"/>
-              </w:rPr>
-              <w:t xml:space="preserve">岗位,</w:t>
+            <w:r>
+              <w:t xml:space="preserve"> </w:t>
+            </w:r>
+            <w:r>
+              <w:t xml:space="preserve">/</w:t>
+            </w:r>
+            <w:r>
+              <w:t xml:space="preserve"> </w:t>
             </w:r>
             <w:r>
               <w:rPr>
                 <w:rStyle w:val="VerbatimChar"/>
               </w:rPr>
-              <w:t xml:space="preserve">description</w:t>
-            </w:r>
-            <w:r>
-              <w:t xml:space="preserve"> </w:t>
-            </w:r>
-            <w:r>
-              <w:rPr>
-                <w:rFonts w:hint="eastAsia"/>
-              </w:rPr>
-              <w:t xml:space="preserve">字段给</w:t>
-            </w:r>
-            <w:r>
-              <w:t xml:space="preserve"> LLM </w:t>
-            </w:r>
-            <w:r>
-              <w:rPr>
-                <w:rFonts w:hint="eastAsia"/>
-              </w:rPr>
-              <w:t xml:space="preserve">二次评估用</w:t>
+              <w:t xml:space="preserve">Department</w:t>
+            </w:r>
+          </w:p>
+        </w:tc>
+        <w:tc>
+          <w:tcPr/>
+          <w:p>
+            <w:pPr>
+              <w:pStyle w:val="Compact"/>
+            </w:pPr>
+            <w:r>
+              <w:rPr>
+                <w:rFonts w:hint="eastAsia"/>
+              </w:rPr>
+              <w:t xml:space="preserve">岗位</w:t>
+            </w:r>
+            <w:r>
+              <w:t xml:space="preserve"> / </w:t>
+            </w:r>
+            <w:r>
+              <w:rPr>
+                <w:rFonts w:hint="eastAsia"/>
+              </w:rPr>
+              <w:t xml:space="preserve">部门树</w:t>
             </w:r>
           </w:p>
         </w:tc>
@@ -3092,21 +3238,30 @@
               <w:rPr>
                 <w:rStyle w:val="VerbatimChar"/>
               </w:rPr>
-              <w:t xml:space="preserve">Department</w:t>
-            </w:r>
-          </w:p>
-        </w:tc>
-        <w:tc>
-          <w:tcPr/>
-          <w:p>
-            <w:pPr>
-              <w:pStyle w:val="Compact"/>
-            </w:pPr>
-            <w:r>
-              <w:rPr>
-                <w:rFonts w:hint="eastAsia"/>
-              </w:rPr>
-              <w:t xml:space="preserve">部门(自关联树)</w:t>
+              <w:t xml:space="preserve">Employee</w:t>
+            </w:r>
+          </w:p>
+        </w:tc>
+        <w:tc>
+          <w:tcPr/>
+          <w:p>
+            <w:pPr>
+              <w:pStyle w:val="Compact"/>
+            </w:pPr>
+            <w:r>
+              <w:rPr>
+                <w:rFonts w:hint="eastAsia"/>
+              </w:rPr>
+              <w:t xml:space="preserve">入职员工(候选人转化</w:t>
+            </w:r>
+            <w:r>
+              <w:t xml:space="preserve"> · </w:t>
+            </w:r>
+            <w:r>
+              <w:rPr>
+                <w:rFonts w:hint="eastAsia"/>
+              </w:rPr>
+              <w:t xml:space="preserve">现有人员/入职管理/绩效人员池)</w:t>
             </w:r>
           </w:p>
         </w:tc>
@@ -3122,30 +3277,45 @@
               <w:rPr>
                 <w:rStyle w:val="VerbatimChar"/>
               </w:rPr>
-              <w:t xml:space="preserve">Employee</w:t>
-            </w:r>
-          </w:p>
-        </w:tc>
-        <w:tc>
-          <w:tcPr/>
-          <w:p>
-            <w:pPr>
-              <w:pStyle w:val="Compact"/>
-            </w:pPr>
-            <w:r>
-              <w:rPr>
-                <w:rFonts w:hint="eastAsia"/>
-              </w:rPr>
-              <w:t xml:space="preserve">已入职员工(候选人</w:t>
-            </w:r>
-            <w:r>
-              <w:t xml:space="preserve"> → </w:t>
-            </w:r>
-            <w:r>
-              <w:rPr>
-                <w:rFonts w:hint="eastAsia"/>
-              </w:rPr>
-              <w:t xml:space="preserve">员工转化)</w:t>
+              <w:t xml:space="preserve">Interview</w:t>
+            </w:r>
+            <w:r>
+              <w:t xml:space="preserve"> </w:t>
+            </w:r>
+            <w:r>
+              <w:t xml:space="preserve">/</w:t>
+            </w:r>
+            <w:r>
+              <w:t xml:space="preserve"> </w:t>
+            </w:r>
+            <w:r>
+              <w:rPr>
+                <w:rStyle w:val="VerbatimChar"/>
+              </w:rPr>
+              <w:t xml:space="preserve">InterviewEvaluation</w:t>
+            </w:r>
+          </w:p>
+        </w:tc>
+        <w:tc>
+          <w:tcPr/>
+          <w:p>
+            <w:pPr>
+              <w:pStyle w:val="Compact"/>
+            </w:pPr>
+            <w:r>
+              <w:rPr>
+                <w:rFonts w:hint="eastAsia"/>
+              </w:rPr>
+              <w:t xml:space="preserve">面试安排</w:t>
+            </w:r>
+            <w:r>
+              <w:t xml:space="preserve"> / </w:t>
+            </w:r>
+            <w:r>
+              <w:rPr>
+                <w:rFonts w:hint="eastAsia"/>
+              </w:rPr>
+              <w:t xml:space="preserve">面试评价</w:t>
             </w:r>
           </w:p>
         </w:tc>
@@ -3161,21 +3331,56 @@
               <w:rPr>
                 <w:rStyle w:val="VerbatimChar"/>
               </w:rPr>
-              <w:t xml:space="preserve">Interview</w:t>
-            </w:r>
-          </w:p>
-        </w:tc>
-        <w:tc>
-          <w:tcPr/>
-          <w:p>
-            <w:pPr>
-              <w:pStyle w:val="Compact"/>
-            </w:pPr>
-            <w:r>
-              <w:rPr>
-                <w:rFonts w:hint="eastAsia"/>
-              </w:rPr>
-              <w:t xml:space="preserve">面试安排</w:t>
+              <w:t xml:space="preserve">PerformanceEvaluation</w:t>
+            </w:r>
+          </w:p>
+        </w:tc>
+        <w:tc>
+          <w:tcPr/>
+          <w:p>
+            <w:pPr>
+              <w:pStyle w:val="Compact"/>
+            </w:pPr>
+            <w:r>
+              <w:rPr>
+                <w:rFonts w:hint="eastAsia"/>
+                <w:b/>
+                <w:bCs/>
+              </w:rPr>
+              <w:t xml:space="preserve">员工绩效评价</w:t>
+            </w:r>
+            <w:r>
+              <w:rPr>
+                <w:rFonts w:hint="eastAsia"/>
+              </w:rPr>
+              <w:t xml:space="preserve">(双</w:t>
+            </w:r>
+            <w:r>
+              <w:t xml:space="preserve"> token + </w:t>
+            </w:r>
+            <w:r>
+              <w:rPr>
+                <w:rFonts w:hint="eastAsia"/>
+              </w:rPr>
+              <w:t xml:space="preserve">访问密钥</w:t>
+            </w:r>
+            <w:r>
+              <w:t xml:space="preserve"> + </w:t>
+            </w:r>
+            <w:r>
+              <w:rPr>
+                <w:rFonts w:hint="eastAsia"/>
+              </w:rPr>
+              <w:t xml:space="preserve">签字</w:t>
+            </w:r>
+            <w:r>
+              <w:t xml:space="preserve"> + </w:t>
+            </w:r>
+            <w:r>
+              <w:rPr>
+                <w:rFonts w:hint="eastAsia"/>
+              </w:rPr>
+              <w:t xml:space="preserve">导出)</w:t>
             </w:r>
           </w:p>
         </w:tc>
@@ -3193,19 +3398,58 @@
               </w:rPr>
               <w:t xml:space="preserve">CandidateNote</w:t>
             </w:r>
-          </w:p>
-        </w:tc>
-        <w:tc>
-          <w:tcPr/>
-          <w:p>
-            <w:pPr>
-              <w:pStyle w:val="Compact"/>
-            </w:pPr>
-            <w:r>
-              <w:rPr>
-                <w:rFonts w:hint="eastAsia"/>
-              </w:rPr>
-              <w:t xml:space="preserve">内部备注(详情页时间线)</w:t>
+            <w:r>
+              <w:t xml:space="preserve"> </w:t>
+            </w:r>
+            <w:r>
+              <w:t xml:space="preserve">/</w:t>
+            </w:r>
+            <w:r>
+              <w:t xml:space="preserve"> </w:t>
+            </w:r>
+            <w:r>
+              <w:rPr>
+                <w:rStyle w:val="VerbatimChar"/>
+              </w:rPr>
+              <w:t xml:space="preserve">Review</w:t>
+            </w:r>
+            <w:r>
+              <w:t xml:space="preserve"> </w:t>
+            </w:r>
+            <w:r>
+              <w:t xml:space="preserve">/</w:t>
+            </w:r>
+            <w:r>
+              <w:t xml:space="preserve"> </w:t>
+            </w:r>
+            <w:r>
+              <w:rPr>
+                <w:rStyle w:val="VerbatimChar"/>
+              </w:rPr>
+              <w:t xml:space="preserve">ReviewVote</w:t>
+            </w:r>
+          </w:p>
+        </w:tc>
+        <w:tc>
+          <w:tcPr/>
+          <w:p>
+            <w:pPr>
+              <w:pStyle w:val="Compact"/>
+            </w:pPr>
+            <w:r>
+              <w:rPr>
+                <w:rFonts w:hint="eastAsia"/>
+              </w:rPr>
+              <w:t xml:space="preserve">备注</w:t>
+            </w:r>
+            <w:r>
+              <w:t xml:space="preserve"> / </w:t>
+            </w:r>
+            <w:r>
+              <w:rPr>
+                <w:rFonts w:hint="eastAsia"/>
+              </w:rPr>
+              <w:t xml:space="preserve">评价对话</w:t>
             </w:r>
           </w:p>
         </w:tc>
@@ -3221,21 +3465,45 @@
               <w:rPr>
                 <w:rStyle w:val="VerbatimChar"/>
               </w:rPr>
-              <w:t xml:space="preserve">Review</w:t>
-            </w:r>
-          </w:p>
-        </w:tc>
-        <w:tc>
-          <w:tcPr/>
-          <w:p>
-            <w:pPr>
-              <w:pStyle w:val="Compact"/>
-            </w:pPr>
-            <w:r>
-              <w:rPr>
-                <w:rFonts w:hint="eastAsia"/>
-              </w:rPr>
-              <w:t xml:space="preserve">评价对话(回复/投票/可见范围/审核删除)</w:t>
+              <w:t xml:space="preserve">ShareLink</w:t>
+            </w:r>
+            <w:r>
+              <w:t xml:space="preserve"> </w:t>
+            </w:r>
+            <w:r>
+              <w:t xml:space="preserve">/</w:t>
+            </w:r>
+            <w:r>
+              <w:t xml:space="preserve"> </w:t>
+            </w:r>
+            <w:r>
+              <w:rPr>
+                <w:rStyle w:val="VerbatimChar"/>
+              </w:rPr>
+              <w:t xml:space="preserve">UploadShareLink</w:t>
+            </w:r>
+          </w:p>
+        </w:tc>
+        <w:tc>
+          <w:tcPr/>
+          <w:p>
+            <w:pPr>
+              <w:pStyle w:val="Compact"/>
+            </w:pPr>
+            <w:r>
+              <w:rPr>
+                <w:rFonts w:hint="eastAsia"/>
+              </w:rPr>
+              <w:t xml:space="preserve">公开分享</w:t>
+            </w:r>
+            <w:r>
+              <w:t xml:space="preserve"> / </w:t>
+            </w:r>
+            <w:r>
+              <w:rPr>
+                <w:rFonts w:hint="eastAsia"/>
+              </w:rPr>
+              <w:t xml:space="preserve">公开上传</w:t>
             </w:r>
           </w:p>
         </w:tc>
@@ -3251,21 +3519,24 @@
               <w:rPr>
                 <w:rStyle w:val="VerbatimChar"/>
               </w:rPr>
-              <w:t xml:space="preserve">ReviewVote</w:t>
-            </w:r>
-          </w:p>
-        </w:tc>
-        <w:tc>
-          <w:tcPr/>
-          <w:p>
-            <w:pPr>
-              <w:pStyle w:val="Compact"/>
-            </w:pPr>
-            <w:r>
-              <w:rPr>
-                <w:rFonts w:hint="eastAsia"/>
-              </w:rPr>
-              <w:t xml:space="preserve">登录用户对评价的投票去重</w:t>
+              <w:t xml:space="preserve">SystemSetting</w:t>
+            </w:r>
+          </w:p>
+        </w:tc>
+        <w:tc>
+          <w:tcPr/>
+          <w:p>
+            <w:pPr>
+              <w:pStyle w:val="Compact"/>
+            </w:pPr>
+            <w:r>
+              <w:t xml:space="preserve">admin KV(Kimi key </w:t>
+            </w:r>
+            <w:r>
+              <w:rPr>
+                <w:rFonts w:hint="eastAsia"/>
+              </w:rPr>
+              <w:t xml:space="preserve">等,AES-256-GCM)</w:t>
             </w:r>
           </w:p>
         </w:tc>
@@ -3281,21 +3552,33 @@
               <w:rPr>
                 <w:rStyle w:val="VerbatimChar"/>
               </w:rPr>
-              <w:t xml:space="preserve">ShareLink</w:t>
-            </w:r>
-          </w:p>
-        </w:tc>
-        <w:tc>
-          <w:tcPr/>
-          <w:p>
-            <w:pPr>
-              <w:pStyle w:val="Compact"/>
-            </w:pPr>
-            <w:r>
-              <w:rPr>
-                <w:rFonts w:hint="eastAsia"/>
-              </w:rPr>
-              <w:t xml:space="preserve">公开分享凭证(token/有效期/访问次数上限)</w:t>
+              <w:t xml:space="preserve">UserAccessPolicy</w:t>
+            </w:r>
+            <w:r>
+              <w:t xml:space="preserve"> </w:t>
+            </w:r>
+            <w:r>
+              <w:rPr>
+                <w:rFonts w:hint="eastAsia"/>
+              </w:rPr>
+              <w:t xml:space="preserve">等</w:t>
+            </w:r>
+          </w:p>
+        </w:tc>
+        <w:tc>
+          <w:tcPr/>
+          <w:p>
+            <w:pPr>
+              <w:pStyle w:val="Compact"/>
+            </w:pPr>
+            <w:r>
+              <w:rPr>
+                <w:rFonts w:hint="eastAsia"/>
+              </w:rPr>
+              <w:t xml:space="preserve">页面/模块权限与部门/岗位</w:t>
+            </w:r>
+            <w:r>
+              <w:t xml:space="preserve"> scope</w:t>
             </w:r>
           </w:p>
         </w:tc>
@@ -3311,42 +3594,69 @@
               <w:rPr>
                 <w:rStyle w:val="VerbatimChar"/>
               </w:rPr>
-              <w:t xml:space="preserve">SystemSetting</w:t>
-            </w:r>
-          </w:p>
-        </w:tc>
-        <w:tc>
-          <w:tcPr/>
-          <w:p>
-            <w:pPr>
-              <w:pStyle w:val="Compact"/>
-            </w:pPr>
-            <w:r>
-              <w:t xml:space="preserve">admin </w:t>
-            </w:r>
-            <w:r>
-              <w:rPr>
-                <w:rFonts w:hint="eastAsia"/>
-              </w:rPr>
-              <w:t xml:space="preserve">配置(Kimi</w:t>
-            </w:r>
-            <w:r>
-              <w:t xml:space="preserve"> API Key </w:t>
-            </w:r>
-            <w:r>
-              <w:rPr>
-                <w:rFonts w:hint="eastAsia"/>
-              </w:rPr>
-              <w:t xml:space="preserve">等,AES-256-GCM</w:t>
+              <w:t xml:space="preserve">AuditLog</w:t>
             </w:r>
             <w:r>
               <w:t xml:space="preserve"> </w:t>
             </w:r>
             <w:r>
-              <w:rPr>
-                <w:rFonts w:hint="eastAsia"/>
-              </w:rPr>
-              <w:t xml:space="preserve">加密)</w:t>
+              <w:t xml:space="preserve">/</w:t>
+            </w:r>
+            <w:r>
+              <w:t xml:space="preserve"> </w:t>
+            </w:r>
+            <w:r>
+              <w:rPr>
+                <w:rStyle w:val="VerbatimChar"/>
+              </w:rPr>
+              <w:t xml:space="preserve">PasswordHistory</w:t>
+            </w:r>
+            <w:r>
+              <w:t xml:space="preserve"> </w:t>
+            </w:r>
+            <w:r>
+              <w:t xml:space="preserve">/</w:t>
+            </w:r>
+            <w:r>
+              <w:t xml:space="preserve"> </w:t>
+            </w:r>
+            <w:r>
+              <w:rPr>
+                <w:rStyle w:val="VerbatimChar"/>
+              </w:rPr>
+              <w:t xml:space="preserve">EmailVerificationCode</w:t>
+            </w:r>
+          </w:p>
+        </w:tc>
+        <w:tc>
+          <w:tcPr/>
+          <w:p>
+            <w:pPr>
+              <w:pStyle w:val="Compact"/>
+            </w:pPr>
+            <w:r>
+              <w:rPr>
+                <w:rFonts w:hint="eastAsia"/>
+              </w:rPr>
+              <w:t xml:space="preserve">审计</w:t>
+            </w:r>
+            <w:r>
+              <w:t xml:space="preserve"> · </w:t>
+            </w:r>
+            <w:r>
+              <w:rPr>
+                <w:rFonts w:hint="eastAsia"/>
+              </w:rPr>
+              <w:t xml:space="preserve">密码历史</w:t>
+            </w:r>
+            <w:r>
+              <w:t xml:space="preserve"> · </w:t>
+            </w:r>
+            <w:r>
+              <w:rPr>
+                <w:rFonts w:hint="eastAsia"/>
+              </w:rPr>
+              <w:t xml:space="preserve">邮箱验证</w:t>
             </w:r>
           </w:p>
         </w:tc>
@@ -3384,14 +3694,25 @@
         <w:rPr>
           <w:rFonts w:hint="eastAsia"/>
         </w:rPr>
-        <w:t xml:space="preserve">,字段级说明参考</w:t>
-      </w:r>
-      <w:r>
-        <w:t xml:space="preserve"> CLAUDE.md §10。</w:t>
+        <w:t xml:space="preserve">。绩效细节见</w:t>
+      </w:r>
+      <w:r>
+        <w:t xml:space="preserve"> </w:t>
+      </w:r>
+      <w:hyperlink r:id="rId16">
+        <w:r>
+          <w:rPr>
+            <w:rStyle w:val="VerbatimChar"/>
+          </w:rPr>
+          <w:t xml:space="preserve">06_performance_evaluation.md</w:t>
+        </w:r>
+      </w:hyperlink>
+      <w:r>
+        <w:t xml:space="preserve">。</w:t>
       </w:r>
     </w:p>
-    <w:bookmarkEnd w:id="16"/>
-    <w:bookmarkStart w:id="21" w:name="a.-新增子系统说明"/>
+    <w:bookmarkEnd w:id="17"/>
+    <w:bookmarkStart w:id="26" w:name="a.-新增子系统说明"/>
     <w:p>
       <w:pPr>
         <w:pStyle w:val="Heading1"/>
@@ -3426,7 +3747,7 @@
         <w:t xml:space="preserve">六阶段之外、上线后扩展实现的子系统:</w:t>
       </w:r>
     </w:p>
-    <w:bookmarkStart w:id="17" w:name="a.1-llm-简历解析kimi-moonshot-ai"/>
+    <w:bookmarkStart w:id="18" w:name="a.1-llm-简历解析流水线kimi-moonshot-ai"/>
     <w:p>
       <w:pPr>
         <w:pStyle w:val="Heading2"/>
@@ -3438,7 +3759,7 @@
         <w:rPr>
           <w:rFonts w:hint="eastAsia"/>
         </w:rPr>
-        <w:t xml:space="preserve">简历解析(Kimi</w:t>
+        <w:t xml:space="preserve">简历解析流水线(Kimi</w:t>
       </w:r>
       <w:r>
         <w:t xml:space="preserve"> · Moonshot AI)</w:t>
@@ -3446,6 +3767,37 @@
     </w:p>
     <w:p>
       <w:pPr>
+        <w:pStyle w:val="FirstParagraph"/>
+      </w:pPr>
+      <w:r>
+        <w:rPr>
+          <w:rFonts w:hint="eastAsia"/>
+          <w:b/>
+          <w:bCs/>
+        </w:rPr>
+        <w:t xml:space="preserve">阶段一</w:t>
+      </w:r>
+      <w:r>
+        <w:rPr>
+          <w:b/>
+          <w:bCs/>
+        </w:rPr>
+        <w:t xml:space="preserve"> </w:t>
+      </w:r>
+      <w:r>
+        <w:rPr>
+          <w:rFonts w:hint="eastAsia"/>
+          <w:b/>
+          <w:bCs/>
+        </w:rPr>
+        <w:t xml:space="preserve">文件正文抽取与清洗</w:t>
+      </w:r>
+      <w:r>
+        <w:t xml:space="preserve">:</w:t>
+      </w:r>
+    </w:p>
+    <w:p>
+      <w:pPr>
         <w:pStyle w:val="SourceCode"/>
       </w:pPr>
       <w:r>
@@ -3470,14 +3822,179 @@
         <w:rPr>
           <w:rStyle w:val="VerbatimChar"/>
         </w:rPr>
-        <w:t xml:space="preserve">[ POST /api/resumes/parse ] -&gt; [ Kimi Files API </w:t>
-      </w:r>
-      <w:r>
-        <w:rPr>
-          <w:rStyle w:val="VerbatimChar"/>
-          <w:rFonts w:hint="eastAsia"/>
-        </w:rPr>
-        <w:t xml:space="preserve">上传</w:t>
+        <w:t xml:space="preserve">[ POST /api/resumes/parse ] -&gt; [ R2 </w:t>
+      </w:r>
+      <w:r>
+        <w:rPr>
+          <w:rStyle w:val="VerbatimChar"/>
+          <w:rFonts w:hint="eastAsia"/>
+        </w:rPr>
+        <w:t xml:space="preserve">拉文件</w:t>
+      </w:r>
+      <w:r>
+        <w:rPr>
+          <w:rStyle w:val="VerbatimChar"/>
+        </w:rPr>
+        <w:t xml:space="preserve"> ]</w:t>
+      </w:r>
+      <w:r>
+        <w:br/>
+      </w:r>
+      <w:r>
+        <w:rPr>
+          <w:rStyle w:val="VerbatimChar"/>
+        </w:rPr>
+        <w:t xml:space="preserve">        ↓</w:t>
+      </w:r>
+      <w:r>
+        <w:br/>
+      </w:r>
+      <w:r>
+        <w:rPr>
+          <w:rStyle w:val="VerbatimChar"/>
+        </w:rPr>
+        <w:t xml:space="preserve">[ PDF: pdftotext -layout </w:t>
+      </w:r>
+      <w:r>
+        <w:rPr>
+          <w:rStyle w:val="VerbatimChar"/>
+          <w:rFonts w:hint="eastAsia"/>
+        </w:rPr>
+        <w:t xml:space="preserve">优先,扫描/空文本</w:t>
+      </w:r>
+      <w:r>
+        <w:rPr>
+          <w:rStyle w:val="VerbatimChar"/>
+        </w:rPr>
+        <w:t xml:space="preserve"> fallback Kimi Files API ]</w:t>
+      </w:r>
+      <w:r>
+        <w:br/>
+      </w:r>
+      <w:r>
+        <w:rPr>
+          <w:rStyle w:val="VerbatimChar"/>
+        </w:rPr>
+        <w:t xml:space="preserve">[ DOC/DOCX/DOC: Kimi Files API </w:t>
+      </w:r>
+      <w:r>
+        <w:rPr>
+          <w:rStyle w:val="VerbatimChar"/>
+          <w:rFonts w:hint="eastAsia"/>
+        </w:rPr>
+        <w:t xml:space="preserve">抽取</w:t>
+      </w:r>
+      <w:r>
+        <w:rPr>
+          <w:rStyle w:val="VerbatimChar"/>
+        </w:rPr>
+        <w:t xml:space="preserve"> ]</w:t>
+      </w:r>
+      <w:r>
+        <w:br/>
+      </w:r>
+      <w:r>
+        <w:rPr>
+          <w:rStyle w:val="VerbatimChar"/>
+        </w:rPr>
+        <w:t xml:space="preserve">        ↓</w:t>
+      </w:r>
+      <w:r>
+        <w:br/>
+      </w:r>
+      <w:r>
+        <w:rPr>
+          <w:rStyle w:val="VerbatimChar"/>
+        </w:rPr>
+        <w:t xml:space="preserve">[ </w:t>
+      </w:r>
+      <w:r>
+        <w:rPr>
+          <w:rStyle w:val="VerbatimChar"/>
+          <w:rFonts w:hint="eastAsia"/>
+        </w:rPr>
+        <w:t xml:space="preserve">水印</w:t>
+      </w:r>
+      <w:r>
+        <w:rPr>
+          <w:rStyle w:val="VerbatimChar"/>
+        </w:rPr>
+        <w:t xml:space="preserve"> token / Word </w:t>
+      </w:r>
+      <w:r>
+        <w:rPr>
+          <w:rStyle w:val="VerbatimChar"/>
+          <w:rFonts w:hint="eastAsia"/>
+        </w:rPr>
+        <w:t xml:space="preserve">页脚</w:t>
+      </w:r>
+      <w:r>
+        <w:rPr>
+          <w:rStyle w:val="VerbatimChar"/>
+        </w:rPr>
+        <w:t xml:space="preserve"> / form feed </w:t>
+      </w:r>
+      <w:r>
+        <w:rPr>
+          <w:rStyle w:val="VerbatimChar"/>
+          <w:rFonts w:hint="eastAsia"/>
+        </w:rPr>
+        <w:t xml:space="preserve">噪声清洗</w:t>
+      </w:r>
+      <w:r>
+        <w:rPr>
+          <w:rStyle w:val="VerbatimChar"/>
+        </w:rPr>
+        <w:t xml:space="preserve"> ]</w:t>
+      </w:r>
+    </w:p>
+    <w:p>
+      <w:pPr>
+        <w:pStyle w:val="FirstParagraph"/>
+      </w:pPr>
+      <w:r>
+        <w:rPr>
+          <w:rFonts w:hint="eastAsia"/>
+          <w:b/>
+          <w:bCs/>
+        </w:rPr>
+        <w:t xml:space="preserve">阶段二</w:t>
+      </w:r>
+      <w:r>
+        <w:rPr>
+          <w:b/>
+          <w:bCs/>
+        </w:rPr>
+        <w:t xml:space="preserve"> parseResume — </w:t>
+      </w:r>
+      <w:r>
+        <w:rPr>
+          <w:rFonts w:hint="eastAsia"/>
+          <w:b/>
+          <w:bCs/>
+        </w:rPr>
+        <w:t xml:space="preserve">产简历事实字段</w:t>
+      </w:r>
+      <w:r>
+        <w:t xml:space="preserve">:</w:t>
+      </w:r>
+    </w:p>
+    <w:p>
+      <w:pPr>
+        <w:pStyle w:val="SourceCode"/>
+      </w:pPr>
+      <w:r>
+        <w:rPr>
+          <w:rStyle w:val="VerbatimChar"/>
+        </w:rPr>
+        <w:t xml:space="preserve">[ </w:t>
+      </w:r>
+      <w:r>
+        <w:rPr>
+          <w:rStyle w:val="VerbatimChar"/>
+          <w:rFonts w:hint="eastAsia"/>
+        </w:rPr>
+        <w:t xml:space="preserve">清洗后的简历正文</w:t>
       </w:r>
       <w:r>
         <w:rPr>
@@ -3501,33 +4018,60 @@
         <w:rPr>
           <w:rStyle w:val="VerbatimChar"/>
         </w:rPr>
-        <w:t xml:space="preserve">[ aiSummary (HR </w:t>
-      </w:r>
-      <w:r>
-        <w:rPr>
-          <w:rStyle w:val="VerbatimChar"/>
-          <w:rFonts w:hint="eastAsia"/>
-        </w:rPr>
-        <w:t xml:space="preserve">简报纯文本)</w:t>
-      </w:r>
-      <w:r>
-        <w:rPr>
-          <w:rStyle w:val="VerbatimChar"/>
-        </w:rPr>
-        <w:t xml:space="preserve"> + </w:t>
-      </w:r>
-      <w:r>
-        <w:rPr>
-          <w:rStyle w:val="VerbatimChar"/>
-          <w:rFonts w:hint="eastAsia"/>
-        </w:rPr>
-        <w:t xml:space="preserve">结构化字段</w:t>
-      </w:r>
-      <w:r>
-        <w:rPr>
-          <w:rStyle w:val="VerbatimChar"/>
-        </w:rPr>
-        <w:t xml:space="preserve"> ] -&gt; [ </w:t>
+        <w:t xml:space="preserve">[ summary </w:t>
+      </w:r>
+      <w:r>
+        <w:rPr>
+          <w:rStyle w:val="VerbatimChar"/>
+          <w:rFonts w:hint="eastAsia"/>
+        </w:rPr>
+        <w:t xml:space="preserve">纯文本简报</w:t>
+      </w:r>
+      <w:r>
+        <w:rPr>
+          <w:rStyle w:val="VerbatimChar"/>
+        </w:rPr>
+        <w:t xml:space="preserve"> + name/phone/email/school/major/yearsExp/tags/languages ]</w:t>
+      </w:r>
+      <w:r>
+        <w:br/>
+      </w:r>
+      <w:r>
+        <w:rPr>
+          <w:rStyle w:val="VerbatimChar"/>
+        </w:rPr>
+        <w:t xml:space="preserve">[ + skills / experience / educationHistory (markdown bullet </w:t>
+      </w:r>
+      <w:r>
+        <w:rPr>
+          <w:rStyle w:val="VerbatimChar"/>
+          <w:rFonts w:hint="eastAsia"/>
+        </w:rPr>
+        <w:t xml:space="preserve">字符串,忠于简历原文)</w:t>
+      </w:r>
+      <w:r>
+        <w:rPr>
+          <w:rStyle w:val="VerbatimChar"/>
+        </w:rPr>
+        <w:t xml:space="preserve"> ]</w:t>
+      </w:r>
+      <w:r>
+        <w:br/>
+      </w:r>
+      <w:r>
+        <w:rPr>
+          <w:rStyle w:val="VerbatimChar"/>
+        </w:rPr>
+        <w:t xml:space="preserve">        ↓</w:t>
+      </w:r>
+      <w:r>
+        <w:br/>
+      </w:r>
+      <w:r>
+        <w:rPr>
+          <w:rStyle w:val="VerbatimChar"/>
+        </w:rPr>
+        <w:t xml:space="preserve">[ </w:t>
       </w:r>
       <w:r>
         <w:rPr>
@@ -3693,28 +4237,13 @@
         </w:numPr>
       </w:pPr>
       <w:r>
-        <w:rPr>
-          <w:rFonts w:hint="eastAsia"/>
-        </w:rPr>
-        <w:t xml:space="preserve">一次</w:t>
-      </w:r>
-      <w:r>
-        <w:t xml:space="preserve"> chat </w:t>
-      </w:r>
-      <w:r>
-        <w:rPr>
-          <w:rFonts w:hint="eastAsia"/>
-        </w:rPr>
-        <w:t xml:space="preserve">同时产出</w:t>
-      </w:r>
-      <w:r>
-        <w:t xml:space="preserve"> summary + </w:t>
-      </w:r>
-      <w:r>
-        <w:rPr>
-          <w:rFonts w:hint="eastAsia"/>
-        </w:rPr>
-        <w:t xml:space="preserve">结构化(节省</w:t>
+        <w:t xml:space="preserve">summary </w:t>
+      </w:r>
+      <w:r>
+        <w:rPr>
+          <w:rFonts w:hint="eastAsia"/>
+        </w:rPr>
+        <w:t xml:space="preserve">是模板化纯文本(HR</w:t>
       </w:r>
       <w:r>
         <w:t xml:space="preserve"> </w:t>
@@ -3723,16 +4252,91 @@
         <w:rPr>
           <w:rFonts w:hint="eastAsia"/>
         </w:rPr>
-        <w:t xml:space="preserve">token,详见</w:t>
-      </w:r>
-      <w:r>
-        <w:t xml:space="preserve"> CLAUDE.md §1.1)</w:t>
+        <w:t xml:space="preserve">可读),包含教育/工作/项目/技能</w:t>
+      </w:r>
+      <w:r>
+        <w:t xml:space="preserve"> section</w:t>
       </w:r>
     </w:p>
-    <w:bookmarkEnd w:id="17"/>
-    <w:bookmarkStart w:id="18" w:name="a.2-jd-二次匹配评估"/>
     <w:p>
       <w:pPr>
+        <w:pStyle w:val="Compact"/>
+        <w:numPr>
+          <w:ilvl w:val="0"/>
+          <w:numId w:val="1004"/>
+        </w:numPr>
+      </w:pPr>
+      <w:r>
+        <w:t xml:space="preserve">PDF layout </w:t>
+      </w:r>
+      <w:r>
+        <w:rPr>
+          <w:rFonts w:hint="eastAsia"/>
+        </w:rPr>
+        <w:t xml:space="preserve">抽取用于解决多栏/表格/HR</w:t>
+      </w:r>
+      <w:r>
+        <w:t xml:space="preserve"> </w:t>
+      </w:r>
+      <w:r>
+        <w:rPr>
+          <w:rFonts w:hint="eastAsia"/>
+        </w:rPr>
+        <w:t xml:space="preserve">系统导出简历的文本乱序问题;Kimi</w:t>
+      </w:r>
+      <w:r>
+        <w:t xml:space="preserve"> Files API </w:t>
+      </w:r>
+      <w:r>
+        <w:rPr>
+          <w:rFonts w:hint="eastAsia"/>
+        </w:rPr>
+        <w:t xml:space="preserve">保留为扫描件</w:t>
+      </w:r>
+      <w:r>
+        <w:t xml:space="preserve"> OCR </w:t>
+      </w:r>
+      <w:r>
+        <w:rPr>
+          <w:rFonts w:hint="eastAsia"/>
+        </w:rPr>
+        <w:t xml:space="preserve">与</w:t>
+      </w:r>
+      <w:r>
+        <w:t xml:space="preserve"> DOC/DOCX/DOC fallback</w:t>
+      </w:r>
+    </w:p>
+    <w:p>
+      <w:pPr>
+        <w:pStyle w:val="Compact"/>
+        <w:numPr>
+          <w:ilvl w:val="0"/>
+          <w:numId w:val="1004"/>
+        </w:numPr>
+      </w:pPr>
+      <w:r>
+        <w:t xml:space="preserve">skills/experience/educationHistory </w:t>
+      </w:r>
+      <w:r>
+        <w:rPr>
+          <w:rFonts w:hint="eastAsia"/>
+        </w:rPr>
+        <w:t xml:space="preserve">是简历事实展示字段,不随</w:t>
+      </w:r>
+      <w:r>
+        <w:t xml:space="preserve"> JD </w:t>
+      </w:r>
+      <w:r>
+        <w:rPr>
+          <w:rFonts w:hint="eastAsia"/>
+        </w:rPr>
+        <w:t xml:space="preserve">切换而改写</w:t>
+      </w:r>
+    </w:p>
+    <w:bookmarkEnd w:id="18"/>
+    <w:bookmarkStart w:id="19" w:name="a.2-jd-二次匹配评估-matchagainstjob"/>
+    <w:p>
+      <w:pPr>
         <w:pStyle w:val="Heading2"/>
       </w:pPr>
       <w:r>
@@ -3743,6 +4347,526 @@
           <w:rFonts w:hint="eastAsia"/>
         </w:rPr>
         <w:t xml:space="preserve">二次匹配评估</w:t>
+      </w:r>
+      <w:r>
+        <w:t xml:space="preserve"> — matchAgainstJob</w:t>
+      </w:r>
+    </w:p>
+    <w:p>
+      <w:pPr>
+        <w:pStyle w:val="FirstParagraph"/>
+      </w:pPr>
+      <w:r>
+        <w:rPr>
+          <w:rFonts w:hint="eastAsia"/>
+          <w:b/>
+          <w:bCs/>
+        </w:rPr>
+        <w:t xml:space="preserve">只在关联</w:t>
+      </w:r>
+      <w:r>
+        <w:rPr>
+          <w:b/>
+          <w:bCs/>
+        </w:rPr>
+        <w:t xml:space="preserve"> JD </w:t>
+      </w:r>
+      <w:r>
+        <w:rPr>
+          <w:rFonts w:hint="eastAsia"/>
+          <w:b/>
+          <w:bCs/>
+        </w:rPr>
+        <w:t xml:space="preserve">时跑</w:t>
+      </w:r>
+      <w:r>
+        <w:t xml:space="preserve">(reparse </w:t>
+      </w:r>
+      <w:r>
+        <w:rPr>
+          <w:rFonts w:hint="eastAsia"/>
+        </w:rPr>
+        <w:t xml:space="preserve">前</w:t>
+      </w:r>
+      <w:r>
+        <w:t xml:space="preserve"> ReparseConfirmModal </w:t>
+      </w:r>
+      <w:r>
+        <w:rPr>
+          <w:rFonts w:hint="eastAsia"/>
+        </w:rPr>
+        <w:t xml:space="preserve">让用户先选/确认</w:t>
+      </w:r>
+      <w:r>
+        <w:t xml:space="preserve"> JD):</w:t>
+      </w:r>
+    </w:p>
+    <w:p>
+      <w:pPr>
+        <w:pStyle w:val="SourceCode"/>
+      </w:pPr>
+      <w:r>
+        <w:rPr>
+          <w:rStyle w:val="VerbatimChar"/>
+        </w:rPr>
+        <w:t xml:space="preserve">[ candidate.aiSummary + job.description ] -&gt; [ Kimi /v1/chat/completions ]</w:t>
+      </w:r>
+      <w:r>
+        <w:br/>
+      </w:r>
+      <w:r>
+        <w:rPr>
+          <w:rStyle w:val="VerbatimChar"/>
+        </w:rPr>
+        <w:t xml:space="preserve">        ↓</w:t>
+      </w:r>
+      <w:r>
+        <w:br/>
+      </w:r>
+      <w:r>
+        <w:rPr>
+          <w:rStyle w:val="VerbatimChar"/>
+        </w:rPr>
+        <w:t xml:space="preserve">[ jdMatch + risks/highlights + insights(up/down) ]</w:t>
+      </w:r>
+      <w:r>
+        <w:br/>
+      </w:r>
+      <w:r>
+        <w:rPr>
+          <w:rStyle w:val="VerbatimChar"/>
+        </w:rPr>
+        <w:t xml:space="preserve">[ + matchedFor / againstFor / aiSuggestedTags ]</w:t>
+      </w:r>
+      <w:r>
+        <w:br/>
+      </w:r>
+      <w:r>
+        <w:rPr>
+          <w:rStyle w:val="VerbatimChar"/>
+        </w:rPr>
+        <w:t xml:space="preserve">        ↓</w:t>
+      </w:r>
+      <w:r>
+        <w:br/>
+      </w:r>
+      <w:r>
+        <w:rPr>
+          <w:rStyle w:val="VerbatimChar"/>
+        </w:rPr>
+        <w:t xml:space="preserve">[ </w:t>
+      </w:r>
+      <w:r>
+        <w:rPr>
+          <w:rStyle w:val="VerbatimChar"/>
+          <w:rFonts w:hint="eastAsia"/>
+        </w:rPr>
+        <w:t xml:space="preserve">写入</w:t>
+      </w:r>
+      <w:r>
+        <w:rPr>
+          <w:rStyle w:val="VerbatimChar"/>
+        </w:rPr>
+        <w:t xml:space="preserve"> Candidate </w:t>
+      </w:r>
+      <w:r>
+        <w:rPr>
+          <w:rStyle w:val="VerbatimChar"/>
+          <w:rFonts w:hint="eastAsia"/>
+        </w:rPr>
+        <w:t xml:space="preserve">(只覆盖</w:t>
+      </w:r>
+      <w:r>
+        <w:rPr>
+          <w:rStyle w:val="VerbatimChar"/>
+        </w:rPr>
+        <w:t xml:space="preserve"> JD </w:t>
+      </w:r>
+      <w:r>
+        <w:rPr>
+          <w:rStyle w:val="VerbatimChar"/>
+          <w:rFonts w:hint="eastAsia"/>
+        </w:rPr>
+        <w:t xml:space="preserve">评估字段)</w:t>
+      </w:r>
+      <w:r>
+        <w:rPr>
+          <w:rStyle w:val="VerbatimChar"/>
+        </w:rPr>
+        <w:t xml:space="preserve"> ]</w:t>
+      </w:r>
+    </w:p>
+    <w:p>
+      <w:pPr>
+        <w:pStyle w:val="FirstParagraph"/>
+      </w:pPr>
+      <w:r>
+        <w:rPr>
+          <w:rFonts w:hint="eastAsia"/>
+        </w:rPr>
+        <w:t xml:space="preserve">设计要点:</w:t>
+      </w:r>
+      <w:r>
+        <w:t xml:space="preserve"> </w:t>
+      </w:r>
+      <w:r>
+        <w:t xml:space="preserve">- </w:t>
+      </w:r>
+      <w:r>
+        <w:rPr>
+          <w:rFonts w:hint="eastAsia"/>
+        </w:rPr>
+        <w:t xml:space="preserve">前端</w:t>
+      </w:r>
+      <w:r>
+        <w:t xml:space="preserve"> </w:t>
+      </w:r>
+      <w:r>
+        <w:rPr>
+          <w:rStyle w:val="VerbatimChar"/>
+        </w:rPr>
+        <w:t xml:space="preserve">MarkdownBullets</w:t>
+      </w:r>
+      <w:r>
+        <w:t xml:space="preserve"> </w:t>
+      </w:r>
+      <w:r>
+        <w:rPr>
+          <w:rFonts w:hint="eastAsia"/>
+        </w:rPr>
+        <w:t xml:space="preserve">组件渲染(split</w:t>
+      </w:r>
+      <w:r>
+        <w:t xml:space="preserve"> </w:t>
+      </w:r>
+      <w:r>
+        <w:t xml:space="preserve">“</w:t>
+      </w:r>
+      <w:r>
+        <w:t xml:space="preserve">”</w:t>
+      </w:r>
+      <w:r>
+        <w:t xml:space="preserve"> </w:t>
+      </w:r>
+      <w:r>
+        <w:t xml:space="preserve">+ </w:t>
+      </w:r>
+      <w:r>
+        <w:rPr>
+          <w:rFonts w:hint="eastAsia"/>
+        </w:rPr>
+        <w:t xml:space="preserve">去</w:t>
+      </w:r>
+      <w:r>
+        <w:t xml:space="preserve"> </w:t>
+      </w:r>
+      <w:r>
+        <w:rPr>
+          <w:rStyle w:val="VerbatimChar"/>
+        </w:rPr>
+        <w:t xml:space="preserve">-</w:t>
+      </w:r>
+      <w:r>
+        <w:t xml:space="preserve"> </w:t>
+      </w:r>
+      <w:r>
+        <w:rPr>
+          <w:rFonts w:hint="eastAsia"/>
+        </w:rPr>
+        <w:t xml:space="preserve">前缀</w:t>
+      </w:r>
+      <w:r>
+        <w:t xml:space="preserve"> → li)</w:t>
+      </w:r>
+      <w:r>
+        <w:t xml:space="preserve"> </w:t>
+      </w:r>
+      <w:r>
+        <w:t xml:space="preserve">- </w:t>
+      </w:r>
+      <w:r>
+        <w:rPr>
+          <w:rFonts w:hint="eastAsia"/>
+        </w:rPr>
+        <w:t xml:space="preserve">未产出简历事实字段时,这三个</w:t>
+      </w:r>
+      <w:r>
+        <w:t xml:space="preserve"> section </w:t>
+      </w:r>
+      <w:r>
+        <w:rPr>
+          <w:rFonts w:hint="eastAsia"/>
+        </w:rPr>
+        <w:t xml:space="preserve">显示「重新解析简历后自动生成」引导</w:t>
+      </w:r>
+      <w:r>
+        <w:t xml:space="preserve"> </w:t>
+      </w:r>
+      <w:r>
+        <w:t xml:space="preserve">- </w:t>
+      </w:r>
+      <w:r>
+        <w:rPr>
+          <w:rFonts w:hint="eastAsia"/>
+        </w:rPr>
+        <w:t xml:space="preserve">强</w:t>
+      </w:r>
+      <w:r>
+        <w:t xml:space="preserve"> </w:t>
+      </w:r>
+      <w:r>
+        <w:rPr>
+          <w:rFonts w:hint="eastAsia"/>
+        </w:rPr>
+        <w:t xml:space="preserve">prompt:禁用”可能/或许”含糊词,无强匹配点必须写”未发现”</w:t>
+      </w:r>
+      <w:r>
+        <w:t xml:space="preserve"> </w:t>
+      </w:r>
+      <w:r>
+        <w:t xml:space="preserve">- </w:t>
+      </w:r>
+      <w:r>
+        <w:rPr>
+          <w:rFonts w:hint="eastAsia"/>
+        </w:rPr>
+        <w:t xml:space="preserve">触发时机:Upload</w:t>
+      </w:r>
+      <w:r>
+        <w:t xml:space="preserve"> </w:t>
+      </w:r>
+      <w:r>
+        <w:rPr>
+          <w:rFonts w:hint="eastAsia"/>
+        </w:rPr>
+        <w:t xml:space="preserve">时关联</w:t>
+      </w:r>
+      <w:r>
+        <w:t xml:space="preserve"> JD </w:t>
+      </w:r>
+      <w:r>
+        <w:rPr>
+          <w:rFonts w:hint="eastAsia"/>
+        </w:rPr>
+        <w:t xml:space="preserve">自动跑;或</w:t>
+      </w:r>
+      <w:r>
+        <w:t xml:space="preserve"> ReparseConfirmModal </w:t>
+      </w:r>
+      <w:r>
+        <w:rPr>
+          <w:rFonts w:hint="eastAsia"/>
+        </w:rPr>
+        <w:t xml:space="preserve">用户切</w:t>
+      </w:r>
+      <w:r>
+        <w:t xml:space="preserve"> JD </w:t>
+      </w:r>
+      <w:r>
+        <w:rPr>
+          <w:rFonts w:hint="eastAsia"/>
+        </w:rPr>
+        <w:t xml:space="preserve">时跑;或</w:t>
+      </w:r>
+      <w:r>
+        <w:t xml:space="preserve"> </w:t>
+      </w:r>
+      <w:r>
+        <w:rPr>
+          <w:rStyle w:val="VerbatimChar"/>
+        </w:rPr>
+        <w:t xml:space="preserve">POST /api/resumes/match</w:t>
+      </w:r>
+      <w:r>
+        <w:t xml:space="preserve"> </w:t>
+      </w:r>
+      <w:r>
+        <w:rPr>
+          <w:rFonts w:hint="eastAsia"/>
+        </w:rPr>
+        <w:t xml:space="preserve">显式</w:t>
+      </w:r>
+      <w:r>
+        <w:t xml:space="preserve"> sync </w:t>
+      </w:r>
+      <w:r>
+        <w:rPr>
+          <w:rFonts w:hint="eastAsia"/>
+        </w:rPr>
+        <w:t xml:space="preserve">调用</w:t>
+      </w:r>
+    </w:p>
+    <w:bookmarkEnd w:id="19"/>
+    <w:bookmarkStart w:id="20" w:name="a.3-分享给招聘官公开页-sharetoken"/>
+    <w:p>
+      <w:pPr>
+        <w:pStyle w:val="Heading2"/>
+      </w:pPr>
+      <w:r>
+        <w:t xml:space="preserve">5A.3 </w:t>
+      </w:r>
+      <w:r>
+        <w:rPr>
+          <w:rFonts w:hint="eastAsia"/>
+        </w:rPr>
+        <w:t xml:space="preserve">分享给招聘官(公开页</w:t>
+      </w:r>
+      <w:r>
+        <w:t xml:space="preserve"> </w:t>
+      </w:r>
+      <w:r>
+        <w:rPr>
+          <w:rStyle w:val="VerbatimChar"/>
+        </w:rPr>
+        <w:t xml:space="preserve">/share/&lt;token&gt;</w:t>
+      </w:r>
+      <w:r>
+        <w:t xml:space="preserve">)</w:t>
+      </w:r>
+    </w:p>
+    <w:p>
+      <w:pPr>
+        <w:pStyle w:val="SourceCode"/>
+      </w:pPr>
+      <w:r>
+        <w:rPr>
+          <w:rStyle w:val="VerbatimChar"/>
+        </w:rPr>
+        <w:t xml:space="preserve">[ admin </w:t>
+      </w:r>
+      <w:r>
+        <w:rPr>
+          <w:rStyle w:val="VerbatimChar"/>
+          <w:rFonts w:hint="eastAsia"/>
+        </w:rPr>
+        <w:t xml:space="preserve">创建</w:t>
+      </w:r>
+      <w:r>
+        <w:rPr>
+          <w:rStyle w:val="VerbatimChar"/>
+        </w:rPr>
+        <w:t xml:space="preserve"> ShareLink ] -&gt; [ 32 </w:t>
+      </w:r>
+      <w:r>
+        <w:rPr>
+          <w:rStyle w:val="VerbatimChar"/>
+          <w:rFonts w:hint="eastAsia"/>
+        </w:rPr>
+        <w:t xml:space="preserve">字符</w:t>
+      </w:r>
+      <w:r>
+        <w:rPr>
+          <w:rStyle w:val="VerbatimChar"/>
+        </w:rPr>
+        <w:t xml:space="preserve"> URL-safe token ]</w:t>
+      </w:r>
+      <w:r>
+        <w:br/>
+      </w:r>
+      <w:r>
+        <w:rPr>
+          <w:rStyle w:val="VerbatimChar"/>
+        </w:rPr>
+        <w:t xml:space="preserve">        ↓</w:t>
+      </w:r>
+      <w:r>
+        <w:br/>
+      </w:r>
+      <w:r>
+        <w:rPr>
+          <w:rStyle w:val="VerbatimChar"/>
+        </w:rPr>
+        <w:t xml:space="preserve">[ </w:t>
+      </w:r>
+      <w:r>
+        <w:rPr>
+          <w:rStyle w:val="VerbatimChar"/>
+          <w:rFonts w:hint="eastAsia"/>
+        </w:rPr>
+        <w:t xml:space="preserve">公开页</w:t>
+      </w:r>
+      <w:r>
+        <w:rPr>
+          <w:rStyle w:val="VerbatimChar"/>
+        </w:rPr>
+        <w:t xml:space="preserve"> /share/:token ] -&gt; [ GET /api/public/share/:token ]</w:t>
+      </w:r>
+      <w:r>
+        <w:br/>
+      </w:r>
+      <w:r>
+        <w:rPr>
+          <w:rStyle w:val="VerbatimChar"/>
+        </w:rPr>
+        <w:t xml:space="preserve">        ↓ </w:t>
+      </w:r>
+      <w:r>
+        <w:rPr>
+          <w:rStyle w:val="VerbatimChar"/>
+          <w:rFonts w:hint="eastAsia"/>
+        </w:rPr>
+        <w:t xml:space="preserve">(按</w:t>
+      </w:r>
+      <w:r>
+        <w:rPr>
+          <w:rStyle w:val="VerbatimChar"/>
+        </w:rPr>
+        <w:t xml:space="preserve"> ShareLink.showContact/showAttachments </w:t>
+      </w:r>
+      <w:r>
+        <w:rPr>
+          <w:rStyle w:val="VerbatimChar"/>
+          <w:rFonts w:hint="eastAsia"/>
+        </w:rPr>
+        <w:t xml:space="preserve">应用可见性)</w:t>
+      </w:r>
+      <w:r>
+        <w:br/>
+      </w:r>
+      <w:r>
+        <w:rPr>
+          <w:rStyle w:val="VerbatimChar"/>
+        </w:rPr>
+        <w:t xml:space="preserve">[ </w:t>
+      </w:r>
+      <w:r>
+        <w:rPr>
+          <w:rStyle w:val="VerbatimChar"/>
+          <w:rFonts w:hint="eastAsia"/>
+        </w:rPr>
+        <w:t xml:space="preserve">只读</w:t>
+      </w:r>
+      <w:r>
+        <w:rPr>
+          <w:rStyle w:val="VerbatimChar"/>
+        </w:rPr>
+        <w:t xml:space="preserve"> </w:t>
+      </w:r>
+      <w:r>
+        <w:rPr>
+          <w:rStyle w:val="VerbatimChar"/>
+          <w:rFonts w:hint="eastAsia"/>
+        </w:rPr>
+        <w:t xml:space="preserve">候选人视图</w:t>
+      </w:r>
+      <w:r>
+        <w:rPr>
+          <w:rStyle w:val="VerbatimChar"/>
+        </w:rPr>
+        <w:t xml:space="preserve"> + </w:t>
+      </w:r>
+      <w:r>
+        <w:rPr>
+          <w:rStyle w:val="VerbatimChar"/>
+          <w:rFonts w:hint="eastAsia"/>
+        </w:rPr>
+        <w:t xml:space="preserve">评价</w:t>
+      </w:r>
+      <w:r>
+        <w:rPr>
+          <w:rStyle w:val="VerbatimChar"/>
+        </w:rPr>
+        <w:t xml:space="preserve"> ]</w:t>
       </w:r>
     </w:p>
     <w:p>
@@ -3757,34 +4881,16 @@
         <w:rPr>
           <w:rFonts w:hint="eastAsia"/>
         </w:rPr>
-        <w:t xml:space="preserve">用</w:t>
-      </w:r>
-      <w:r>
-        <w:t xml:space="preserve"> candidate.aiSummary + job.description </w:t>
-      </w:r>
-      <w:r>
-        <w:rPr>
-          <w:rFonts w:hint="eastAsia"/>
-        </w:rPr>
-        <w:t xml:space="preserve">调</w:t>
-      </w:r>
-      <w:r>
-        <w:t xml:space="preserve"> Kimi </w:t>
-      </w:r>
-      <w:r>
-        <w:rPr>
-          <w:rFonts w:hint="eastAsia"/>
-        </w:rPr>
-        <w:t xml:space="preserve">输出</w:t>
-      </w:r>
-      <w:r>
-        <w:t xml:space="preserve"> </w:t>
-      </w:r>
-      <w:r>
-        <w:rPr>
-          <w:rStyle w:val="VerbatimChar"/>
-        </w:rPr>
-        <w:t xml:space="preserve">{ jdMatch, risks, highlights, matchReason }</w:t>
+        <w:t xml:space="preserve">有效期:60s</w:t>
+      </w:r>
+      <w:r>
+        <w:t xml:space="preserve"> ~ 30d / </w:t>
+      </w:r>
+      <w:r>
+        <w:rPr>
+          <w:rFonts w:hint="eastAsia"/>
+        </w:rPr>
+        <w:t xml:space="preserve">无限期</w:t>
       </w:r>
     </w:p>
     <w:p>
@@ -3799,7 +4905,7 @@
         <w:rPr>
           <w:rFonts w:hint="eastAsia"/>
         </w:rPr>
-        <w:t xml:space="preserve">触发时机:Upload</w:t>
+        <w:t xml:space="preserve">访问次数上限:可选</w:t>
       </w:r>
       <w:r>
         <w:t xml:space="preserve"> </w:t>
@@ -3808,34 +4914,16 @@
         <w:rPr>
           <w:rFonts w:hint="eastAsia"/>
         </w:rPr>
-        <w:t xml:space="preserve">时关联</w:t>
-      </w:r>
-      <w:r>
-        <w:t xml:space="preserve"> JD </w:t>
-      </w:r>
-      <w:r>
-        <w:rPr>
-          <w:rFonts w:hint="eastAsia"/>
-        </w:rPr>
-        <w:t xml:space="preserve">自动触发;或详情页</w:t>
-      </w:r>
-      <w:r>
-        <w:t xml:space="preserve"> MatchRing </w:t>
-      </w:r>
-      <w:r>
-        <w:rPr>
-          <w:rFonts w:hint="eastAsia"/>
-        </w:rPr>
-        <w:t xml:space="preserve">点击换</w:t>
-      </w:r>
-      <w:r>
-        <w:t xml:space="preserve"> JD </w:t>
-      </w:r>
-      <w:r>
-        <w:rPr>
-          <w:rFonts w:hint="eastAsia"/>
-        </w:rPr>
-        <w:t xml:space="preserve">触发</w:t>
+        <w:t xml:space="preserve">10/50/100/自定义</w:t>
+      </w:r>
+      <w:r>
+        <w:t xml:space="preserve"> </w:t>
+      </w:r>
+      <w:r>
+        <w:rPr>
+          <w:rFonts w:hint="eastAsia"/>
+        </w:rPr>
+        <w:t xml:space="preserve">1-9999/不限</w:t>
       </w:r>
     </w:p>
     <w:p>
@@ -3850,182 +4938,138 @@
         <w:rPr>
           <w:rFonts w:hint="eastAsia"/>
         </w:rPr>
-        <w:t xml:space="preserve">强</w:t>
-      </w:r>
-      <w:r>
-        <w:t xml:space="preserve"> </w:t>
-      </w:r>
-      <w:r>
-        <w:rPr>
-          <w:rFonts w:hint="eastAsia"/>
-        </w:rPr>
-        <w:t xml:space="preserve">prompt:禁用”可能/或许”含糊词,无强匹配点必须写”未发现”</w:t>
-      </w:r>
-    </w:p>
-    <w:bookmarkEnd w:id="18"/>
-    <w:bookmarkStart w:id="19" w:name="a.3-分享给招聘官公开页-sharetoken"/>
-    <w:p>
-      <w:pPr>
-        <w:pStyle w:val="Heading2"/>
-      </w:pPr>
-      <w:r>
-        <w:t xml:space="preserve">5A.3 </w:t>
-      </w:r>
-      <w:r>
-        <w:rPr>
-          <w:rFonts w:hint="eastAsia"/>
-        </w:rPr>
-        <w:t xml:space="preserve">分享给招聘官(公开页</w:t>
-      </w:r>
-      <w:r>
-        <w:t xml:space="preserve"> </w:t>
-      </w:r>
-      <w:r>
-        <w:rPr>
-          <w:rStyle w:val="VerbatimChar"/>
-        </w:rPr>
-        <w:t xml:space="preserve">/share/&lt;token&gt;</w:t>
-      </w:r>
-      <w:r>
-        <w:t xml:space="preserve">)</w:t>
+        <w:t xml:space="preserve">可见性</w:t>
+      </w:r>
+      <w:r>
+        <w:t xml:space="preserve"> toggle:</w:t>
       </w:r>
     </w:p>
     <w:p>
       <w:pPr>
-        <w:pStyle w:val="SourceCode"/>
-      </w:pPr>
-      <w:r>
-        <w:rPr>
-          <w:rStyle w:val="VerbatimChar"/>
-        </w:rPr>
-        <w:t xml:space="preserve">[ admin </w:t>
-      </w:r>
-      <w:r>
-        <w:rPr>
-          <w:rStyle w:val="VerbatimChar"/>
-          <w:rFonts w:hint="eastAsia"/>
-        </w:rPr>
-        <w:t xml:space="preserve">创建</w:t>
-      </w:r>
-      <w:r>
-        <w:rPr>
-          <w:rStyle w:val="VerbatimChar"/>
-        </w:rPr>
-        <w:t xml:space="preserve"> ShareLink ] -&gt; [ 32 </w:t>
-      </w:r>
-      <w:r>
-        <w:rPr>
-          <w:rStyle w:val="VerbatimChar"/>
-          <w:rFonts w:hint="eastAsia"/>
-        </w:rPr>
-        <w:t xml:space="preserve">字符</w:t>
-      </w:r>
-      <w:r>
-        <w:rPr>
-          <w:rStyle w:val="VerbatimChar"/>
-        </w:rPr>
-        <w:t xml:space="preserve"> URL-safe token ]</w:t>
-      </w:r>
-      <w:r>
-        <w:br/>
-      </w:r>
-      <w:r>
-        <w:rPr>
-          <w:rStyle w:val="VerbatimChar"/>
-        </w:rPr>
-        <w:t xml:space="preserve">        ↓</w:t>
-      </w:r>
-      <w:r>
-        <w:br/>
-      </w:r>
-      <w:r>
-        <w:rPr>
-          <w:rStyle w:val="VerbatimChar"/>
-        </w:rPr>
-        <w:t xml:space="preserve">[ </w:t>
-      </w:r>
-      <w:r>
-        <w:rPr>
-          <w:rStyle w:val="VerbatimChar"/>
-          <w:rFonts w:hint="eastAsia"/>
-        </w:rPr>
-        <w:t xml:space="preserve">公开页</w:t>
-      </w:r>
-      <w:r>
-        <w:rPr>
-          <w:rStyle w:val="VerbatimChar"/>
-        </w:rPr>
-        <w:t xml:space="preserve"> /share/:token ] -&gt; [ GET /api/public/share/:token ]</w:t>
-      </w:r>
-      <w:r>
-        <w:br/>
-      </w:r>
-      <w:r>
-        <w:rPr>
-          <w:rStyle w:val="VerbatimChar"/>
-        </w:rPr>
-        <w:t xml:space="preserve">        ↓ (phone/email </w:t>
-      </w:r>
-      <w:r>
-        <w:rPr>
-          <w:rStyle w:val="VerbatimChar"/>
-          <w:rFonts w:hint="eastAsia"/>
-        </w:rPr>
-        <w:t xml:space="preserve">自动</w:t>
-      </w:r>
-      <w:r>
-        <w:rPr>
-          <w:rStyle w:val="VerbatimChar"/>
-        </w:rPr>
-        <w:t xml:space="preserve"> mask)</w:t>
-      </w:r>
-      <w:r>
-        <w:br/>
-      </w:r>
-      <w:r>
-        <w:rPr>
-          <w:rStyle w:val="VerbatimChar"/>
-        </w:rPr>
-        <w:t xml:space="preserve">[ </w:t>
-      </w:r>
-      <w:r>
-        <w:rPr>
-          <w:rStyle w:val="VerbatimChar"/>
-          <w:rFonts w:hint="eastAsia"/>
-        </w:rPr>
-        <w:t xml:space="preserve">只读</w:t>
-      </w:r>
-      <w:r>
-        <w:rPr>
-          <w:rStyle w:val="VerbatimChar"/>
-        </w:rPr>
+        <w:pStyle w:val="Compact"/>
+        <w:numPr>
+          <w:ilvl w:val="1"/>
+          <w:numId w:val="1006"/>
+        </w:numPr>
+      </w:pPr>
+      <w:r>
+        <w:rPr>
+          <w:rStyle w:val="VerbatimChar"/>
+        </w:rPr>
+        <w:t xml:space="preserve">showContact</w:t>
+      </w:r>
+      <w:r>
         <w:t xml:space="preserve"> </w:t>
       </w:r>
       <w:r>
         <w:rPr>
-          <w:rStyle w:val="VerbatimChar"/>
-          <w:rFonts w:hint="eastAsia"/>
-        </w:rPr>
-        <w:t xml:space="preserve">候选人视图</w:t>
-      </w:r>
-      <w:r>
-        <w:rPr>
-          <w:rStyle w:val="VerbatimChar"/>
-        </w:rPr>
+          <w:rFonts w:hint="eastAsia"/>
+        </w:rPr>
+        <w:t xml:space="preserve">默认</w:t>
+      </w:r>
+      <w:r>
+        <w:t xml:space="preserve"> true → phone/email</w:t>
+      </w:r>
+      <w:r>
+        <w:t xml:space="preserve"> </w:t>
+      </w:r>
+      <w:r>
+        <w:rPr>
+          <w:rFonts w:hint="eastAsia"/>
+          <w:b/>
+          <w:bCs/>
+        </w:rPr>
+        <w:t xml:space="preserve">完整展示</w:t>
+      </w:r>
+      <w:r>
+        <w:rPr>
+          <w:rFonts w:hint="eastAsia"/>
+        </w:rPr>
+        <w:t xml:space="preserve">(招聘需真号);false</w:t>
+      </w:r>
+      <w:r>
+        <w:t xml:space="preserve"> → </w:t>
+      </w:r>
+      <w:r>
+        <w:rPr>
+          <w:rFonts w:hint="eastAsia"/>
+        </w:rPr>
+        <w:t xml:space="preserve">不返回</w:t>
+      </w:r>
+      <w:r>
         <w:t xml:space="preserve"> + </w:t>
       </w:r>
       <w:r>
         <w:rPr>
-          <w:rStyle w:val="VerbatimChar"/>
-          <w:rFonts w:hint="eastAsia"/>
-        </w:rPr>
-        <w:t xml:space="preserve">评价</w:t>
-      </w:r>
-      <w:r>
-        <w:rPr>
-          <w:rStyle w:val="VerbatimChar"/>
-        </w:rPr>
-        <w:t xml:space="preserve"> ]</w:t>
+          <w:rFonts w:hint="eastAsia"/>
+        </w:rPr>
+        <w:t xml:space="preserve">简报联系方式行抹成「[已隐藏]」</w:t>
+      </w:r>
+    </w:p>
+    <w:p>
+      <w:pPr>
+        <w:pStyle w:val="Compact"/>
+        <w:numPr>
+          <w:ilvl w:val="1"/>
+          <w:numId w:val="1006"/>
+        </w:numPr>
+      </w:pPr>
+      <w:r>
+        <w:rPr>
+          <w:rStyle w:val="VerbatimChar"/>
+        </w:rPr>
+        <w:t xml:space="preserve">showResume</w:t>
+      </w:r>
+      <w:r>
+        <w:t xml:space="preserve"> </w:t>
+      </w:r>
+      <w:r>
+        <w:t xml:space="preserve">/</w:t>
+      </w:r>
+      <w:r>
+        <w:t xml:space="preserve"> </w:t>
+      </w:r>
+      <w:r>
+        <w:rPr>
+          <w:rStyle w:val="VerbatimChar"/>
+        </w:rPr>
+        <w:t xml:space="preserve">showAttachments</w:t>
+      </w:r>
+      <w:r>
+        <w:t xml:space="preserve"> </w:t>
+      </w:r>
+      <w:r>
+        <w:t xml:space="preserve">/</w:t>
+      </w:r>
+      <w:r>
+        <w:t xml:space="preserve"> </w:t>
+      </w:r>
+      <w:r>
+        <w:rPr>
+          <w:rStyle w:val="VerbatimChar"/>
+        </w:rPr>
+        <w:t xml:space="preserve">showNotes</w:t>
+      </w:r>
+      <w:r>
+        <w:t xml:space="preserve"> </w:t>
+      </w:r>
+      <w:r>
+        <w:t xml:space="preserve">/ </w:t>
+      </w:r>
+      <w:r>
+        <w:rPr>
+          <w:rFonts w:hint="eastAsia"/>
+        </w:rPr>
+        <w:t xml:space="preserve">面试评价相关开关</w:t>
+      </w:r>
+      <w:r>
+        <w:t xml:space="preserve"> · </w:t>
+      </w:r>
+      <w:r>
+        <w:rPr>
+          <w:rFonts w:hint="eastAsia"/>
+        </w:rPr>
+        <w:t xml:space="preserve">洞察始终可见</w:t>
       </w:r>
     </w:p>
     <w:p>
@@ -4033,23 +5077,209 @@
         <w:pStyle w:val="Compact"/>
         <w:numPr>
           <w:ilvl w:val="0"/>
-          <w:numId w:val="1006"/>
+          <w:numId w:val="1005"/>
         </w:numPr>
       </w:pPr>
       <w:r>
         <w:rPr>
           <w:rFonts w:hint="eastAsia"/>
         </w:rPr>
-        <w:t xml:space="preserve">有效期:60s</w:t>
-      </w:r>
-      <w:r>
-        <w:t xml:space="preserve"> ~ 30d / </w:t>
-      </w:r>
-      <w:r>
-        <w:rPr>
-          <w:rFonts w:hint="eastAsia"/>
-        </w:rPr>
-        <w:t xml:space="preserve">无限期</w:t>
+        <w:t xml:space="preserve">公开页不在</w:t>
+      </w:r>
+      <w:r>
+        <w:t xml:space="preserve"> AuthGuard </w:t>
+      </w:r>
+      <w:r>
+        <w:rPr>
+          <w:rFonts w:hint="eastAsia"/>
+        </w:rPr>
+        <w:t xml:space="preserve">内,</w:t>
+      </w:r>
+      <w:r>
+        <w:rPr>
+          <w:rFonts w:hint="eastAsia"/>
+          <w:b/>
+          <w:bCs/>
+        </w:rPr>
+        <w:t xml:space="preserve">不含</w:t>
+      </w:r>
+      <w:r>
+        <w:rPr>
+          <w:b/>
+          <w:bCs/>
+        </w:rPr>
+        <w:t xml:space="preserve"> Sidebar/Topbar</w:t>
+      </w:r>
+    </w:p>
+    <w:bookmarkEnd w:id="20"/>
+    <w:bookmarkStart w:id="21" w:name="a.4-评价对话系统"/>
+    <w:p>
+      <w:pPr>
+        <w:pStyle w:val="Heading2"/>
+      </w:pPr>
+      <w:r>
+        <w:t xml:space="preserve">5A.4 </w:t>
+      </w:r>
+      <w:r>
+        <w:rPr>
+          <w:rFonts w:hint="eastAsia"/>
+        </w:rPr>
+        <w:t xml:space="preserve">评价对话系统</w:t>
+      </w:r>
+    </w:p>
+    <w:p>
+      <w:pPr>
+        <w:pStyle w:val="FirstParagraph"/>
+      </w:pPr>
+      <w:r>
+        <w:rPr>
+          <w:rFonts w:hint="eastAsia"/>
+        </w:rPr>
+        <w:t xml:space="preserve">完整功能:写评价</w:t>
+      </w:r>
+      <w:r>
+        <w:t xml:space="preserve"> / 1 </w:t>
+      </w:r>
+      <w:r>
+        <w:rPr>
+          <w:rFonts w:hint="eastAsia"/>
+        </w:rPr>
+        <w:t xml:space="preserve">级嵌套回复</w:t>
+      </w:r>
+      <w:r>
+        <w:t xml:space="preserve"> / </w:t>
+      </w:r>
+      <w:r>
+        <w:rPr>
+          <w:rFonts w:hint="eastAsia"/>
+        </w:rPr>
+        <w:t xml:space="preserve">多选批量回复</w:t>
+      </w:r>
+      <w:r>
+        <w:t xml:space="preserve"> · </w:t>
+      </w:r>
+      <w:r>
+        <w:rPr>
+          <w:rFonts w:hint="eastAsia"/>
+        </w:rPr>
+        <w:t xml:space="preserve">附件</w:t>
+      </w:r>
+      <w:r>
+        <w:t xml:space="preserve"> · </w:t>
+      </w:r>
+      <w:r>
+        <w:rPr>
+          <w:rFonts w:hint="eastAsia"/>
+        </w:rPr>
+        <w:t xml:space="preserve">投票</w:t>
+      </w:r>
+      <w:r>
+        <w:t xml:space="preserve"> · </w:t>
+      </w:r>
+      <w:r>
+        <w:rPr>
+          <w:rFonts w:hint="eastAsia"/>
+        </w:rPr>
+        <w:t xml:space="preserve">可见范围</w:t>
+      </w:r>
+      <w:r>
+        <w:t xml:space="preserve"> · </w:t>
+      </w:r>
+      <w:r>
+        <w:rPr>
+          <w:rFonts w:hint="eastAsia"/>
+        </w:rPr>
+        <w:t xml:space="preserve">软删除审核</w:t>
+      </w:r>
+      <w:r>
+        <w:t xml:space="preserve"> · Notification + </w:t>
+      </w:r>
+      <w:r>
+        <w:rPr>
+          <w:rFonts w:hint="eastAsia"/>
+        </w:rPr>
+        <w:t xml:space="preserve">音效。</w:t>
+      </w:r>
+    </w:p>
+    <w:bookmarkEnd w:id="21"/>
+    <w:bookmarkStart w:id="22" w:name="a.5-员工绩效评价2026-07"/>
+    <w:p>
+      <w:pPr>
+        <w:pStyle w:val="Heading2"/>
+      </w:pPr>
+      <w:r>
+        <w:t xml:space="preserve">5A.5 </w:t>
+      </w:r>
+      <w:r>
+        <w:rPr>
+          <w:rFonts w:hint="eastAsia"/>
+        </w:rPr>
+        <w:t xml:space="preserve">员工绩效评价(2026-07)</w:t>
+      </w:r>
+    </w:p>
+    <w:p>
+      <w:pPr>
+        <w:pStyle w:val="FirstParagraph"/>
+      </w:pPr>
+      <w:r>
+        <w:rPr>
+          <w:rFonts w:hint="eastAsia"/>
+        </w:rPr>
+        <w:t xml:space="preserve">管理页</w:t>
+      </w:r>
+      <w:r>
+        <w:t xml:space="preserve"> </w:t>
+      </w:r>
+      <w:r>
+        <w:rPr>
+          <w:rStyle w:val="VerbatimChar"/>
+        </w:rPr>
+        <w:t xml:space="preserve">/performance</w:t>
+      </w:r>
+      <w:r>
+        <w:t xml:space="preserve"> </w:t>
+      </w:r>
+      <w:r>
+        <w:t xml:space="preserve">· </w:t>
+      </w:r>
+      <w:r>
+        <w:rPr>
+          <w:rFonts w:hint="eastAsia"/>
+        </w:rPr>
+        <w:t xml:space="preserve">公开页</w:t>
+      </w:r>
+      <w:r>
+        <w:t xml:space="preserve"> </w:t>
+      </w:r>
+      <w:r>
+        <w:rPr>
+          <w:rStyle w:val="VerbatimChar"/>
+        </w:rPr>
+        <w:t xml:space="preserve">/performance-eval/:token</w:t>
+      </w:r>
+      <w:r>
+        <w:t xml:space="preserve"> </w:t>
+      </w:r>
+      <w:r>
+        <w:t xml:space="preserve">· </w:t>
+      </w:r>
+      <w:r>
+        <w:rPr>
+          <w:rFonts w:hint="eastAsia"/>
+        </w:rPr>
+        <w:t xml:space="preserve">权限</w:t>
+      </w:r>
+      <w:r>
+        <w:t xml:space="preserve"> </w:t>
+      </w:r>
+      <w:r>
+        <w:rPr>
+          <w:rStyle w:val="VerbatimChar"/>
+        </w:rPr>
+        <w:t xml:space="preserve">pageKey=performance</w:t>
+      </w:r>
+      <w:r>
+        <w:t xml:space="preserve">。</w:t>
       </w:r>
     </w:p>
     <w:p>
@@ -4057,14 +5287,14 @@
         <w:pStyle w:val="Compact"/>
         <w:numPr>
           <w:ilvl w:val="0"/>
-          <w:numId w:val="1006"/>
+          <w:numId w:val="1007"/>
         </w:numPr>
       </w:pPr>
       <w:r>
         <w:rPr>
           <w:rFonts w:hint="eastAsia"/>
         </w:rPr>
-        <w:t xml:space="preserve">访问次数上限:可选</w:t>
+        <w:t xml:space="preserve">双角色链接(自评/主管)+</w:t>
       </w:r>
       <w:r>
         <w:t xml:space="preserve"> </w:t>
@@ -4072,17 +5302,28 @@
       <w:r>
         <w:rPr>
           <w:rFonts w:hint="eastAsia"/>
-        </w:rPr>
-        <w:t xml:space="preserve">10/50/100/自定义</w:t>
-      </w:r>
-      <w:r>
-        <w:t xml:space="preserve"> </w:t>
-      </w:r>
-      <w:r>
-        <w:rPr>
-          <w:rFonts w:hint="eastAsia"/>
-        </w:rPr>
-        <w:t xml:space="preserve">1-9999/不限</w:t>
+          <w:b/>
+          <w:bCs/>
+        </w:rPr>
+        <w:t xml:space="preserve">访问密钥第二因子</w:t>
+      </w:r>
+      <w:r>
+        <w:t xml:space="preserve">(bcrypt + AES </w:t>
+      </w:r>
+      <w:r>
+        <w:rPr>
+          <w:rFonts w:hint="eastAsia"/>
+        </w:rPr>
+        <w:t xml:space="preserve">回显</w:t>
+      </w:r>
+      <w:r>
+        <w:t xml:space="preserve"> · </w:t>
+      </w:r>
+      <w:r>
+        <w:rPr>
+          <w:rFonts w:hint="eastAsia"/>
+        </w:rPr>
+        <w:t xml:space="preserve">失败锁定)</w:t>
       </w:r>
     </w:p>
     <w:p>
@@ -4090,23 +5331,204 @@
         <w:pStyle w:val="Compact"/>
         <w:numPr>
           <w:ilvl w:val="0"/>
-          <w:numId w:val="1006"/>
+          <w:numId w:val="1007"/>
         </w:numPr>
       </w:pPr>
       <w:r>
-        <w:rPr>
-          <w:rFonts w:hint="eastAsia"/>
-        </w:rPr>
-        <w:t xml:space="preserve">公开页不在</w:t>
-      </w:r>
-      <w:r>
-        <w:t xml:space="preserve"> AuthGuard </w:t>
-      </w:r>
-      <w:r>
-        <w:rPr>
-          <w:rFonts w:hint="eastAsia"/>
-        </w:rPr>
-        <w:t xml:space="preserve">内,</w:t>
+        <w:t xml:space="preserve">7 </w:t>
+      </w:r>
+      <w:r>
+        <w:rPr>
+          <w:rFonts w:hint="eastAsia"/>
+        </w:rPr>
+        <w:t xml:space="preserve">维评分</w:t>
+      </w:r>
+      <w:r>
+        <w:t xml:space="preserve"> · </w:t>
+      </w:r>
+      <w:r>
+        <w:rPr>
+          <w:rFonts w:hint="eastAsia"/>
+        </w:rPr>
+        <w:t xml:space="preserve">签字必填</w:t>
+      </w:r>
+      <w:r>
+        <w:t xml:space="preserve"> · v2 </w:t>
+      </w:r>
+      <w:r>
+        <w:rPr>
+          <w:rFonts w:hint="eastAsia"/>
+        </w:rPr>
+        <w:t xml:space="preserve">中英双语</w:t>
+      </w:r>
+      <w:r>
+        <w:t xml:space="preserve"> Excel · HR </w:t>
+      </w:r>
+      <w:r>
+        <w:rPr>
+          <w:rFonts w:hint="eastAsia"/>
+        </w:rPr>
+        <w:t xml:space="preserve">电子章可选嵌入</w:t>
+      </w:r>
+    </w:p>
+    <w:p>
+      <w:pPr>
+        <w:pStyle w:val="Compact"/>
+        <w:numPr>
+          <w:ilvl w:val="0"/>
+          <w:numId w:val="1007"/>
+        </w:numPr>
+      </w:pPr>
+      <w:r>
+        <w:rPr>
+          <w:rFonts w:hint="eastAsia"/>
+        </w:rPr>
+        <w:t xml:space="preserve">批量发起</w:t>
+      </w:r>
+      <w:r>
+        <w:t xml:space="preserve"> / </w:t>
+      </w:r>
+      <w:r>
+        <w:rPr>
+          <w:rFonts w:hint="eastAsia"/>
+        </w:rPr>
+        <w:t xml:space="preserve">密钥预览导出</w:t>
+      </w:r>
+      <w:r>
+        <w:t xml:space="preserve"> · </w:t>
+      </w:r>
+      <w:r>
+        <w:rPr>
+          <w:rFonts w:hint="eastAsia"/>
+        </w:rPr>
+        <w:t xml:space="preserve">详见</w:t>
+      </w:r>
+      <w:r>
+        <w:t xml:space="preserve"> </w:t>
+      </w:r>
+      <w:hyperlink r:id="rId16">
+        <w:r>
+          <w:rPr>
+            <w:rStyle w:val="VerbatimChar"/>
+          </w:rPr>
+          <w:t xml:space="preserve">06_performance_evaluation.md</w:t>
+        </w:r>
+      </w:hyperlink>
+      <w:r>
+        <w:t xml:space="preserve"> </w:t>
+      </w:r>
+      <w:r>
+        <w:rPr>
+          <w:rFonts w:hint="eastAsia"/>
+        </w:rPr>
+        <w:t xml:space="preserve">与</w:t>
+      </w:r>
+      <w:r>
+        <w:t xml:space="preserve"> API §18</w:t>
+      </w:r>
+    </w:p>
+    <w:bookmarkEnd w:id="22"/>
+    <w:bookmarkStart w:id="24" w:name="a.6-飞书简历自动入库第-6-容器"/>
+    <w:p>
+      <w:pPr>
+        <w:pStyle w:val="Heading2"/>
+      </w:pPr>
+      <w:r>
+        <w:t xml:space="preserve">5A.6 </w:t>
+      </w:r>
+      <w:r>
+        <w:rPr>
+          <w:rFonts w:hint="eastAsia"/>
+        </w:rPr>
+        <w:t xml:space="preserve">飞书简历自动入库(第</w:t>
+      </w:r>
+      <w:r>
+        <w:t xml:space="preserve"> 6 </w:t>
+      </w:r>
+      <w:r>
+        <w:rPr>
+          <w:rFonts w:hint="eastAsia"/>
+        </w:rPr>
+        <w:t xml:space="preserve">容器)</w:t>
+      </w:r>
+    </w:p>
+    <w:p>
+      <w:pPr>
+        <w:pStyle w:val="FirstParagraph"/>
+      </w:pPr>
+      <w:r>
+        <w:rPr>
+          <w:rStyle w:val="VerbatimChar"/>
+        </w:rPr>
+        <w:t xml:space="preserve">lark-ingest</w:t>
+      </w:r>
+      <w:r>
+        <w:t xml:space="preserve"> </w:t>
+      </w:r>
+      <w:r>
+        <w:rPr>
+          <w:rFonts w:hint="eastAsia"/>
+        </w:rPr>
+        <w:t xml:space="preserve">长连接收文件</w:t>
+      </w:r>
+      <w:r>
+        <w:t xml:space="preserve"> → </w:t>
+      </w:r>
+      <w:r>
+        <w:rPr>
+          <w:rFonts w:hint="eastAsia"/>
+        </w:rPr>
+        <w:t xml:space="preserve">公开上传通道入库</w:t>
+      </w:r>
+      <w:r>
+        <w:t xml:space="preserve"> → </w:t>
+      </w:r>
+      <w:r>
+        <w:rPr>
+          <w:rFonts w:hint="eastAsia"/>
+        </w:rPr>
+        <w:t xml:space="preserve">交互卡片关联/新建</w:t>
+      </w:r>
+      <w:r>
+        <w:t xml:space="preserve"> JD → </w:t>
+      </w:r>
+      <w:r>
+        <w:rPr>
+          <w:rFonts w:hint="eastAsia"/>
+        </w:rPr>
+        <w:t xml:space="preserve">异步解析</w:t>
+      </w:r>
+      <w:r>
+        <w:t xml:space="preserve"> → </w:t>
+      </w:r>
+      <w:r>
+        <w:rPr>
+          <w:rFonts w:hint="eastAsia"/>
+        </w:rPr>
+        <w:t xml:space="preserve">自动</w:t>
+      </w:r>
+      <w:r>
+        <w:t xml:space="preserve"> </w:t>
+      </w:r>
+      <w:r>
+        <w:rPr>
+          <w:rFonts w:hint="eastAsia"/>
+        </w:rPr>
+        <w:t xml:space="preserve">ShareLink。详见</w:t>
+      </w:r>
+      <w:r>
+        <w:t xml:space="preserve"> </w:t>
+      </w:r>
+      <w:hyperlink r:id="rId23">
+        <w:r>
+          <w:rPr>
+            <w:rStyle w:val="VerbatimChar"/>
+          </w:rPr>
+          <w:t xml:space="preserve">05_feishu_resume_ingest.md</w:t>
+        </w:r>
+      </w:hyperlink>
+      <w:r>
+        <w:t xml:space="preserve">(</w:t>
       </w:r>
       <w:r>
         <w:rPr>
@@ -4114,36 +5536,26 @@
           <w:b/>
           <w:bCs/>
         </w:rPr>
-        <w:t xml:space="preserve">不含</w:t>
-      </w:r>
-      <w:r>
-        <w:rPr>
-          <w:b/>
-          <w:bCs/>
-        </w:rPr>
-        <w:t xml:space="preserve"> Sidebar/Topbar</w:t>
-      </w:r>
-      <w:r>
-        <w:rPr>
-          <w:rFonts w:hint="eastAsia"/>
-        </w:rPr>
-        <w:t xml:space="preserve">(防泄漏其他页面信息)</w:t>
+        <w:t xml:space="preserve">已生产化</w:t>
+      </w:r>
+      <w:r>
+        <w:t xml:space="preserve">)。</w:t>
       </w:r>
     </w:p>
-    <w:bookmarkEnd w:id="19"/>
-    <w:bookmarkStart w:id="20" w:name="a.4-评价对话系统"/>
+    <w:bookmarkEnd w:id="24"/>
+    <w:bookmarkStart w:id="25" w:name="a.7-现有人员详情布局"/>
     <w:p>
       <w:pPr>
         <w:pStyle w:val="Heading2"/>
       </w:pPr>
       <w:r>
-        <w:t xml:space="preserve">5A.4 </w:t>
-      </w:r>
-      <w:r>
-        <w:rPr>
-          <w:rFonts w:hint="eastAsia"/>
-        </w:rPr>
-        <w:t xml:space="preserve">评价对话系统</w:t>
+        <w:t xml:space="preserve">5A.7 </w:t>
+      </w:r>
+      <w:r>
+        <w:rPr>
+          <w:rFonts w:hint="eastAsia"/>
+        </w:rPr>
+        <w:t xml:space="preserve">现有人员详情布局</w:t>
       </w:r>
     </w:p>
     <w:p>
@@ -4152,194 +5564,89 @@
       </w:pPr>
       <w:r>
         <w:rPr>
-          <w:rFonts w:hint="eastAsia"/>
-        </w:rPr>
-        <w:t xml:space="preserve">完整功能:</w:t>
+          <w:rStyle w:val="VerbatimChar"/>
+        </w:rPr>
+        <w:t xml:space="preserve">/staff/:id</w:t>
       </w:r>
       <w:r>
         <w:t xml:space="preserve"> </w:t>
       </w:r>
       <w:r>
-        <w:t xml:space="preserve">- </w:t>
-      </w:r>
-      <w:r>
-        <w:rPr>
-          <w:rFonts w:hint="eastAsia"/>
-        </w:rPr>
-        <w:t xml:space="preserve">写评价</w:t>
-      </w:r>
-      <w:r>
-        <w:t xml:space="preserve"> / 1 </w:t>
-      </w:r>
-      <w:r>
-        <w:rPr>
-          <w:rFonts w:hint="eastAsia"/>
-        </w:rPr>
-        <w:t xml:space="preserve">级嵌套回复</w:t>
-      </w:r>
-      <w:r>
-        <w:t xml:space="preserve"> / </w:t>
-      </w:r>
-      <w:r>
-        <w:rPr>
-          <w:rFonts w:hint="eastAsia"/>
-        </w:rPr>
-        <w:t xml:space="preserve">多选批量回复(</w:t>
-      </w:r>
-      <w:r>
-        <w:rPr>
-          <w:rStyle w:val="VerbatimChar"/>
-        </w:rPr>
-        <w:t xml:space="preserve">referencedIds[]</w:t>
-      </w:r>
-      <w:r>
-        <w:t xml:space="preserve">)</w:t>
+        <w:rPr>
+          <w:rFonts w:hint="eastAsia"/>
+        </w:rPr>
+        <w:t xml:space="preserve">与</w:t>
       </w:r>
       <w:r>
         <w:t xml:space="preserve"> </w:t>
       </w:r>
       <w:r>
-        <w:t xml:space="preserve">- </w:t>
-      </w:r>
-      <w:r>
-        <w:rPr>
-          <w:rFonts w:hint="eastAsia"/>
-        </w:rPr>
-        <w:t xml:space="preserve">附件(image/file/link,单条</w:t>
-      </w:r>
-      <w:r>
-        <w:t xml:space="preserve"> ≤30MB,R2 </w:t>
-      </w:r>
-      <w:r>
-        <w:rPr>
-          <w:rFonts w:hint="eastAsia"/>
-        </w:rPr>
-        <w:t xml:space="preserve">直传)</w:t>
+        <w:rPr>
+          <w:rStyle w:val="VerbatimChar"/>
+        </w:rPr>
+        <w:t xml:space="preserve">/newhire/:id</w:t>
       </w:r>
       <w:r>
         <w:t xml:space="preserve"> </w:t>
       </w:r>
       <w:r>
-        <w:t xml:space="preserve">- </w:t>
-      </w:r>
-      <w:r>
-        <w:rPr>
-          <w:rFonts w:hint="eastAsia"/>
-        </w:rPr>
-        <w:t xml:space="preserve">赞同/否决投票</w:t>
-      </w:r>
-      <w:r>
-        <w:t xml:space="preserve"> + </w:t>
-      </w:r>
-      <w:r>
-        <w:rPr>
-          <w:rFonts w:hint="eastAsia"/>
-        </w:rPr>
-        <w:t xml:space="preserve">投票名单</w:t>
-      </w:r>
-      <w:r>
-        <w:t xml:space="preserve"> popover</w:t>
+        <w:rPr>
+          <w:rFonts w:hint="eastAsia"/>
+        </w:rPr>
+        <w:t xml:space="preserve">共用</w:t>
       </w:r>
       <w:r>
         <w:t xml:space="preserve"> </w:t>
       </w:r>
       <w:r>
-        <w:t xml:space="preserve">- </w:t>
-      </w:r>
-      <w:r>
-        <w:rPr>
-          <w:rFonts w:hint="eastAsia"/>
-        </w:rPr>
-        <w:t xml:space="preserve">可见范围(public/internal/admin)</w:t>
+        <w:rPr>
+          <w:rStyle w:val="VerbatimChar"/>
+        </w:rPr>
+        <w:t xml:space="preserve">EmployeeDetail</w:t>
+      </w:r>
+      <w:r>
+        <w:rPr>
+          <w:rFonts w:hint="eastAsia"/>
+        </w:rPr>
+        <w:t xml:space="preserve">:宽屏三列(左档案</w:t>
+      </w:r>
+      <w:r>
+        <w:t xml:space="preserve"> · </w:t>
+      </w:r>
+      <w:r>
+        <w:rPr>
+          <w:rFonts w:hint="eastAsia"/>
+        </w:rPr>
+        <w:t xml:space="preserve">中入职生涯</w:t>
+      </w:r>
+      <w:r>
+        <w:t xml:space="preserve"> · </w:t>
+      </w:r>
+      <w:r>
+        <w:rPr>
+          <w:rFonts w:hint="eastAsia"/>
+        </w:rPr>
+        <w:t xml:space="preserve">右时间轴),</w:t>
+      </w:r>
+      <w:r>
+        <w:rPr>
+          <w:rStyle w:val="VerbatimChar"/>
+        </w:rPr>
+        <w:t xml:space="preserve">xl</w:t>
       </w:r>
       <w:r>
         <w:t xml:space="preserve"> </w:t>
       </w:r>
       <w:r>
-        <w:t xml:space="preserve">- </w:t>
-      </w:r>
-      <w:r>
-        <w:rPr>
-          <w:rFonts w:hint="eastAsia"/>
-        </w:rPr>
-        <w:t xml:space="preserve">软删除审核(作者请求</w:t>
-      </w:r>
-      <w:r>
-        <w:t xml:space="preserve"> → admin </w:t>
-      </w:r>
-      <w:r>
-        <w:rPr>
-          <w:rFonts w:hint="eastAsia"/>
-        </w:rPr>
-        <w:t xml:space="preserve">批准)</w:t>
-      </w:r>
-      <w:r>
-        <w:t xml:space="preserve"> </w:t>
-      </w:r>
-      <w:r>
-        <w:t xml:space="preserve">- admin </w:t>
-      </w:r>
-      <w:r>
-        <w:rPr>
-          <w:rFonts w:hint="eastAsia"/>
-        </w:rPr>
-        <w:t xml:space="preserve">隐藏</w:t>
-      </w:r>
-      <w:r>
-        <w:t xml:space="preserve"> / </w:t>
-      </w:r>
-      <w:r>
-        <w:rPr>
-          <w:rFonts w:hint="eastAsia"/>
-        </w:rPr>
-        <w:t xml:space="preserve">取消隐藏</w:t>
-      </w:r>
-      <w:r>
-        <w:t xml:space="preserve"> </w:t>
-      </w:r>
-      <w:r>
-        <w:t xml:space="preserve">- </w:t>
-      </w:r>
-      <w:r>
-        <w:rPr>
-          <w:rFonts w:hint="eastAsia"/>
-        </w:rPr>
-        <w:t xml:space="preserve">实时新评价</w:t>
-      </w:r>
-      <w:r>
-        <w:t xml:space="preserve"> Notification + Web Audio </w:t>
-      </w:r>
-      <w:r>
-        <w:rPr>
-          <w:rFonts w:hint="eastAsia"/>
-        </w:rPr>
-        <w:t xml:space="preserve">音效(15s</w:t>
-      </w:r>
-      <w:r>
-        <w:t xml:space="preserve"> </w:t>
-      </w:r>
-      <w:r>
-        <w:rPr>
-          <w:rFonts w:hint="eastAsia"/>
-        </w:rPr>
-        <w:t xml:space="preserve">轮询)</w:t>
-      </w:r>
-      <w:r>
-        <w:t xml:space="preserve"> </w:t>
-      </w:r>
-      <w:r>
-        <w:t xml:space="preserve">- </w:t>
-      </w:r>
-      <w:r>
-        <w:rPr>
-          <w:rFonts w:hint="eastAsia"/>
-        </w:rPr>
-        <w:t xml:space="preserve">排序:最新/最旧/最赞同/最否决</w:t>
+        <w:rPr>
+          <w:rFonts w:hint="eastAsia"/>
+        </w:rPr>
+        <w:t xml:space="preserve">以下上下堆叠;桌面进详情自动收起侧栏。</w:t>
       </w:r>
     </w:p>
-    <w:bookmarkEnd w:id="20"/>
-    <w:bookmarkEnd w:id="21"/>
-    <w:bookmarkStart w:id="22" w:name="安全设计"/>
+    <w:bookmarkEnd w:id="25"/>
+    <w:bookmarkEnd w:id="26"/>
+    <w:bookmarkStart w:id="27" w:name="安全设计"/>
     <w:p>
       <w:pPr>
         <w:pStyle w:val="Heading1"/>
@@ -4661,21 +5968,27 @@
               <w:rPr>
                 <w:rFonts w:hint="eastAsia"/>
               </w:rPr>
-              <w:t xml:space="preserve">凭证</w:t>
-            </w:r>
-          </w:p>
-        </w:tc>
-        <w:tc>
-          <w:tcPr/>
-          <w:p>
-            <w:pPr>
-              <w:pStyle w:val="Compact"/>
-            </w:pPr>
-            <w:r>
-              <w:rPr>
-                <w:rStyle w:val="VerbatimChar"/>
-              </w:rPr>
-              <w:t xml:space="preserve">.env</w:t>
+              <w:t xml:space="preserve">公开链</w:t>
+            </w:r>
+          </w:p>
+        </w:tc>
+        <w:tc>
+          <w:tcPr/>
+          <w:p>
+            <w:pPr>
+              <w:pStyle w:val="Compact"/>
+            </w:pPr>
+            <w:r>
+              <w:t xml:space="preserve">ShareLink / Upload / </w:t>
+            </w:r>
+            <w:r>
+              <w:rPr>
+                <w:rFonts w:hint="eastAsia"/>
+              </w:rPr>
+              <w:t xml:space="preserve">面试评价</w:t>
+            </w:r>
+            <w:r>
+              <w:t xml:space="preserve"> /</w:t>
             </w:r>
             <w:r>
               <w:t xml:space="preserve"> </w:t>
@@ -4683,8 +5996,10 @@
             <w:r>
               <w:rPr>
                 <w:rFonts w:hint="eastAsia"/>
-              </w:rPr>
-              <w:t xml:space="preserve">严格不入</w:t>
+                <w:b/>
+                <w:bCs/>
+              </w:rPr>
+              <w:t xml:space="preserve">绩效评价</w:t>
             </w:r>
             <w:r>
               <w:t xml:space="preserve"> </w:t>
@@ -4693,28 +6008,16 @@
               <w:rPr>
                 <w:rFonts w:hint="eastAsia"/>
               </w:rPr>
-              <w:t xml:space="preserve">Git,生产</w:t>
-            </w:r>
-            <w:r>
-              <w:t xml:space="preserve"> secrets </w:t>
-            </w:r>
-            <w:r>
-              <w:rPr>
-                <w:rFonts w:hint="eastAsia"/>
-              </w:rPr>
-              <w:t xml:space="preserve">在</w:t>
-            </w:r>
-            <w:r>
-              <w:t xml:space="preserve"> VPS </w:t>
-            </w:r>
-            <w:r>
-              <w:rPr>
-                <w:rFonts w:hint="eastAsia"/>
-              </w:rPr>
-              <w:t xml:space="preserve">本地</w:t>
-            </w:r>
-            <w:r>
-              <w:t xml:space="preserve"> / GitHub Actions Secrets</w:t>
+              <w:t xml:space="preserve">均用不可猜</w:t>
+            </w:r>
+            <w:r>
+              <w:t xml:space="preserve"> </w:t>
+            </w:r>
+            <w:r>
+              <w:rPr>
+                <w:rFonts w:hint="eastAsia"/>
+              </w:rPr>
+              <w:t xml:space="preserve">token;绩效另加访问密钥</w:t>
             </w:r>
           </w:p>
         </w:tc>
@@ -4730,6 +6033,75 @@
               <w:rPr>
                 <w:rFonts w:hint="eastAsia"/>
               </w:rPr>
+              <w:t xml:space="preserve">凭证</w:t>
+            </w:r>
+          </w:p>
+        </w:tc>
+        <w:tc>
+          <w:tcPr/>
+          <w:p>
+            <w:pPr>
+              <w:pStyle w:val="Compact"/>
+            </w:pPr>
+            <w:r>
+              <w:rPr>
+                <w:rStyle w:val="VerbatimChar"/>
+              </w:rPr>
+              <w:t xml:space="preserve">.env</w:t>
+            </w:r>
+            <w:r>
+              <w:t xml:space="preserve"> </w:t>
+            </w:r>
+            <w:r>
+              <w:rPr>
+                <w:rFonts w:hint="eastAsia"/>
+              </w:rPr>
+              <w:t xml:space="preserve">严格不入</w:t>
+            </w:r>
+            <w:r>
+              <w:t xml:space="preserve"> </w:t>
+            </w:r>
+            <w:r>
+              <w:rPr>
+                <w:rFonts w:hint="eastAsia"/>
+              </w:rPr>
+              <w:t xml:space="preserve">Git,生产</w:t>
+            </w:r>
+            <w:r>
+              <w:t xml:space="preserve"> secrets </w:t>
+            </w:r>
+            <w:r>
+              <w:rPr>
+                <w:rFonts w:hint="eastAsia"/>
+              </w:rPr>
+              <w:t xml:space="preserve">在</w:t>
+            </w:r>
+            <w:r>
+              <w:t xml:space="preserve"> VPS </w:t>
+            </w:r>
+            <w:r>
+              <w:rPr>
+                <w:rFonts w:hint="eastAsia"/>
+              </w:rPr>
+              <w:t xml:space="preserve">本地</w:t>
+            </w:r>
+            <w:r>
+              <w:t xml:space="preserve"> / GitHub Actions Secrets</w:t>
+            </w:r>
+          </w:p>
+        </w:tc>
+      </w:tr>
+      <w:tr>
+        <w:tc>
+          <w:tcPr/>
+          <w:p>
+            <w:pPr>
+              <w:pStyle w:val="Compact"/>
+            </w:pPr>
+            <w:r>
+              <w:rPr>
+                <w:rFonts w:hint="eastAsia"/>
+              </w:rPr>
               <w:t xml:space="preserve">数据</w:t>
             </w:r>
           </w:p>
@@ -4765,14 +6137,23 @@
               <w:rPr>
                 <w:rFonts w:hint="eastAsia"/>
               </w:rPr>
-              <w:t xml:space="preserve">限制到生产域名</w:t>
+              <w:t xml:space="preserve">限制到生产域名;绩效签字前缀</w:t>
+            </w:r>
+            <w:r>
+              <w:t xml:space="preserve"> </w:t>
+            </w:r>
+            <w:r>
+              <w:rPr>
+                <w:rStyle w:val="VerbatimChar"/>
+              </w:rPr>
+              <w:t xml:space="preserve">performance-signatures/</w:t>
             </w:r>
           </w:p>
         </w:tc>
       </w:tr>
     </w:tbl>
-    <w:bookmarkEnd w:id="22"/>
-    <w:bookmarkStart w:id="23" w:name="容量规划vps-4c8g-参考"/>
+    <w:bookmarkEnd w:id="27"/>
+    <w:bookmarkStart w:id="28" w:name="容量规划vps-4c8g-参考"/>
     <w:p>
       <w:pPr>
         <w:pStyle w:val="Heading1"/>
@@ -5115,8 +6496,8 @@
         </w:tc>
       </w:tr>
     </w:tbl>
-    <w:bookmarkEnd w:id="23"/>
-    <w:bookmarkStart w:id="24" w:name="备份与灾备"/>
+    <w:bookmarkEnd w:id="28"/>
+    <w:bookmarkStart w:id="29" w:name="备份与灾备"/>
     <w:p>
       <w:pPr>
         <w:pStyle w:val="Heading1"/>
@@ -5129,272 +6510,6 @@
           <w:rFonts w:hint="eastAsia"/>
         </w:rPr>
         <w:t xml:space="preserve">备份与灾备</w:t>
-      </w:r>
-    </w:p>
-    <w:p>
-      <w:pPr>
-        <w:pStyle w:val="Compact"/>
-        <w:numPr>
-          <w:ilvl w:val="0"/>
-          <w:numId w:val="1007"/>
-        </w:numPr>
-      </w:pPr>
-      <w:r>
-        <w:rPr>
-          <w:rFonts w:hint="eastAsia"/>
-          <w:b/>
-          <w:bCs/>
-        </w:rPr>
-        <w:t xml:space="preserve">每日</w:t>
-      </w:r>
-      <w:r>
-        <w:rPr>
-          <w:b/>
-          <w:bCs/>
-        </w:rPr>
-        <w:t xml:space="preserve"> 03:00 </w:t>
-      </w:r>
-      <w:r>
-        <w:rPr>
-          <w:rFonts w:hint="eastAsia"/>
-          <w:b/>
-          <w:bCs/>
-        </w:rPr>
-        <w:t xml:space="preserve">自动备份</w:t>
-      </w:r>
-      <w:r>
-        <w:t xml:space="preserve">:</w:t>
-      </w:r>
-      <w:r>
-        <w:rPr>
-          <w:rStyle w:val="VerbatimChar"/>
-        </w:rPr>
-        <w:t xml:space="preserve">ops/backup.sh</w:t>
-      </w:r>
-      <w:r>
-        <w:t xml:space="preserve"> </w:t>
-      </w:r>
-      <w:r>
-        <w:rPr>
-          <w:rFonts w:hint="eastAsia"/>
-        </w:rPr>
-        <w:t xml:space="preserve">通过</w:t>
-      </w:r>
-      <w:r>
-        <w:t xml:space="preserve"> cron </w:t>
-      </w:r>
-      <w:r>
-        <w:rPr>
-          <w:rFonts w:hint="eastAsia"/>
-        </w:rPr>
-        <w:t xml:space="preserve">触发,</w:t>
-      </w:r>
-      <w:r>
-        <w:rPr>
-          <w:rStyle w:val="VerbatimChar"/>
-        </w:rPr>
-        <w:t xml:space="preserve">pg_dump</w:t>
-      </w:r>
-      <w:r>
-        <w:t xml:space="preserve"> </w:t>
-      </w:r>
-      <w:r>
-        <w:t xml:space="preserve">→</w:t>
-      </w:r>
-      <w:r>
-        <w:t xml:space="preserve"> </w:t>
-      </w:r>
-      <w:r>
-        <w:rPr>
-          <w:rStyle w:val="VerbatimChar"/>
-        </w:rPr>
-        <w:t xml:space="preserve">gzip -9</w:t>
-      </w:r>
-      <w:r>
-        <w:t xml:space="preserve"> </w:t>
-      </w:r>
-      <w:r>
-        <w:t xml:space="preserve">→ </w:t>
-      </w:r>
-      <w:r>
-        <w:rPr>
-          <w:rFonts w:hint="eastAsia"/>
-        </w:rPr>
-        <w:t xml:space="preserve">上传</w:t>
-      </w:r>
-      <w:r>
-        <w:t xml:space="preserve"> R2 </w:t>
-      </w:r>
-      <w:r>
-        <w:rPr>
-          <w:rFonts w:hint="eastAsia"/>
-        </w:rPr>
-        <w:t xml:space="preserve">备份桶</w:t>
-      </w:r>
-    </w:p>
-    <w:p>
-      <w:pPr>
-        <w:pStyle w:val="Compact"/>
-        <w:numPr>
-          <w:ilvl w:val="0"/>
-          <w:numId w:val="1007"/>
-        </w:numPr>
-      </w:pPr>
-      <w:r>
-        <w:rPr>
-          <w:rFonts w:hint="eastAsia"/>
-          <w:b/>
-          <w:bCs/>
-        </w:rPr>
-        <w:t xml:space="preserve">备份键名规范</w:t>
-      </w:r>
-      <w:r>
-        <w:t xml:space="preserve">:</w:t>
-      </w:r>
-      <w:r>
-        <w:rPr>
-          <w:rStyle w:val="VerbatimChar"/>
-        </w:rPr>
-        <w:t xml:space="preserve">postgres/YYYY/MM/mesa-pg-YYYYMMDDTHHMMSSZ.sql.gz</w:t>
-      </w:r>
-    </w:p>
-    <w:p>
-      <w:pPr>
-        <w:pStyle w:val="Compact"/>
-        <w:numPr>
-          <w:ilvl w:val="0"/>
-          <w:numId w:val="1007"/>
-        </w:numPr>
-      </w:pPr>
-      <w:r>
-        <w:rPr>
-          <w:rFonts w:hint="eastAsia"/>
-          <w:b/>
-          <w:bCs/>
-        </w:rPr>
-        <w:t xml:space="preserve">本地保留</w:t>
-      </w:r>
-      <w:r>
-        <w:t xml:space="preserve">:7 </w:t>
-      </w:r>
-      <w:r>
-        <w:rPr>
-          <w:rFonts w:hint="eastAsia"/>
-        </w:rPr>
-        <w:t xml:space="preserve">天,远端按</w:t>
-      </w:r>
-      <w:r>
-        <w:t xml:space="preserve"> R2 </w:t>
-      </w:r>
-      <w:r>
-        <w:rPr>
-          <w:rFonts w:hint="eastAsia"/>
-        </w:rPr>
-        <w:t xml:space="preserve">生命周期策略(如</w:t>
-      </w:r>
-      <w:r>
-        <w:t xml:space="preserve"> 90 </w:t>
-      </w:r>
-      <w:r>
-        <w:rPr>
-          <w:rFonts w:hint="eastAsia"/>
-        </w:rPr>
-        <w:t xml:space="preserve">天冷存储)</w:t>
-      </w:r>
-    </w:p>
-    <w:p>
-      <w:pPr>
-        <w:pStyle w:val="Compact"/>
-        <w:numPr>
-          <w:ilvl w:val="0"/>
-          <w:numId w:val="1007"/>
-        </w:numPr>
-      </w:pPr>
-      <w:r>
-        <w:rPr>
-          <w:rFonts w:hint="eastAsia"/>
-          <w:b/>
-          <w:bCs/>
-        </w:rPr>
-        <w:t xml:space="preserve">恢复</w:t>
-      </w:r>
-      <w:r>
-        <w:rPr>
-          <w:b/>
-          <w:bCs/>
-        </w:rPr>
-        <w:t xml:space="preserve"> SOP</w:t>
-      </w:r>
-      <w:r>
-        <w:t xml:space="preserve">:</w:t>
-      </w:r>
-      <w:r>
-        <w:rPr>
-          <w:rStyle w:val="VerbatimChar"/>
-        </w:rPr>
-        <w:t xml:space="preserve">ops/restore.sh r2://...sql.gz</w:t>
-      </w:r>
-      <w:r>
-        <w:t xml:space="preserve"> </w:t>
-      </w:r>
-      <w:r>
-        <w:rPr>
-          <w:rFonts w:hint="eastAsia"/>
-        </w:rPr>
-        <w:t xml:space="preserve">自动化恢复,见交付文档</w:t>
-      </w:r>
-      <w:r>
-        <w:t xml:space="preserve"> 04</w:t>
-      </w:r>
-    </w:p>
-    <w:p>
-      <w:pPr>
-        <w:pStyle w:val="Compact"/>
-        <w:numPr>
-          <w:ilvl w:val="0"/>
-          <w:numId w:val="1007"/>
-        </w:numPr>
-      </w:pPr>
-      <w:r>
-        <w:rPr>
-          <w:b/>
-          <w:bCs/>
-        </w:rPr>
-        <w:t xml:space="preserve">RTO / RPO</w:t>
-      </w:r>
-      <w:r>
-        <w:t xml:space="preserve">:RTO ≤ 30 </w:t>
-      </w:r>
-      <w:r>
-        <w:rPr>
-          <w:rFonts w:hint="eastAsia"/>
-        </w:rPr>
-        <w:t xml:space="preserve">分钟,RPO</w:t>
-      </w:r>
-      <w:r>
-        <w:t xml:space="preserve"> ≤ 24 </w:t>
-      </w:r>
-      <w:r>
-        <w:rPr>
-          <w:rFonts w:hint="eastAsia"/>
-        </w:rPr>
-        <w:t xml:space="preserve">小时(由备份频率决定)</w:t>
-      </w:r>
-    </w:p>
-    <w:bookmarkEnd w:id="24"/>
-    <w:bookmarkStart w:id="25" w:name="监控与日志"/>
-    <w:p>
-      <w:pPr>
-        <w:pStyle w:val="Heading1"/>
-      </w:pPr>
-      <w:r>
-        <w:t xml:space="preserve">9. </w:t>
-      </w:r>
-      <w:r>
-        <w:rPr>
-          <w:rFonts w:hint="eastAsia"/>
-        </w:rPr>
-        <w:t xml:space="preserve">监控与日志</w:t>
       </w:r>
     </w:p>
     <w:p>
@@ -5408,14 +6523,34 @@
       <w:r>
         <w:rPr>
           <w:rFonts w:hint="eastAsia"/>
-        </w:rPr>
-        <w:t xml:space="preserve">容器健康检查:</w:t>
-      </w:r>
-      <w:r>
-        <w:rPr>
-          <w:rStyle w:val="VerbatimChar"/>
-        </w:rPr>
-        <w:t xml:space="preserve">docker compose ps</w:t>
+          <w:b/>
+          <w:bCs/>
+        </w:rPr>
+        <w:t xml:space="preserve">每日</w:t>
+      </w:r>
+      <w:r>
+        <w:rPr>
+          <w:b/>
+          <w:bCs/>
+        </w:rPr>
+        <w:t xml:space="preserve"> 03:00 UTC </w:t>
+      </w:r>
+      <w:r>
+        <w:rPr>
+          <w:rFonts w:hint="eastAsia"/>
+          <w:b/>
+          <w:bCs/>
+        </w:rPr>
+        <w:t xml:space="preserve">自动备份</w:t>
+      </w:r>
+      <w:r>
+        <w:t xml:space="preserve">:</w:t>
+      </w:r>
+      <w:r>
+        <w:rPr>
+          <w:rStyle w:val="VerbatimChar"/>
+        </w:rPr>
+        <w:t xml:space="preserve">ops/backup.sh</w:t>
       </w:r>
       <w:r>
         <w:t xml:space="preserve"> </w:t>
@@ -5424,10 +6559,71 @@
         <w:rPr>
           <w:rFonts w:hint="eastAsia"/>
         </w:rPr>
-        <w:t xml:space="preserve">显示每个容器</w:t>
-      </w:r>
-      <w:r>
-        <w:t xml:space="preserve"> healthy/unhealthy</w:t>
+        <w:t xml:space="preserve">由</w:t>
+      </w:r>
+      <w:r>
+        <w:t xml:space="preserve"> </w:t>
+      </w:r>
+      <w:r>
+        <w:rPr>
+          <w:b/>
+          <w:bCs/>
+        </w:rPr>
+        <w:t xml:space="preserve">systemd timer</w:t>
+      </w:r>
+      <w:r>
+        <w:t xml:space="preserve"> </w:t>
+      </w:r>
+      <w:r>
+        <w:rPr>
+          <w:rFonts w:hint="eastAsia"/>
+        </w:rPr>
+        <w:t xml:space="preserve">触发(非</w:t>
+      </w:r>
+      <w:r>
+        <w:t xml:space="preserve"> crontab),</w:t>
+      </w:r>
+      <w:r>
+        <w:rPr>
+          <w:rStyle w:val="VerbatimChar"/>
+        </w:rPr>
+        <w:t xml:space="preserve">pg_dump</w:t>
+      </w:r>
+      <w:r>
+        <w:t xml:space="preserve"> </w:t>
+      </w:r>
+      <w:r>
+        <w:t xml:space="preserve">→</w:t>
+      </w:r>
+      <w:r>
+        <w:t xml:space="preserve"> </w:t>
+      </w:r>
+      <w:r>
+        <w:rPr>
+          <w:rStyle w:val="VerbatimChar"/>
+        </w:rPr>
+        <w:t xml:space="preserve">gzip -9</w:t>
+      </w:r>
+      <w:r>
+        <w:t xml:space="preserve"> </w:t>
+      </w:r>
+      <w:r>
+        <w:t xml:space="preserve">→ </w:t>
+      </w:r>
+      <w:r>
+        <w:rPr>
+          <w:rFonts w:hint="eastAsia"/>
+        </w:rPr>
+        <w:t xml:space="preserve">上传</w:t>
+      </w:r>
+      <w:r>
+        <w:t xml:space="preserve"> R2 </w:t>
+      </w:r>
+      <w:r>
+        <w:rPr>
+          <w:rFonts w:hint="eastAsia"/>
+        </w:rPr>
+        <w:t xml:space="preserve">备份桶</w:t>
       </w:r>
     </w:p>
     <w:p>
@@ -5441,35 +6637,19 @@
       <w:r>
         <w:rPr>
           <w:rFonts w:hint="eastAsia"/>
-        </w:rPr>
-        <w:t xml:space="preserve">应用日志:Fastify</w:t>
-      </w:r>
-      <w:r>
-        <w:t xml:space="preserve"> </w:t>
-      </w:r>
-      <w:r>
-        <w:rPr>
-          <w:rFonts w:hint="eastAsia"/>
-        </w:rPr>
-        <w:t xml:space="preserve">用</w:t>
-      </w:r>
-      <w:r>
-        <w:t xml:space="preserve"> Pino,</w:t>
-      </w:r>
-      <w:r>
-        <w:rPr>
-          <w:rStyle w:val="VerbatimChar"/>
-        </w:rPr>
-        <w:t xml:space="preserve">docker logs mesa-server</w:t>
-      </w:r>
-      <w:r>
-        <w:t xml:space="preserve"> </w:t>
-      </w:r>
-      <w:r>
-        <w:rPr>
-          <w:rFonts w:hint="eastAsia"/>
-        </w:rPr>
-        <w:t xml:space="preserve">查看</w:t>
+          <w:b/>
+          <w:bCs/>
+        </w:rPr>
+        <w:t xml:space="preserve">备份键名规范</w:t>
+      </w:r>
+      <w:r>
+        <w:t xml:space="preserve">:</w:t>
+      </w:r>
+      <w:r>
+        <w:rPr>
+          <w:rStyle w:val="VerbatimChar"/>
+        </w:rPr>
+        <w:t xml:space="preserve">postgres/YYYY/MM/mesa-pg-YYYYMMDDTHHMMSSZ.sql.gz</w:t>
       </w:r>
     </w:p>
     <w:p>
@@ -5481,13 +6661,39 @@
         </w:numPr>
       </w:pPr>
       <w:r>
-        <w:t xml:space="preserve">Nginx access log:</w:t>
-      </w:r>
-      <w:r>
-        <w:rPr>
-          <w:rStyle w:val="VerbatimChar"/>
-        </w:rPr>
-        <w:t xml:space="preserve">docker exec mesa-web tail -f /var/log/nginx/access.log</w:t>
+        <w:rPr>
+          <w:rFonts w:hint="eastAsia"/>
+          <w:b/>
+          <w:bCs/>
+        </w:rPr>
+        <w:t xml:space="preserve">本地保留</w:t>
+      </w:r>
+      <w:r>
+        <w:t xml:space="preserve">:7 </w:t>
+      </w:r>
+      <w:r>
+        <w:rPr>
+          <w:rFonts w:hint="eastAsia"/>
+        </w:rPr>
+        <w:t xml:space="preserve">天,远端按</w:t>
+      </w:r>
+      <w:r>
+        <w:t xml:space="preserve"> R2 </w:t>
+      </w:r>
+      <w:r>
+        <w:rPr>
+          <w:rFonts w:hint="eastAsia"/>
+        </w:rPr>
+        <w:t xml:space="preserve">生命周期策略(如</w:t>
+      </w:r>
+      <w:r>
+        <w:t xml:space="preserve"> 90 </w:t>
+      </w:r>
+      <w:r>
+        <w:rPr>
+          <w:rFonts w:hint="eastAsia"/>
+        </w:rPr>
+        <w:t xml:space="preserve">天冷存储)</w:t>
       </w:r>
     </w:p>
     <w:p>
@@ -5501,6 +6707,194 @@
       <w:r>
         <w:rPr>
           <w:rFonts w:hint="eastAsia"/>
+          <w:b/>
+          <w:bCs/>
+        </w:rPr>
+        <w:t xml:space="preserve">恢复</w:t>
+      </w:r>
+      <w:r>
+        <w:rPr>
+          <w:b/>
+          <w:bCs/>
+        </w:rPr>
+        <w:t xml:space="preserve"> SOP</w:t>
+      </w:r>
+      <w:r>
+        <w:t xml:space="preserve">:</w:t>
+      </w:r>
+      <w:r>
+        <w:rPr>
+          <w:rStyle w:val="VerbatimChar"/>
+        </w:rPr>
+        <w:t xml:space="preserve">ops/restore.sh r2://...sql.gz</w:t>
+      </w:r>
+      <w:r>
+        <w:t xml:space="preserve"> </w:t>
+      </w:r>
+      <w:r>
+        <w:rPr>
+          <w:rFonts w:hint="eastAsia"/>
+        </w:rPr>
+        <w:t xml:space="preserve">自动化恢复,见交付文档</w:t>
+      </w:r>
+      <w:r>
+        <w:t xml:space="preserve"> 04</w:t>
+      </w:r>
+    </w:p>
+    <w:p>
+      <w:pPr>
+        <w:pStyle w:val="Compact"/>
+        <w:numPr>
+          <w:ilvl w:val="0"/>
+          <w:numId w:val="1008"/>
+        </w:numPr>
+      </w:pPr>
+      <w:r>
+        <w:rPr>
+          <w:b/>
+          <w:bCs/>
+        </w:rPr>
+        <w:t xml:space="preserve">RTO / RPO</w:t>
+      </w:r>
+      <w:r>
+        <w:t xml:space="preserve">:RTO ≤ 30 </w:t>
+      </w:r>
+      <w:r>
+        <w:rPr>
+          <w:rFonts w:hint="eastAsia"/>
+        </w:rPr>
+        <w:t xml:space="preserve">分钟,RPO</w:t>
+      </w:r>
+      <w:r>
+        <w:t xml:space="preserve"> ≤ 24 </w:t>
+      </w:r>
+      <w:r>
+        <w:rPr>
+          <w:rFonts w:hint="eastAsia"/>
+        </w:rPr>
+        <w:t xml:space="preserve">小时(由备份频率决定)</w:t>
+      </w:r>
+    </w:p>
+    <w:bookmarkEnd w:id="29"/>
+    <w:bookmarkStart w:id="30" w:name="监控与日志"/>
+    <w:p>
+      <w:pPr>
+        <w:pStyle w:val="Heading1"/>
+      </w:pPr>
+      <w:r>
+        <w:t xml:space="preserve">9. </w:t>
+      </w:r>
+      <w:r>
+        <w:rPr>
+          <w:rFonts w:hint="eastAsia"/>
+        </w:rPr>
+        <w:t xml:space="preserve">监控与日志</w:t>
+      </w:r>
+    </w:p>
+    <w:p>
+      <w:pPr>
+        <w:pStyle w:val="Compact"/>
+        <w:numPr>
+          <w:ilvl w:val="0"/>
+          <w:numId w:val="1009"/>
+        </w:numPr>
+      </w:pPr>
+      <w:r>
+        <w:rPr>
+          <w:rFonts w:hint="eastAsia"/>
+        </w:rPr>
+        <w:t xml:space="preserve">容器健康检查:</w:t>
+      </w:r>
+      <w:r>
+        <w:rPr>
+          <w:rStyle w:val="VerbatimChar"/>
+        </w:rPr>
+        <w:t xml:space="preserve">docker compose ps</w:t>
+      </w:r>
+      <w:r>
+        <w:t xml:space="preserve"> </w:t>
+      </w:r>
+      <w:r>
+        <w:rPr>
+          <w:rFonts w:hint="eastAsia"/>
+        </w:rPr>
+        <w:t xml:space="preserve">显示每个容器</w:t>
+      </w:r>
+      <w:r>
+        <w:t xml:space="preserve"> healthy/unhealthy</w:t>
+      </w:r>
+    </w:p>
+    <w:p>
+      <w:pPr>
+        <w:pStyle w:val="Compact"/>
+        <w:numPr>
+          <w:ilvl w:val="0"/>
+          <w:numId w:val="1009"/>
+        </w:numPr>
+      </w:pPr>
+      <w:r>
+        <w:rPr>
+          <w:rFonts w:hint="eastAsia"/>
+        </w:rPr>
+        <w:t xml:space="preserve">应用日志:Fastify</w:t>
+      </w:r>
+      <w:r>
+        <w:t xml:space="preserve"> </w:t>
+      </w:r>
+      <w:r>
+        <w:rPr>
+          <w:rFonts w:hint="eastAsia"/>
+        </w:rPr>
+        <w:t xml:space="preserve">用</w:t>
+      </w:r>
+      <w:r>
+        <w:t xml:space="preserve"> Pino,</w:t>
+      </w:r>
+      <w:r>
+        <w:rPr>
+          <w:rStyle w:val="VerbatimChar"/>
+        </w:rPr>
+        <w:t xml:space="preserve">docker logs mesa-server</w:t>
+      </w:r>
+      <w:r>
+        <w:t xml:space="preserve"> </w:t>
+      </w:r>
+      <w:r>
+        <w:rPr>
+          <w:rFonts w:hint="eastAsia"/>
+        </w:rPr>
+        <w:t xml:space="preserve">查看</w:t>
+      </w:r>
+    </w:p>
+    <w:p>
+      <w:pPr>
+        <w:pStyle w:val="Compact"/>
+        <w:numPr>
+          <w:ilvl w:val="0"/>
+          <w:numId w:val="1009"/>
+        </w:numPr>
+      </w:pPr>
+      <w:r>
+        <w:t xml:space="preserve">Nginx access log:</w:t>
+      </w:r>
+      <w:r>
+        <w:rPr>
+          <w:rStyle w:val="VerbatimChar"/>
+        </w:rPr>
+        <w:t xml:space="preserve">docker exec mesa-web tail -f /var/log/nginx/access.log</w:t>
+      </w:r>
+    </w:p>
+    <w:p>
+      <w:pPr>
+        <w:pStyle w:val="Compact"/>
+        <w:numPr>
+          <w:ilvl w:val="0"/>
+          <w:numId w:val="1009"/>
+        </w:numPr>
+      </w:pPr>
+      <w:r>
+        <w:rPr>
+          <w:rFonts w:hint="eastAsia"/>
         </w:rPr>
         <w:t xml:space="preserve">(可选)接入</w:t>
       </w:r>
@@ -5514,8 +6908,8 @@
         <w:t xml:space="preserve">看接入层数据</w:t>
       </w:r>
     </w:p>
-    <w:bookmarkEnd w:id="25"/>
-    <w:bookmarkStart w:id="26" w:name="演进路线实际落地状态"/>
+    <w:bookmarkEnd w:id="30"/>
+    <w:bookmarkStart w:id="31" w:name="演进路线实际落地状态"/>
     <w:p>
       <w:pPr>
         <w:pStyle w:val="Heading1"/>
@@ -5761,25 +7155,23 @@
               <w:pStyle w:val="Compact"/>
             </w:pPr>
             <w:r>
-              <w:t xml:space="preserve">5 </w:t>
-            </w:r>
-            <w:r>
-              <w:rPr>
-                <w:rFonts w:hint="eastAsia"/>
-              </w:rPr>
-              <w:t xml:space="preserve">容器(含</w:t>
-            </w:r>
-            <w:r>
-              <w:t xml:space="preserve"> Uptime Kuma </w:t>
-            </w:r>
-            <w:r>
-              <w:rPr>
-                <w:rFonts w:hint="eastAsia"/>
-              </w:rPr>
-              <w:t xml:space="preserve">监控),Cloudflare</w:t>
-            </w:r>
-            <w:r>
-              <w:t xml:space="preserve"> Origin Cert </w:t>
+              <w:rPr>
+                <w:b/>
+                <w:bCs/>
+              </w:rPr>
+              <w:t xml:space="preserve">6</w:t>
+            </w:r>
+            <w:r>
+              <w:t xml:space="preserve"> </w:t>
+            </w:r>
+            <w:r>
+              <w:rPr>
+                <w:rFonts w:hint="eastAsia"/>
+              </w:rPr>
+              <w:t xml:space="preserve">服务(含</w:t>
+            </w:r>
+            <w:r>
+              <w:t xml:space="preserve"> Uptime Kuma + lark-ingest),Cloudflare Origin Cert </w:t>
             </w:r>
             <w:r>
               <w:rPr>
@@ -5960,33 +7352,57 @@
               <w:rPr>
                 <w:rFonts w:hint="eastAsia"/>
               </w:rPr>
-              <w:t xml:space="preserve">已交付</w:t>
-            </w:r>
-          </w:p>
-        </w:tc>
-        <w:tc>
-          <w:tcPr/>
-          <w:p>
-            <w:pPr>
-              <w:pStyle w:val="Compact"/>
-            </w:pPr>
-            <w:r>
-              <w:rPr>
-                <w:rFonts w:hint="eastAsia"/>
-              </w:rPr>
-              <w:t xml:space="preserve">本套</w:t>
-            </w:r>
-            <w:r>
-              <w:t xml:space="preserve"> 4 </w:t>
-            </w:r>
-            <w:r>
-              <w:rPr>
-                <w:rFonts w:hint="eastAsia"/>
-              </w:rPr>
-              <w:t xml:space="preserve">份</w:t>
-            </w:r>
-            <w:r>
-              <w:t xml:space="preserve"> .docx + ops/runbook + README + CLAUDE.md</w:t>
+              <w:t xml:space="preserve">维护中</w:t>
+            </w:r>
+          </w:p>
+        </w:tc>
+        <w:tc>
+          <w:tcPr/>
+          <w:p>
+            <w:pPr>
+              <w:pStyle w:val="Compact"/>
+            </w:pPr>
+            <w:r>
+              <w:t xml:space="preserve">Markdown </w:t>
+            </w:r>
+            <w:r>
+              <w:rPr>
+                <w:rFonts w:hint="eastAsia"/>
+              </w:rPr>
+              <w:t xml:space="preserve">源</w:t>
+            </w:r>
+            <w:r>
+              <w:t xml:space="preserve"> </w:t>
+            </w:r>
+            <w:r>
+              <w:rPr>
+                <w:rStyle w:val="VerbatimChar"/>
+              </w:rPr>
+              <w:t xml:space="preserve">delivery-docs/src/</w:t>
+            </w:r>
+            <w:r>
+              <w:t xml:space="preserve"> </w:t>
+            </w:r>
+            <w:r>
+              <w:t xml:space="preserve">· </w:t>
+            </w:r>
+            <w:r>
+              <w:rPr>
+                <w:rFonts w:hint="eastAsia"/>
+              </w:rPr>
+              <w:t xml:space="preserve">正式</w:t>
+            </w:r>
+            <w:r>
+              <w:t xml:space="preserve"> .docx </w:t>
+            </w:r>
+            <w:r>
+              <w:rPr>
+                <w:rFonts w:hint="eastAsia"/>
+              </w:rPr>
+              <w:t xml:space="preserve">由源生成(见</w:t>
+            </w:r>
+            <w:r>
+              <w:t xml:space="preserve"> README)</w:t>
             </w:r>
           </w:p>
         </w:tc>
@@ -6042,43 +7458,31 @@
               <w:pStyle w:val="Compact"/>
             </w:pPr>
             <w:r>
-              <w:t xml:space="preserve">Kimi </w:t>
-            </w:r>
-            <w:r>
-              <w:rPr>
-                <w:rFonts w:hint="eastAsia"/>
-              </w:rPr>
-              <w:t xml:space="preserve">单</w:t>
-            </w:r>
-            <w:r>
-              <w:t xml:space="preserve"> chat JSON </w:t>
-            </w:r>
-            <w:r>
-              <w:rPr>
-                <w:rFonts w:hint="eastAsia"/>
-              </w:rPr>
-              <w:t xml:space="preserve">输出</w:t>
-            </w:r>
-            <w:r>
-              <w:t xml:space="preserve"> · admin </w:t>
-            </w:r>
-            <w:r>
-              <w:rPr>
-                <w:rFonts w:hint="eastAsia"/>
-              </w:rPr>
-              <w:t xml:space="preserve">在</w:t>
-            </w:r>
-            <w:r>
-              <w:t xml:space="preserve"> UI </w:t>
-            </w:r>
-            <w:r>
-              <w:rPr>
-                <w:rFonts w:hint="eastAsia"/>
-              </w:rPr>
-              <w:t xml:space="preserve">改</w:t>
-            </w:r>
-            <w:r>
-              <w:t xml:space="preserve"> key/model/prompt · </w:t>
+              <w:rPr>
+                <w:rFonts w:hint="eastAsia"/>
+              </w:rPr>
+              <w:t xml:space="preserve">方案</w:t>
+            </w:r>
+            <w:r>
+              <w:t xml:space="preserve"> B </w:t>
+            </w:r>
+            <w:r>
+              <w:rPr>
+                <w:rFonts w:hint="eastAsia"/>
+              </w:rPr>
+              <w:t xml:space="preserve">结构化</w:t>
+            </w:r>
+            <w:r>
+              <w:t xml:space="preserve"> JSON + </w:t>
+            </w:r>
+            <w:r>
+              <w:rPr>
+                <w:rFonts w:hint="eastAsia"/>
+              </w:rPr>
+              <w:t xml:space="preserve">确定性简报拼装</w:t>
+            </w:r>
+            <w:r>
+              <w:t xml:space="preserve"> · JD </w:t>
             </w:r>
             <w:r>
               <w:rPr>
@@ -6131,31 +7535,31 @@
               <w:pStyle w:val="Compact"/>
             </w:pPr>
             <w:r>
-              <w:t xml:space="preserve">ShareLink token · </w:t>
-            </w:r>
-            <w:r>
-              <w:rPr>
-                <w:rFonts w:hint="eastAsia"/>
-              </w:rPr>
-              <w:t xml:space="preserve">公开页</w:t>
-            </w:r>
-            <w:r>
-              <w:t xml:space="preserve"> · </w:t>
-            </w:r>
-            <w:r>
-              <w:rPr>
-                <w:rFonts w:hint="eastAsia"/>
-              </w:rPr>
-              <w:t xml:space="preserve">有效期</w:t>
-            </w:r>
-            <w:r>
-              <w:t xml:space="preserve"> + </w:t>
-            </w:r>
-            <w:r>
-              <w:rPr>
-                <w:rFonts w:hint="eastAsia"/>
-              </w:rPr>
-              <w:t xml:space="preserve">次数上限</w:t>
+              <w:t xml:space="preserve">ShareLink · </w:t>
+            </w:r>
+            <w:r>
+              <w:rPr>
+                <w:rFonts w:hint="eastAsia"/>
+              </w:rPr>
+              <w:t xml:space="preserve">可见性</w:t>
+            </w:r>
+            <w:r>
+              <w:t xml:space="preserve"> toggle · </w:t>
+            </w:r>
+            <w:r>
+              <w:rPr>
+                <w:rFonts w:hint="eastAsia"/>
+              </w:rPr>
+              <w:t xml:space="preserve">飞书</w:t>
+            </w:r>
+            <w:r>
+              <w:t xml:space="preserve"> Bot </w:t>
+            </w:r>
+            <w:r>
+              <w:rPr>
+                <w:rFonts w:hint="eastAsia"/>
+              </w:rPr>
+              <w:t xml:space="preserve">分享策略</w:t>
             </w:r>
           </w:p>
         </w:tc>
@@ -6202,22 +7606,143 @@
               <w:pStyle w:val="Compact"/>
             </w:pPr>
             <w:r>
-              <w:t xml:space="preserve">11 </w:t>
-            </w:r>
-            <w:r>
-              <w:rPr>
-                <w:rFonts w:hint="eastAsia"/>
-              </w:rPr>
-              <w:t xml:space="preserve">表中</w:t>
-            </w:r>
-            <w:r>
-              <w:t xml:space="preserve"> Review/ReviewVote </w:t>
-            </w:r>
-            <w:r>
-              <w:rPr>
-                <w:rFonts w:hint="eastAsia"/>
-              </w:rPr>
-              <w:t xml:space="preserve">双表</w:t>
+              <w:t xml:space="preserve">Review/ReviewVote · </w:t>
+            </w:r>
+            <w:r>
+              <w:rPr>
+                <w:rFonts w:hint="eastAsia"/>
+              </w:rPr>
+              <w:t xml:space="preserve">浏览器通知</w:t>
+            </w:r>
+          </w:p>
+        </w:tc>
+      </w:tr>
+      <w:tr>
+        <w:tc>
+          <w:tcPr/>
+          <w:p>
+            <w:pPr>
+              <w:pStyle w:val="Compact"/>
+            </w:pPr>
+            <w:r>
+              <w:t xml:space="preserve">⑩ </w:t>
+            </w:r>
+            <w:r>
+              <w:rPr>
+                <w:rFonts w:hint="eastAsia"/>
+              </w:rPr>
+              <w:t xml:space="preserve">面试评价</w:t>
+            </w:r>
+          </w:p>
+        </w:tc>
+        <w:tc>
+          <w:tcPr/>
+          <w:p>
+            <w:pPr>
+              <w:pStyle w:val="Compact"/>
+            </w:pPr>
+            <w:r>
+              <w:t xml:space="preserve">✅ </w:t>
+            </w:r>
+            <w:r>
+              <w:rPr>
+                <w:rFonts w:hint="eastAsia"/>
+              </w:rPr>
+              <w:t xml:space="preserve">已上线</w:t>
+            </w:r>
+          </w:p>
+        </w:tc>
+        <w:tc>
+          <w:tcPr/>
+          <w:p>
+            <w:pPr>
+              <w:pStyle w:val="Compact"/>
+            </w:pPr>
+            <w:r>
+              <w:t xml:space="preserve">InterviewEvaluation · </w:t>
+            </w:r>
+            <w:r>
+              <w:rPr>
+                <w:rFonts w:hint="eastAsia"/>
+              </w:rPr>
+              <w:t xml:space="preserve">公开填表</w:t>
+            </w:r>
+            <w:r>
+              <w:t xml:space="preserve"> · Excel </w:t>
+            </w:r>
+            <w:r>
+              <w:rPr>
+                <w:rFonts w:hint="eastAsia"/>
+              </w:rPr>
+              <w:t xml:space="preserve">导出</w:t>
+            </w:r>
+          </w:p>
+        </w:tc>
+      </w:tr>
+      <w:tr>
+        <w:tc>
+          <w:tcPr/>
+          <w:p>
+            <w:pPr>
+              <w:pStyle w:val="Compact"/>
+            </w:pPr>
+            <w:r>
+              <w:t xml:space="preserve">⑪ </w:t>
+            </w:r>
+            <w:r>
+              <w:rPr>
+                <w:rFonts w:hint="eastAsia"/>
+              </w:rPr>
+              <w:t xml:space="preserve">员工绩效评价</w:t>
+            </w:r>
+          </w:p>
+        </w:tc>
+        <w:tc>
+          <w:tcPr/>
+          <w:p>
+            <w:pPr>
+              <w:pStyle w:val="Compact"/>
+            </w:pPr>
+            <w:r>
+              <w:t xml:space="preserve">✅ </w:t>
+            </w:r>
+            <w:r>
+              <w:rPr>
+                <w:rFonts w:hint="eastAsia"/>
+              </w:rPr>
+              <w:t xml:space="preserve">已上线(5A.5)</w:t>
+            </w:r>
+          </w:p>
+        </w:tc>
+        <w:tc>
+          <w:tcPr/>
+          <w:p>
+            <w:pPr>
+              <w:pStyle w:val="Compact"/>
+            </w:pPr>
+            <w:r>
+              <w:rPr>
+                <w:rFonts w:hint="eastAsia"/>
+              </w:rPr>
+              <w:t xml:space="preserve">双链接</w:t>
+            </w:r>
+            <w:r>
+              <w:t xml:space="preserve"> + </w:t>
+            </w:r>
+            <w:r>
+              <w:rPr>
+                <w:rFonts w:hint="eastAsia"/>
+              </w:rPr>
+              <w:t xml:space="preserve">访问密钥</w:t>
+            </w:r>
+            <w:r>
+              <w:t xml:space="preserve"> · v2 </w:t>
+            </w:r>
+            <w:r>
+              <w:rPr>
+                <w:rFonts w:hint="eastAsia"/>
+              </w:rPr>
+              <w:t xml:space="preserve">模板</w:t>
             </w:r>
             <w:r>
               <w:t xml:space="preserve"> · </w:t>
@@ -6226,14 +7751,82 @@
               <w:rPr>
                 <w:rFonts w:hint="eastAsia"/>
               </w:rPr>
-              <w:t xml:space="preserve">浏览器通知</w:t>
+              <w:t xml:space="preserve">批量密钥导出</w:t>
+            </w:r>
+          </w:p>
+        </w:tc>
+      </w:tr>
+      <w:tr>
+        <w:tc>
+          <w:tcPr/>
+          <w:p>
+            <w:pPr>
+              <w:pStyle w:val="Compact"/>
+            </w:pPr>
+            <w:r>
+              <w:t xml:space="preserve">⑫ </w:t>
+            </w:r>
+            <w:r>
+              <w:rPr>
+                <w:rFonts w:hint="eastAsia"/>
+              </w:rPr>
+              <w:t xml:space="preserve">飞书自动入库</w:t>
+            </w:r>
+          </w:p>
+        </w:tc>
+        <w:tc>
+          <w:tcPr/>
+          <w:p>
+            <w:pPr>
+              <w:pStyle w:val="Compact"/>
+            </w:pPr>
+            <w:r>
+              <w:t xml:space="preserve">✅ </w:t>
+            </w:r>
+            <w:r>
+              <w:rPr>
+                <w:rFonts w:hint="eastAsia"/>
+              </w:rPr>
+              <w:t xml:space="preserve">已上线(5A.6)</w:t>
+            </w:r>
+          </w:p>
+        </w:tc>
+        <w:tc>
+          <w:tcPr/>
+          <w:p>
+            <w:pPr>
+              <w:pStyle w:val="Compact"/>
+            </w:pPr>
+            <w:r>
+              <w:rPr>
+                <w:rFonts w:hint="eastAsia"/>
+              </w:rPr>
+              <w:t xml:space="preserve">第</w:t>
+            </w:r>
+            <w:r>
+              <w:t xml:space="preserve"> 6 </w:t>
+            </w:r>
+            <w:r>
+              <w:rPr>
+                <w:rFonts w:hint="eastAsia"/>
+              </w:rPr>
+              <w:t xml:space="preserve">容器长连接</w:t>
+            </w:r>
+            <w:r>
+              <w:t xml:space="preserve"> + </w:t>
+            </w:r>
+            <w:r>
+              <w:rPr>
+                <w:rFonts w:hint="eastAsia"/>
+              </w:rPr>
+              <w:t xml:space="preserve">交互卡片</w:t>
             </w:r>
           </w:p>
         </w:tc>
       </w:tr>
     </w:tbl>
-    <w:bookmarkEnd w:id="26"/>
-    <w:bookmarkStart w:id="27" w:name="实际部署关键参数已生效"/>
+    <w:bookmarkEnd w:id="31"/>
+    <w:bookmarkStart w:id="32" w:name="实际部署关键参数已生效"/>
     <w:p>
       <w:pPr>
         <w:pStyle w:val="Heading1"/>
@@ -6489,7 +8082,17 @@
               <w:pStyle w:val="Compact"/>
             </w:pPr>
             <w:r>
-              <w:t xml:space="preserve">docker compose v2(5 </w:t>
+              <w:t xml:space="preserve">docker compose v2(</w:t>
+            </w:r>
+            <w:r>
+              <w:rPr>
+                <w:b/>
+                <w:bCs/>
+              </w:rPr>
+              <w:t xml:space="preserve">6</w:t>
+            </w:r>
+            <w:r>
+              <w:t xml:space="preserve"> </w:t>
             </w:r>
             <w:r>
               <w:rPr>
@@ -6544,6 +8147,21 @@
                 <w:rStyle w:val="VerbatimChar"/>
               </w:rPr>
               <w:t xml:space="preserve">mesa_uptime_data</w:t>
+            </w:r>
+            <w:r>
+              <w:t xml:space="preserve"> </w:t>
+            </w:r>
+            <w:r>
+              <w:t xml:space="preserve">+</w:t>
+            </w:r>
+            <w:r>
+              <w:t xml:space="preserve"> </w:t>
+            </w:r>
+            <w:r>
+              <w:rPr>
+                <w:rStyle w:val="VerbatimChar"/>
+              </w:rPr>
+              <w:t xml:space="preserve">mesa_lark_ingest_data</w:t>
             </w:r>
           </w:p>
         </w:tc>
@@ -6708,7 +8326,7 @@
         </w:tc>
       </w:tr>
     </w:tbl>
-    <w:bookmarkEnd w:id="27"/>
+    <w:bookmarkEnd w:id="32"/>
     <w:sectPr>
       <w:footnotePr>
         <w:numRestart w:val="eachSect"/>
@@ -7059,6 +8677,9 @@
     <w:abstractNumId w:val="991"/>
   </w:num>
   <w:num w:numId="1008">
+    <w:abstractNumId w:val="991"/>
+  </w:num>
+  <w:num w:numId="1009">
     <w:abstractNumId w:val="991"/>
   </w:num>
 </w:numbering>

</xml_diff>